<commit_message>
1, remove exomeCAQ; 2, add qc filtered sample list and reasons
</commit_message>
<xml_diff>
--- a/ExomeQcPipeline_Somatic_Template_interim.docx
+++ b/ExomeQcPipeline_Somatic_Template_interim.docx
@@ -378,7 +378,27 @@
           <w:sz w:val="24"/>
           <w:szCs w:val="24"/>
         </w:rPr>
-        <w:t>: A plot of the total number of reads vs the average quality score over full length of that read.  The distribution of average read quality should be fairly tight in the upper range of the plot.</w:t>
+        <w:t xml:space="preserve">: A plot of the total number of reads vs the average quality score over full length of that read.  The distribution of average read quality should be </w:t>
+      </w:r>
+      <w:proofErr w:type="gramStart"/>
+      <w:r>
+        <w:rPr>
+          <w:rFonts w:ascii="Cambria" w:hAnsi="Cambria"/>
+          <w:bCs/>
+          <w:sz w:val="24"/>
+          <w:szCs w:val="24"/>
+        </w:rPr>
+        <w:t>fairly tight</w:t>
+      </w:r>
+      <w:proofErr w:type="gramEnd"/>
+      <w:r>
+        <w:rPr>
+          <w:rFonts w:ascii="Cambria" w:hAnsi="Cambria"/>
+          <w:bCs/>
+          <w:sz w:val="24"/>
+          <w:szCs w:val="24"/>
+        </w:rPr>
+        <w:t xml:space="preserve"> in the upper range of the plot.</w:t>
       </w:r>
     </w:p>
     <w:p>
@@ -780,7 +800,27 @@
           <w:sz w:val="24"/>
           <w:szCs w:val="24"/>
         </w:rPr>
-        <w:t xml:space="preserve">Duplicate reads are sequencing reads that start at the exact same position and contain the same CIGAR string (Compact Idiosyncratic Gapped Alignment Report).  Duplicates can arise from three sources: true biological duplication, PCR duplication, and optical or clustering duplication.  In biological duplication, two individual sequenced molecules are coincidentally identical; this is unlikely with standard-depth sequencing but may occur in deep sequencing.  PCR duplication is the result of  PCR amplification of a library molecule, and multiple copies of that amplified molecule being sequenced.  Optical duplication refers to large clusters of molecules being erroneously called as two separate clusters (on non-patterned </w:t>
+        <w:t xml:space="preserve">Duplicate reads are sequencing reads that start at the exact same position and contain the same CIGAR string (Compact Idiosyncratic Gapped Alignment Report).  Duplicates can arise from three sources: true biological duplication, PCR duplication, and optical or clustering duplication.  In biological duplication, two individual sequenced molecules are coincidentally identical; this is unlikely with standard-depth sequencing but may occur in deep sequencing.  PCR duplication is the result </w:t>
+      </w:r>
+      <w:proofErr w:type="gramStart"/>
+      <w:r>
+        <w:rPr>
+          <w:rFonts w:ascii="Cambria" w:hAnsi="Cambria"/>
+          <w:bCs/>
+          <w:sz w:val="24"/>
+          <w:szCs w:val="24"/>
+        </w:rPr>
+        <w:t>of  PCR</w:t>
+      </w:r>
+      <w:proofErr w:type="gramEnd"/>
+      <w:r>
+        <w:rPr>
+          <w:rFonts w:ascii="Cambria" w:hAnsi="Cambria"/>
+          <w:bCs/>
+          <w:sz w:val="24"/>
+          <w:szCs w:val="24"/>
+        </w:rPr>
+        <w:t xml:space="preserve"> amplification of a library molecule, and multiple copies of that amplified molecule being sequenced.  Optical duplication refers to large clusters of molecules being erroneously called as two separate clusters (on non-patterned </w:t>
       </w:r>
       <w:proofErr w:type="spellStart"/>
       <w:r>
@@ -1208,8 +1248,19 @@
           <w:sz w:val="24"/>
           <w:szCs w:val="24"/>
         </w:rPr>
-        <w:t>Figure 2. sorted contamination rate by subjects</w:t>
-      </w:r>
+        <w:t xml:space="preserve">Figure 2. sorted contamination rate by </w:t>
+      </w:r>
+      <w:proofErr w:type="gramStart"/>
+      <w:r>
+        <w:rPr>
+          <w:rFonts w:ascii="Cambria" w:hAnsi="Cambria"/>
+          <w:b/>
+          <w:sz w:val="24"/>
+          <w:szCs w:val="24"/>
+        </w:rPr>
+        <w:t>subjects</w:t>
+      </w:r>
+      <w:proofErr w:type="gramEnd"/>
     </w:p>
     <w:p>
       <w:pPr>
@@ -1385,69 +1436,204 @@
           <w:sz w:val="24"/>
           <w:szCs w:val="24"/>
         </w:rPr>
-        <w:t xml:space="preserve"> function and sorted from lowest to highest. The targeted coverage for germline exome sequencing is on average 40X and 80% of capture region above 15X.The coverage distribution of each sample was also plotted using </w:t>
+        <w:t xml:space="preserve"> function and sorted from lowest to highest. The targeted coverage for </w:t>
+      </w:r>
+      <w:r>
+        <w:rPr>
+          <w:rFonts w:ascii="Cambria" w:hAnsi="Cambria"/>
+          <w:bCs/>
+          <w:sz w:val="24"/>
+          <w:szCs w:val="24"/>
+        </w:rPr>
+        <w:t xml:space="preserve">somatic variant </w:t>
+      </w:r>
+      <w:r>
+        <w:rPr>
+          <w:rFonts w:ascii="Cambria" w:hAnsi="Cambria"/>
+          <w:bCs/>
+          <w:sz w:val="24"/>
+          <w:szCs w:val="24"/>
+        </w:rPr>
+        <w:t xml:space="preserve">sequencing is on average </w:t>
+      </w:r>
+      <w:r>
+        <w:rPr>
+          <w:rFonts w:ascii="Cambria" w:hAnsi="Cambria"/>
+          <w:bCs/>
+          <w:sz w:val="24"/>
+          <w:szCs w:val="24"/>
+        </w:rPr>
+        <w:t>10</w:t>
+      </w:r>
+      <w:r>
+        <w:rPr>
+          <w:rFonts w:ascii="Cambria" w:hAnsi="Cambria"/>
+          <w:bCs/>
+          <w:sz w:val="24"/>
+          <w:szCs w:val="24"/>
+        </w:rPr>
+        <w:t>0X.</w:t>
+      </w:r>
+      <w:r>
+        <w:rPr>
+          <w:rFonts w:ascii="Cambria" w:hAnsi="Cambria"/>
+          <w:bCs/>
+          <w:sz w:val="24"/>
+          <w:szCs w:val="24"/>
+        </w:rPr>
+        <w:t xml:space="preserve"> </w:t>
+      </w:r>
+    </w:p>
+    <w:p>
+      <w:pPr>
+        <w:rPr>
+          <w:rFonts w:ascii="Cambria" w:hAnsi="Cambria"/>
+          <w:b/>
+          <w:sz w:val="24"/>
+          <w:szCs w:val="24"/>
+        </w:rPr>
+      </w:pPr>
+      <w:r>
+        <w:rPr>
+          <w:rFonts w:ascii="Cambria" w:hAnsi="Cambria"/>
+          <w:b/>
+          <w:sz w:val="24"/>
+          <w:szCs w:val="24"/>
+        </w:rPr>
+        <w:t xml:space="preserve">  </w:t>
+      </w:r>
+    </w:p>
+    <w:p>
+      <w:pPr>
+        <w:rPr>
+          <w:rFonts w:ascii="Cambria" w:hAnsi="Cambria"/>
+          <w:b/>
+          <w:sz w:val="24"/>
+          <w:szCs w:val="24"/>
+        </w:rPr>
+      </w:pPr>
+      <w:r>
+        <w:rPr>
+          <w:rFonts w:ascii="Cambria" w:hAnsi="Cambria"/>
+          <w:b/>
+          <w:sz w:val="24"/>
+          <w:szCs w:val="24"/>
+        </w:rPr>
+        <w:t xml:space="preserve">Figure 3. coverage scatter plot for all exome samples, with cases and controls </w:t>
+      </w:r>
+      <w:proofErr w:type="gramStart"/>
+      <w:r>
+        <w:rPr>
+          <w:rFonts w:ascii="Cambria" w:hAnsi="Cambria"/>
+          <w:b/>
+          <w:sz w:val="24"/>
+          <w:szCs w:val="24"/>
+        </w:rPr>
+        <w:t>separated</w:t>
+      </w:r>
+      <w:proofErr w:type="gramEnd"/>
+      <w:r>
+        <w:rPr>
+          <w:rFonts w:ascii="Cambria" w:hAnsi="Cambria"/>
+          <w:b/>
+          <w:sz w:val="24"/>
+          <w:szCs w:val="24"/>
+        </w:rPr>
+        <w:t xml:space="preserve"> </w:t>
+      </w:r>
+    </w:p>
+    <w:p>
+      <w:pPr>
+        <w:rPr>
+          <w:rFonts w:ascii="Cambria" w:hAnsi="Cambria"/>
+          <w:b/>
+          <w:color w:val="365F91"/>
+          <w:sz w:val="24"/>
+          <w:szCs w:val="24"/>
+        </w:rPr>
+      </w:pPr>
+      <w:r>
+        <w:rPr>
+          <w:rFonts w:ascii="Cambria" w:hAnsi="Cambria"/>
+          <w:b/>
+          <w:color w:val="365F91"/>
+          <w:sz w:val="24"/>
+          <w:szCs w:val="24"/>
+        </w:rPr>
+        <w:t xml:space="preserve"> </w:t>
+      </w:r>
+    </w:p>
+    <w:p>
+      <w:pPr>
+        <w:rPr>
+          <w:rFonts w:ascii="Cambria" w:hAnsi="Cambria"/>
+          <w:b/>
+          <w:color w:val="365F91"/>
+          <w:sz w:val="24"/>
+          <w:szCs w:val="24"/>
+        </w:rPr>
+      </w:pPr>
+      <w:r>
+        <w:rPr>
+          <w:rFonts w:ascii="Cambria" w:hAnsi="Cambria"/>
+          <w:b/>
+          <w:color w:val="365F91"/>
+          <w:sz w:val="24"/>
+          <w:szCs w:val="24"/>
+        </w:rPr>
+        <w:t xml:space="preserve">  </w:t>
+      </w:r>
+    </w:p>
+    <w:p>
+      <w:pPr>
+        <w:pStyle w:val="Heading1"/>
+      </w:pPr>
+      <w:bookmarkStart w:id="6" w:name="_Toc48676181"/>
+      <w:r>
+        <w:t>6</w:t>
+      </w:r>
+      <w:r>
+        <w:t xml:space="preserve">. </w:t>
+      </w:r>
+      <w:r>
+        <w:t>PRE-CALLING QC CHECK</w:t>
+      </w:r>
+      <w:bookmarkEnd w:id="6"/>
+      <w:r>
+        <w:t xml:space="preserve"> </w:t>
+      </w:r>
+    </w:p>
+    <w:p>
+      <w:pPr>
+        <w:rPr>
+          <w:rFonts w:ascii="Cambria" w:hAnsi="Cambria"/>
+          <w:bCs/>
+          <w:sz w:val="24"/>
+          <w:szCs w:val="24"/>
+        </w:rPr>
+      </w:pPr>
+      <w:r>
+        <w:rPr>
+          <w:rFonts w:ascii="Cambria" w:hAnsi="Cambria"/>
+          <w:bCs/>
+          <w:sz w:val="24"/>
+          <w:szCs w:val="24"/>
+        </w:rPr>
+        <w:t xml:space="preserve">From the subject level pre-calling qc report, we collect fold 80 base penalty from </w:t>
       </w:r>
       <w:proofErr w:type="spellStart"/>
-      <w:r>
-        <w:rPr>
-          <w:rFonts w:ascii="Cambria" w:hAnsi="Cambria"/>
-          <w:bCs/>
-          <w:sz w:val="24"/>
-          <w:szCs w:val="24"/>
-        </w:rPr>
-        <w:t>mosdepth</w:t>
+      <w:proofErr w:type="gramStart"/>
+      <w:r>
+        <w:rPr>
+          <w:rFonts w:ascii="Cambria" w:hAnsi="Cambria"/>
+          <w:bCs/>
+          <w:sz w:val="24"/>
+          <w:szCs w:val="24"/>
+        </w:rPr>
+        <w:t>picard</w:t>
       </w:r>
       <w:proofErr w:type="spellEnd"/>
-      <w:r>
-        <w:rPr>
-          <w:rFonts w:ascii="Cambria" w:hAnsi="Cambria"/>
-          <w:bCs/>
-          <w:sz w:val="24"/>
-          <w:szCs w:val="24"/>
-        </w:rPr>
-        <w:t xml:space="preserve"> software</w:t>
-      </w:r>
-      <w:r>
-        <w:rPr>
-          <w:color w:val="000000" w:themeColor="text1"/>
-        </w:rPr>
-        <w:fldChar w:fldCharType="begin"/>
-      </w:r>
-      <w:r>
-        <w:rPr>
-          <w:color w:val="000000" w:themeColor="text1"/>
-        </w:rPr>
-        <w:instrText xml:space="preserve"> ADDIN EN.CITE &lt;EndNote&gt;&lt;Cite&gt;&lt;Author&gt;Pedersen&lt;/Author&gt;&lt;Year&gt;2018&lt;/Year&gt;&lt;RecNum&gt;3&lt;/RecNum&gt;&lt;DisplayText&gt;&lt;style face="superscript"&gt;3&lt;/style&gt;&lt;/DisplayText&gt;&lt;record&gt;&lt;rec-number&gt;3&lt;/rec-number&gt;&lt;foreign-keys&gt;&lt;key app="EN" db-id="w5f0rv092r5tz6e005vps0ddadxvpr0dzvtt" timestamp="1586810768"&gt;3&lt;/key&gt;&lt;/foreign-keys&gt;&lt;ref-type name="Journal Article"&gt;17&lt;/ref-type&gt;&lt;contributors&gt;&lt;authors&gt;&lt;author&gt;Pedersen, B. S.&lt;/author&gt;&lt;author&gt;Quinlan, A. R.&lt;/author&gt;&lt;/authors&gt;&lt;/contributors&gt;&lt;auth-address&gt;Department of Human Genetics.&amp;#xD;Department of Biomedical Informatics.&amp;#xD;USTAR Center for Genetic Discovery, University of Utah, Salt Lake City, UT 84112, USA.&lt;/auth-address&gt;&lt;titles&gt;&lt;title&gt;Mosdepth: quick coverage calculation for genomes and exomes&lt;/title&gt;&lt;secondary-title&gt;Bioinformatics&lt;/secondary-title&gt;&lt;/titles&gt;&lt;periodical&gt;&lt;full-title&gt;Bioinformatics&lt;/full-title&gt;&lt;/periodical&gt;&lt;pages&gt;867-868&lt;/pages&gt;&lt;volume&gt;34&lt;/volume&gt;&lt;number&gt;5&lt;/number&gt;&lt;edition&gt;2017/11/03&lt;/edition&gt;&lt;keywords&gt;&lt;keyword&gt;Algorithms&lt;/keyword&gt;&lt;keyword&gt;Genome, Human&lt;/keyword&gt;&lt;keyword&gt;Genomics/methods&lt;/keyword&gt;&lt;keyword&gt;High-Throughput Nucleotide Sequencing/*methods&lt;/keyword&gt;&lt;keyword&gt;Humans&lt;/keyword&gt;&lt;keyword&gt;Sequence Analysis, DNA/*methods&lt;/keyword&gt;&lt;keyword&gt;*Software&lt;/keyword&gt;&lt;keyword&gt;Whole Exome Sequencing/methods&lt;/keyword&gt;&lt;/keywords&gt;&lt;dates&gt;&lt;year&gt;2018&lt;/year&gt;&lt;pub-dates&gt;&lt;date&gt;Mar 1&lt;/date&gt;&lt;/pub-dates&gt;&lt;/dates&gt;&lt;isbn&gt;1367-4811 (Electronic)&amp;#xD;1367-4803 (Linking)&lt;/isbn&gt;&lt;accession-num&gt;29096012&lt;/accession-num&gt;&lt;urls&gt;&lt;related-urls&gt;&lt;url&gt;https://www.ncbi.nlm.nih.gov/pubmed/29096012&lt;/url&gt;&lt;/related-urls&gt;&lt;/urls&gt;&lt;custom2&gt;PMC6030888&lt;/custom2&gt;&lt;electronic-resource-num&gt;10.1093/bioinformatics/btx699&lt;/electronic-resource-num&gt;&lt;/record&gt;&lt;/Cite&gt;&lt;/EndNote&gt;</w:instrText>
-      </w:r>
-      <w:r>
-        <w:rPr>
-          <w:color w:val="000000" w:themeColor="text1"/>
-        </w:rPr>
-        <w:fldChar w:fldCharType="separate"/>
-      </w:r>
-      <w:r>
-        <w:rPr>
-          <w:noProof/>
-          <w:color w:val="000000" w:themeColor="text1"/>
-          <w:vertAlign w:val="superscript"/>
-        </w:rPr>
-        <w:t>3</w:t>
-      </w:r>
-      <w:r>
-        <w:rPr>
-          <w:color w:val="000000" w:themeColor="text1"/>
-        </w:rPr>
-        <w:fldChar w:fldCharType="end"/>
-      </w:r>
-      <w:r>
-        <w:rPr>
-          <w:rFonts w:ascii="Cambria" w:hAnsi="Cambria"/>
-          <w:bCs/>
-          <w:sz w:val="24"/>
-          <w:szCs w:val="24"/>
-        </w:rPr>
-        <w:t>.</w:t>
-      </w:r>
+      <w:proofErr w:type="gramEnd"/>
       <w:r>
         <w:rPr>
           <w:rFonts w:ascii="Cambria" w:hAnsi="Cambria"/>
@@ -1462,251 +1648,142 @@
       <w:pPr>
         <w:rPr>
           <w:rFonts w:ascii="Cambria" w:hAnsi="Cambria"/>
-          <w:b/>
-          <w:sz w:val="24"/>
-          <w:szCs w:val="24"/>
-        </w:rPr>
-      </w:pPr>
-      <w:r>
-        <w:rPr>
-          <w:rFonts w:ascii="Cambria" w:hAnsi="Cambria"/>
-          <w:b/>
-          <w:sz w:val="24"/>
-          <w:szCs w:val="24"/>
-        </w:rPr>
-        <w:t xml:space="preserve">  </w:t>
-      </w:r>
-    </w:p>
-    <w:p>
-      <w:pPr>
-        <w:rPr>
-          <w:rFonts w:ascii="Cambria" w:hAnsi="Cambria"/>
-          <w:b/>
-          <w:sz w:val="24"/>
-          <w:szCs w:val="24"/>
-        </w:rPr>
-      </w:pPr>
-      <w:r>
-        <w:rPr>
-          <w:rFonts w:ascii="Cambria" w:hAnsi="Cambria"/>
-          <w:b/>
-          <w:sz w:val="24"/>
-          <w:szCs w:val="24"/>
-        </w:rPr>
-        <w:t xml:space="preserve">Figure 3. coverage scatter plot for all exome samples, with cases and controls separated </w:t>
-      </w:r>
-    </w:p>
-    <w:p>
-      <w:pPr>
-        <w:rPr>
-          <w:rFonts w:ascii="Cambria" w:hAnsi="Cambria"/>
-          <w:b/>
-          <w:color w:val="365F91"/>
-          <w:sz w:val="24"/>
-          <w:szCs w:val="24"/>
-        </w:rPr>
-      </w:pPr>
-      <w:r>
-        <w:rPr>
-          <w:rFonts w:ascii="Cambria" w:hAnsi="Cambria"/>
-          <w:b/>
-          <w:color w:val="365F91"/>
+          <w:bCs/>
+          <w:sz w:val="24"/>
+          <w:szCs w:val="24"/>
+        </w:rPr>
+      </w:pPr>
+      <w:proofErr w:type="spellStart"/>
+      <w:r>
+        <w:rPr>
+          <w:rFonts w:ascii="Cambria" w:hAnsi="Cambria"/>
+          <w:bCs/>
+          <w:sz w:val="24"/>
+          <w:szCs w:val="24"/>
+        </w:rPr>
+        <w:t>CollectHsMetrics</w:t>
+      </w:r>
+      <w:proofErr w:type="spellEnd"/>
+      <w:r>
+        <w:rPr>
+          <w:rFonts w:ascii="Cambria" w:hAnsi="Cambria"/>
+          <w:bCs/>
+          <w:sz w:val="24"/>
+          <w:szCs w:val="24"/>
+        </w:rPr>
+        <w:t xml:space="preserve">, average oxidation quality from </w:t>
+      </w:r>
+      <w:proofErr w:type="spellStart"/>
+      <w:r>
+        <w:rPr>
+          <w:rFonts w:ascii="Cambria" w:hAnsi="Cambria"/>
+          <w:bCs/>
+          <w:sz w:val="24"/>
+          <w:szCs w:val="24"/>
+        </w:rPr>
+        <w:t>picard</w:t>
+      </w:r>
+      <w:proofErr w:type="spellEnd"/>
+      <w:r>
+        <w:rPr>
+          <w:rFonts w:ascii="Cambria" w:hAnsi="Cambria"/>
+          <w:bCs/>
           <w:sz w:val="24"/>
           <w:szCs w:val="24"/>
         </w:rPr>
         <w:t xml:space="preserve"> </w:t>
       </w:r>
-    </w:p>
-    <w:p>
-      <w:pPr>
-        <w:pStyle w:val="Heading1"/>
-      </w:pPr>
-      <w:bookmarkStart w:id="6" w:name="_Toc48676180"/>
-      <w:r>
-        <w:t>6</w:t>
-      </w:r>
-      <w:r>
-        <w:t xml:space="preserve">. </w:t>
-      </w:r>
-      <w:r>
-        <w:t>EXOMECQA</w:t>
-      </w:r>
-      <w:bookmarkEnd w:id="6"/>
-      <w:r>
+      <w:proofErr w:type="spellStart"/>
+      <w:r>
+        <w:rPr>
+          <w:rFonts w:ascii="Cambria" w:hAnsi="Cambria"/>
+          <w:bCs/>
+          <w:sz w:val="24"/>
+          <w:szCs w:val="24"/>
+        </w:rPr>
+        <w:t>CollectOxoGMetrics</w:t>
+      </w:r>
+      <w:proofErr w:type="spellEnd"/>
+      <w:r>
+        <w:rPr>
+          <w:rFonts w:ascii="Cambria" w:hAnsi="Cambria"/>
+          <w:bCs/>
+          <w:sz w:val="24"/>
+          <w:szCs w:val="24"/>
+        </w:rPr>
+        <w:t xml:space="preserve"> and lowest </w:t>
+      </w:r>
+      <w:proofErr w:type="spellStart"/>
+      <w:r>
+        <w:rPr>
+          <w:rFonts w:ascii="Cambria" w:hAnsi="Cambria"/>
+          <w:bCs/>
+          <w:sz w:val="24"/>
+          <w:szCs w:val="24"/>
+        </w:rPr>
+        <w:t>preadapter</w:t>
+      </w:r>
+      <w:proofErr w:type="spellEnd"/>
+      <w:r>
+        <w:rPr>
+          <w:rFonts w:ascii="Cambria" w:hAnsi="Cambria"/>
+          <w:bCs/>
+          <w:sz w:val="24"/>
+          <w:szCs w:val="24"/>
+        </w:rPr>
+        <w:t>/</w:t>
+      </w:r>
+      <w:proofErr w:type="spellStart"/>
+      <w:r>
+        <w:rPr>
+          <w:rFonts w:ascii="Cambria" w:hAnsi="Cambria"/>
+          <w:bCs/>
+          <w:sz w:val="24"/>
+          <w:szCs w:val="24"/>
+        </w:rPr>
+        <w:t>baitbias</w:t>
+      </w:r>
+      <w:proofErr w:type="spellEnd"/>
+      <w:r>
+        <w:rPr>
+          <w:rFonts w:ascii="Cambria" w:hAnsi="Cambria"/>
+          <w:bCs/>
+          <w:sz w:val="24"/>
+          <w:szCs w:val="24"/>
+        </w:rPr>
+        <w:t xml:space="preserve"> total score from </w:t>
+      </w:r>
+      <w:proofErr w:type="spellStart"/>
+      <w:r>
+        <w:rPr>
+          <w:rFonts w:ascii="Cambria" w:hAnsi="Cambria"/>
+          <w:bCs/>
+          <w:sz w:val="24"/>
+          <w:szCs w:val="24"/>
+        </w:rPr>
+        <w:t>picard</w:t>
+      </w:r>
+      <w:proofErr w:type="spellEnd"/>
+      <w:r>
+        <w:rPr>
+          <w:rFonts w:ascii="Cambria" w:hAnsi="Cambria"/>
+          <w:bCs/>
+          <w:sz w:val="24"/>
+          <w:szCs w:val="24"/>
+        </w:rPr>
         <w:t xml:space="preserve"> </w:t>
       </w:r>
-    </w:p>
-    <w:p>
-      <w:pPr>
-        <w:rPr>
-          <w:rFonts w:ascii="Cambria" w:hAnsi="Cambria"/>
-          <w:bCs/>
-          <w:sz w:val="24"/>
-          <w:szCs w:val="24"/>
-        </w:rPr>
-      </w:pPr>
-      <w:r>
-        <w:rPr>
-          <w:rFonts w:ascii="Cambria" w:hAnsi="Cambria"/>
-          <w:bCs/>
-          <w:sz w:val="24"/>
-          <w:szCs w:val="24"/>
-        </w:rPr>
-        <w:t>Coverage uniformity evaluation was also conducted using ExomeCQA</w:t>
-      </w:r>
-      <w:r>
-        <w:rPr>
-          <w:color w:val="000000" w:themeColor="text1"/>
-        </w:rPr>
-        <w:fldChar w:fldCharType="begin">
-          <w:fldData xml:space="preserve">PEVuZE5vdGU+PENpdGU+PEF1dGhvcj5XYW5nPC9BdXRob3I+PFllYXI+MjAxNzwvWWVhcj48UmVj
-TnVtPjQ8L1JlY051bT48RGlzcGxheVRleHQ+PHN0eWxlIGZhY2U9InN1cGVyc2NyaXB0Ij40PC9z
-dHlsZT48L0Rpc3BsYXlUZXh0PjxyZWNvcmQ+PHJlYy1udW1iZXI+NDwvcmVjLW51bWJlcj48Zm9y
-ZWlnbi1rZXlzPjxrZXkgYXBwPSJFTiIgZGItaWQ9Inc1ZjBydjA5MnI1dHo2ZTAwNXZwczBkZGFk
-eHZwcjBkenZ0dCIgdGltZXN0YW1wPSIxNTg2ODEwODgwIj40PC9rZXk+PC9mb3JlaWduLWtleXM+
-PHJlZi10eXBlIG5hbWU9IkpvdXJuYWwgQXJ0aWNsZSI+MTc8L3JlZi10eXBlPjxjb250cmlidXRv
-cnM+PGF1dGhvcnM+PGF1dGhvcj5XYW5nLCBRLjwvYXV0aG9yPjxhdXRob3I+U2hhc2hpa2FudCwg
-Qy4gUy48L2F1dGhvcj48YXV0aG9yPkplbnNlbiwgTS48L2F1dGhvcj48YXV0aG9yPkFsdG1hbiwg
-Ti4gUy48L2F1dGhvcj48YXV0aG9yPkdpcmlyYWphbiwgUy48L2F1dGhvcj48L2F1dGhvcnM+PC9j
-b250cmlidXRvcnM+PGF1dGgtYWRkcmVzcz5CaW9pbmZvcm1hdGljcyBhbmQgR2Vub21pY3MgUHJv
-Z3JhbSwgVGhlIEh1Y2sgSW5zdGl0dXRlcyBvZiB0aGUgTGlmZSBTY2llbmNlcywgVGhlIFBlbm5z
-eWx2YW5pYSBTdGF0ZSBVbml2ZXJzaXR5LCBVbml2ZXJzaXR5IFBhcmssIFBBLCAxNjgwMiwgVVNB
-LiYjeEQ7RGVwYXJ0bWVudCBvZiBTdGF0aXN0aWNzLCBUaGUgUGVubnN5bHZhbmlhIFN0YXRlIFVu
-aXZlcnNpdHksIFVuaXZlcnNpdHkgUGFyaywgUEEsIDE2ODAyLCBVU0EuJiN4RDtEZXBhcnRtZW50
-IG9mIEFuaW1hbCBTY2llbmNlLCBUaGUgUGVubnN5bHZhbmlhIFN0YXRlIFVuaXZlcnNpdHksIFVu
-aXZlcnNpdHkgUGFyaywgUEEsIDE2ODAyLCBVU0EuJiN4RDtCaW9pbmZvcm1hdGljcyBhbmQgR2Vu
-b21pY3MgUHJvZ3JhbSwgVGhlIEh1Y2sgSW5zdGl0dXRlcyBvZiB0aGUgTGlmZSBTY2llbmNlcywg
-VGhlIFBlbm5zeWx2YW5pYSBTdGF0ZSBVbml2ZXJzaXR5LCBVbml2ZXJzaXR5IFBhcmssIFBBLCAx
-NjgwMiwgVVNBLiBzeGc0N0Bwc3UuZWR1LiYjeEQ7RGVwYXJ0bWVudCBvZiBCaW9jaGVtaXN0cnkg
-YW5kIE1vbGVjdWxhciBCaW9sb2d5LCBUaGUgUGVubnN5bHZhbmlhIFN0YXRlIFVuaXZlcnNpdHks
-IFVuaXZlcnNpdHkgUGFyaywgUEEsIDE2ODAyLCBVU0EuIHN4ZzQ3QHBzdS5lZHUuJiN4RDtEZXBh
-cnRtZW50IG9mIEFudGhyb3BvbG9neSwgVGhlIFBlbm5zeWx2YW5pYSBTdGF0ZSBVbml2ZXJzaXR5
-LCBVbml2ZXJzaXR5IFBhcmssIFBBLCAxNjgwMiwgVVNBLiBzeGc0N0Bwc3UuZWR1LjwvYXV0aC1h
-ZGRyZXNzPjx0aXRsZXM+PHRpdGxlPk5vdmVsIG1ldHJpY3MgdG8gbWVhc3VyZSBjb3ZlcmFnZSBp
-biB3aG9sZSBleG9tZSBzZXF1ZW5jaW5nIGRhdGFzZXRzIHJldmVhbCBsb2NhbCBhbmQgZ2xvYmFs
-IG5vbi11bmlmb3JtaXR5PC90aXRsZT48c2Vjb25kYXJ5LXRpdGxlPlNjaSBSZXA8L3NlY29uZGFy
-eS10aXRsZT48L3RpdGxlcz48cGVyaW9kaWNhbD48ZnVsbC10aXRsZT5TY2kgUmVwPC9mdWxsLXRp
-dGxlPjwvcGVyaW9kaWNhbD48cGFnZXM+ODg1PC9wYWdlcz48dm9sdW1lPjc8L3ZvbHVtZT48bnVt
-YmVyPjE8L251bWJlcj48ZWRpdGlvbj4yMDE3LzA0LzE1PC9lZGl0aW9uPjxrZXl3b3Jkcz48a2V5
-d29yZD5EYXRhIE1pbmluZy8qbWV0aG9kczwva2V5d29yZD48a2V5d29yZD5IaWdoLVRocm91Z2hw
-dXQgTnVjbGVvdGlkZSBTZXF1ZW5jaW5nL21ldGhvZHM8L2tleXdvcmQ+PGtleXdvcmQ+SHVtYW5z
-PC9rZXl3b3JkPjxrZXl3b3JkPldob2xlIEV4b21lIFNlcXVlbmNpbmcvKm1ldGhvZHM8L2tleXdv
-cmQ+PC9rZXl3b3Jkcz48ZGF0ZXM+PHllYXI+MjAxNzwveWVhcj48cHViLWRhdGVzPjxkYXRlPkFw
-ciAxMzwvZGF0ZT48L3B1Yi1kYXRlcz48L2RhdGVzPjxpc2JuPjIwNDUtMjMyMiAoRWxlY3Ryb25p
-YykmI3hEOzIwNDUtMjMyMiAoTGlua2luZyk8L2lzYm4+PGFjY2Vzc2lvbi1udW0+Mjg0MDg3NDY8
-L2FjY2Vzc2lvbi1udW0+PHVybHM+PHJlbGF0ZWQtdXJscz48dXJsPmh0dHBzOi8vd3d3Lm5jYmku
-bmxtLm5paC5nb3YvcHVibWVkLzI4NDA4NzQ2PC91cmw+PC9yZWxhdGVkLXVybHM+PC91cmxzPjxj
-dXN0b20yPlBNQzU0Mjk4MjY8L2N1c3RvbTI+PGVsZWN0cm9uaWMtcmVzb3VyY2UtbnVtPjEwLjEw
-MzgvczQxNTk4LTAxNy0wMTAwNS14PC9lbGVjdHJvbmljLXJlc291cmNlLW51bT48L3JlY29yZD48
-L0NpdGU+PC9FbmROb3RlPgB=
-</w:fldData>
-        </w:fldChar>
-      </w:r>
-      <w:r>
-        <w:rPr>
-          <w:color w:val="000000" w:themeColor="text1"/>
-        </w:rPr>
-        <w:instrText xml:space="preserve"> ADDIN EN.CITE </w:instrText>
-      </w:r>
-      <w:r>
-        <w:rPr>
-          <w:color w:val="000000" w:themeColor="text1"/>
-        </w:rPr>
-        <w:fldChar w:fldCharType="begin">
-          <w:fldData xml:space="preserve">PEVuZE5vdGU+PENpdGU+PEF1dGhvcj5XYW5nPC9BdXRob3I+PFllYXI+MjAxNzwvWWVhcj48UmVj
-TnVtPjQ8L1JlY051bT48RGlzcGxheVRleHQ+PHN0eWxlIGZhY2U9InN1cGVyc2NyaXB0Ij40PC9z
-dHlsZT48L0Rpc3BsYXlUZXh0PjxyZWNvcmQ+PHJlYy1udW1iZXI+NDwvcmVjLW51bWJlcj48Zm9y
-ZWlnbi1rZXlzPjxrZXkgYXBwPSJFTiIgZGItaWQ9Inc1ZjBydjA5MnI1dHo2ZTAwNXZwczBkZGFk
-eHZwcjBkenZ0dCIgdGltZXN0YW1wPSIxNTg2ODEwODgwIj40PC9rZXk+PC9mb3JlaWduLWtleXM+
-PHJlZi10eXBlIG5hbWU9IkpvdXJuYWwgQXJ0aWNsZSI+MTc8L3JlZi10eXBlPjxjb250cmlidXRv
-cnM+PGF1dGhvcnM+PGF1dGhvcj5XYW5nLCBRLjwvYXV0aG9yPjxhdXRob3I+U2hhc2hpa2FudCwg
-Qy4gUy48L2F1dGhvcj48YXV0aG9yPkplbnNlbiwgTS48L2F1dGhvcj48YXV0aG9yPkFsdG1hbiwg
-Ti4gUy48L2F1dGhvcj48YXV0aG9yPkdpcmlyYWphbiwgUy48L2F1dGhvcj48L2F1dGhvcnM+PC9j
-b250cmlidXRvcnM+PGF1dGgtYWRkcmVzcz5CaW9pbmZvcm1hdGljcyBhbmQgR2Vub21pY3MgUHJv
-Z3JhbSwgVGhlIEh1Y2sgSW5zdGl0dXRlcyBvZiB0aGUgTGlmZSBTY2llbmNlcywgVGhlIFBlbm5z
-eWx2YW5pYSBTdGF0ZSBVbml2ZXJzaXR5LCBVbml2ZXJzaXR5IFBhcmssIFBBLCAxNjgwMiwgVVNB
-LiYjeEQ7RGVwYXJ0bWVudCBvZiBTdGF0aXN0aWNzLCBUaGUgUGVubnN5bHZhbmlhIFN0YXRlIFVu
-aXZlcnNpdHksIFVuaXZlcnNpdHkgUGFyaywgUEEsIDE2ODAyLCBVU0EuJiN4RDtEZXBhcnRtZW50
-IG9mIEFuaW1hbCBTY2llbmNlLCBUaGUgUGVubnN5bHZhbmlhIFN0YXRlIFVuaXZlcnNpdHksIFVu
-aXZlcnNpdHkgUGFyaywgUEEsIDE2ODAyLCBVU0EuJiN4RDtCaW9pbmZvcm1hdGljcyBhbmQgR2Vu
-b21pY3MgUHJvZ3JhbSwgVGhlIEh1Y2sgSW5zdGl0dXRlcyBvZiB0aGUgTGlmZSBTY2llbmNlcywg
-VGhlIFBlbm5zeWx2YW5pYSBTdGF0ZSBVbml2ZXJzaXR5LCBVbml2ZXJzaXR5IFBhcmssIFBBLCAx
-NjgwMiwgVVNBLiBzeGc0N0Bwc3UuZWR1LiYjeEQ7RGVwYXJ0bWVudCBvZiBCaW9jaGVtaXN0cnkg
-YW5kIE1vbGVjdWxhciBCaW9sb2d5LCBUaGUgUGVubnN5bHZhbmlhIFN0YXRlIFVuaXZlcnNpdHks
-IFVuaXZlcnNpdHkgUGFyaywgUEEsIDE2ODAyLCBVU0EuIHN4ZzQ3QHBzdS5lZHUuJiN4RDtEZXBh
-cnRtZW50IG9mIEFudGhyb3BvbG9neSwgVGhlIFBlbm5zeWx2YW5pYSBTdGF0ZSBVbml2ZXJzaXR5
-LCBVbml2ZXJzaXR5IFBhcmssIFBBLCAxNjgwMiwgVVNBLiBzeGc0N0Bwc3UuZWR1LjwvYXV0aC1h
-ZGRyZXNzPjx0aXRsZXM+PHRpdGxlPk5vdmVsIG1ldHJpY3MgdG8gbWVhc3VyZSBjb3ZlcmFnZSBp
-biB3aG9sZSBleG9tZSBzZXF1ZW5jaW5nIGRhdGFzZXRzIHJldmVhbCBsb2NhbCBhbmQgZ2xvYmFs
-IG5vbi11bmlmb3JtaXR5PC90aXRsZT48c2Vjb25kYXJ5LXRpdGxlPlNjaSBSZXA8L3NlY29uZGFy
-eS10aXRsZT48L3RpdGxlcz48cGVyaW9kaWNhbD48ZnVsbC10aXRsZT5TY2kgUmVwPC9mdWxsLXRp
-dGxlPjwvcGVyaW9kaWNhbD48cGFnZXM+ODg1PC9wYWdlcz48dm9sdW1lPjc8L3ZvbHVtZT48bnVt
-YmVyPjE8L251bWJlcj48ZWRpdGlvbj4yMDE3LzA0LzE1PC9lZGl0aW9uPjxrZXl3b3Jkcz48a2V5
-d29yZD5EYXRhIE1pbmluZy8qbWV0aG9kczwva2V5d29yZD48a2V5d29yZD5IaWdoLVRocm91Z2hw
-dXQgTnVjbGVvdGlkZSBTZXF1ZW5jaW5nL21ldGhvZHM8L2tleXdvcmQ+PGtleXdvcmQ+SHVtYW5z
-PC9rZXl3b3JkPjxrZXl3b3JkPldob2xlIEV4b21lIFNlcXVlbmNpbmcvKm1ldGhvZHM8L2tleXdv
-cmQ+PC9rZXl3b3Jkcz48ZGF0ZXM+PHllYXI+MjAxNzwveWVhcj48cHViLWRhdGVzPjxkYXRlPkFw
-ciAxMzwvZGF0ZT48L3B1Yi1kYXRlcz48L2RhdGVzPjxpc2JuPjIwNDUtMjMyMiAoRWxlY3Ryb25p
-YykmI3hEOzIwNDUtMjMyMiAoTGlua2luZyk8L2lzYm4+PGFjY2Vzc2lvbi1udW0+Mjg0MDg3NDY8
-L2FjY2Vzc2lvbi1udW0+PHVybHM+PHJlbGF0ZWQtdXJscz48dXJsPmh0dHBzOi8vd3d3Lm5jYmku
-bmxtLm5paC5nb3YvcHVibWVkLzI4NDA4NzQ2PC91cmw+PC9yZWxhdGVkLXVybHM+PC91cmxzPjxj
-dXN0b20yPlBNQzU0Mjk4MjY8L2N1c3RvbTI+PGVsZWN0cm9uaWMtcmVzb3VyY2UtbnVtPjEwLjEw
-MzgvczQxNTk4LTAxNy0wMTAwNS14PC9lbGVjdHJvbmljLXJlc291cmNlLW51bT48L3JlY29yZD48
-L0NpdGU+PC9FbmROb3RlPgB=
-</w:fldData>
-        </w:fldChar>
-      </w:r>
-      <w:r>
-        <w:rPr>
-          <w:color w:val="000000" w:themeColor="text1"/>
-        </w:rPr>
-        <w:instrText xml:space="preserve"> ADDIN EN.CITE.DATA </w:instrText>
-      </w:r>
-      <w:r>
-        <w:rPr>
-          <w:color w:val="000000" w:themeColor="text1"/>
-        </w:rPr>
-      </w:r>
-      <w:r>
-        <w:rPr>
-          <w:color w:val="000000" w:themeColor="text1"/>
-        </w:rPr>
-        <w:fldChar w:fldCharType="end"/>
-      </w:r>
-      <w:r>
-        <w:rPr>
-          <w:color w:val="000000" w:themeColor="text1"/>
-        </w:rPr>
-      </w:r>
-      <w:r>
-        <w:rPr>
-          <w:color w:val="000000" w:themeColor="text1"/>
-        </w:rPr>
-        <w:fldChar w:fldCharType="separate"/>
-      </w:r>
-      <w:r>
-        <w:rPr>
-          <w:noProof/>
-          <w:color w:val="000000" w:themeColor="text1"/>
-          <w:vertAlign w:val="superscript"/>
-        </w:rPr>
-        <w:t>4</w:t>
-      </w:r>
-      <w:r>
-        <w:rPr>
-          <w:color w:val="000000" w:themeColor="text1"/>
-        </w:rPr>
-        <w:fldChar w:fldCharType="end"/>
-      </w:r>
-      <w:r>
-        <w:rPr>
-          <w:rFonts w:ascii="Cambria" w:hAnsi="Cambria"/>
-          <w:bCs/>
-          <w:sz w:val="24"/>
-          <w:szCs w:val="24"/>
-        </w:rPr>
-        <w:t>. The two scores</w:t>
-      </w:r>
+      <w:proofErr w:type="spellStart"/>
+      <w:r>
+        <w:rPr>
+          <w:rFonts w:ascii="Cambria" w:hAnsi="Cambria"/>
+          <w:bCs/>
+          <w:sz w:val="24"/>
+          <w:szCs w:val="24"/>
+        </w:rPr>
+        <w:t>CollectSequencingArtifactMetrics</w:t>
+      </w:r>
+      <w:proofErr w:type="spellEnd"/>
       <w:r>
         <w:rPr>
           <w:rFonts w:ascii="Cambria" w:hAnsi="Cambria"/>
@@ -1716,475 +1793,70 @@
         </w:rPr>
         <w:t xml:space="preserve"> </w:t>
       </w:r>
-      <w:bookmarkStart w:id="7" w:name="_Hlk48123095"/>
-      <w:r>
-        <w:rPr>
-          <w:rFonts w:ascii="Cambria" w:hAnsi="Cambria"/>
-          <w:bCs/>
-          <w:sz w:val="24"/>
-          <w:szCs w:val="24"/>
-        </w:rPr>
-        <w:t xml:space="preserve">(CCS and UE, defined below) </w:t>
-      </w:r>
-      <w:bookmarkEnd w:id="7"/>
-      <w:r>
-        <w:rPr>
-          <w:rFonts w:ascii="Cambria" w:hAnsi="Cambria"/>
-          <w:bCs/>
-          <w:sz w:val="24"/>
-          <w:szCs w:val="24"/>
-        </w:rPr>
-        <w:t>are calculated based on both GENE_NUM genes and EXON_NUM target regions of capture</w:t>
-      </w:r>
-      <w:r>
-        <w:rPr>
-          <w:rFonts w:ascii="Cambria" w:hAnsi="Cambria"/>
-          <w:bCs/>
-          <w:sz w:val="24"/>
-          <w:szCs w:val="24"/>
-        </w:rPr>
-        <w:t xml:space="preserve"> </w:t>
-      </w:r>
-      <w:r>
-        <w:rPr>
-          <w:rFonts w:ascii="Cambria" w:hAnsi="Cambria"/>
-          <w:bCs/>
-          <w:sz w:val="24"/>
-          <w:szCs w:val="24"/>
-        </w:rPr>
-        <w:t>kit bed file across the all samples.</w:t>
-      </w:r>
-    </w:p>
-    <w:p>
-      <w:pPr>
-        <w:rPr>
-          <w:rFonts w:ascii="Cambria" w:hAnsi="Cambria"/>
-          <w:bCs/>
-          <w:sz w:val="24"/>
-          <w:szCs w:val="24"/>
-        </w:rPr>
-      </w:pPr>
-      <w:r>
-        <w:rPr>
-          <w:rFonts w:ascii="Cambria" w:hAnsi="Cambria"/>
-          <w:bCs/>
-          <w:sz w:val="24"/>
-          <w:szCs w:val="24"/>
-        </w:rPr>
-        <w:t>The CCS (Cohort Coverage Sparseness) score measures the percentage of base pairs with low coverage in a specific gene/target exon capture region across all samples. It is defined as the percentage of low coverage (&lt;10X) bases within a given capture region in multiple WES samples. It’s basically the median number of samples with low coverage base percentage at a particular capture region. Thus, it may vary between 0 and 1, with high CCS scores indicating low sequence coverage. In general, a CCS score below 0.2 is considered as good coverage.</w:t>
-      </w:r>
-    </w:p>
-    <w:p>
-      <w:pPr>
-        <w:rPr>
-          <w:rFonts w:ascii="Cambria" w:hAnsi="Cambria"/>
-          <w:bCs/>
-          <w:sz w:val="24"/>
-          <w:szCs w:val="24"/>
-        </w:rPr>
-      </w:pPr>
-      <w:r>
-        <w:rPr>
-          <w:rFonts w:ascii="Cambria" w:hAnsi="Cambria"/>
-          <w:bCs/>
-          <w:sz w:val="24"/>
-          <w:szCs w:val="24"/>
-        </w:rPr>
-        <w:t xml:space="preserve">The UE (Unevenness) score measures non-uniformity of the coverage in a specific gene/target capture region across all samples. It is calculated based on the number and structural features (height, width, base) of the coverage peaks. The UE score increases with an increase in the number and relative height of peaks within a given capture region, where a score of 1 indicates uniformly distributed coverage, and the higher the score, the less uniform the coverage is in the capture region.  </w:t>
-      </w:r>
-    </w:p>
-    <w:p>
-      <w:pPr>
-        <w:rPr>
-          <w:rFonts w:ascii="Cambria" w:hAnsi="Cambria"/>
-          <w:bCs/>
-          <w:sz w:val="24"/>
-          <w:szCs w:val="24"/>
-        </w:rPr>
-      </w:pPr>
-      <w:r>
-        <w:rPr>
-          <w:rFonts w:ascii="Cambria" w:hAnsi="Cambria"/>
-          <w:bCs/>
-          <w:sz w:val="24"/>
-          <w:szCs w:val="24"/>
-        </w:rPr>
-        <w:t xml:space="preserve">CCS and UE scores provide a cohort level view of the coverage depth and uniformity at given genomic regions. They help users to identify coverage inconsistency across </w:t>
-      </w:r>
-      <w:r>
-        <w:rPr>
-          <w:rFonts w:ascii="Cambria" w:hAnsi="Cambria"/>
-          <w:bCs/>
-          <w:sz w:val="24"/>
-          <w:szCs w:val="24"/>
-        </w:rPr>
-        <w:lastRenderedPageBreak/>
-        <w:t xml:space="preserve">large numbers of samples. This is particularly helpful while assessing the mutations detected through joint analysis.   </w:t>
-      </w:r>
-    </w:p>
-    <w:p>
-      <w:pPr>
-        <w:rPr>
-          <w:rFonts w:ascii="Cambria" w:hAnsi="Cambria"/>
-          <w:b/>
-          <w:sz w:val="24"/>
-          <w:szCs w:val="24"/>
-        </w:rPr>
-      </w:pPr>
-      <w:r>
-        <w:rPr>
-          <w:rFonts w:ascii="Cambria" w:hAnsi="Cambria"/>
-          <w:bCs/>
-          <w:sz w:val="24"/>
-          <w:szCs w:val="24"/>
-        </w:rPr>
-        <w:t xml:space="preserve">Table 4 and Figure 4 are stats based on gene level. For more details of target exon capture region level stats, please refer to the following files: </w:t>
-      </w:r>
-      <w:r>
-        <w:rPr>
-          <w:rFonts w:ascii="Cambria" w:hAnsi="Cambria"/>
-          <w:b/>
-          <w:sz w:val="24"/>
-          <w:szCs w:val="24"/>
-        </w:rPr>
-        <w:t xml:space="preserve">EXOMCQA_GENE_REPORT </w:t>
-      </w:r>
-    </w:p>
-    <w:p>
-      <w:pPr>
-        <w:rPr>
-          <w:rFonts w:ascii="Cambria" w:hAnsi="Cambria"/>
-          <w:b/>
-          <w:sz w:val="24"/>
-          <w:szCs w:val="24"/>
-        </w:rPr>
-      </w:pPr>
-      <w:r>
-        <w:rPr>
-          <w:rFonts w:ascii="Cambria" w:hAnsi="Cambria"/>
-          <w:b/>
-          <w:sz w:val="24"/>
-          <w:szCs w:val="24"/>
-        </w:rPr>
-        <w:t xml:space="preserve">EXOMCQA_EXON_REPORT </w:t>
-      </w:r>
-    </w:p>
-    <w:p>
-      <w:pPr>
-        <w:rPr>
-          <w:rFonts w:ascii="Cambria" w:hAnsi="Cambria"/>
-          <w:b/>
-          <w:sz w:val="24"/>
-          <w:szCs w:val="24"/>
-        </w:rPr>
-      </w:pPr>
-      <w:r>
-        <w:rPr>
-          <w:rFonts w:ascii="Cambria" w:hAnsi="Cambria"/>
-          <w:b/>
-          <w:sz w:val="24"/>
-          <w:szCs w:val="24"/>
-        </w:rPr>
-        <w:t xml:space="preserve"> </w:t>
-      </w:r>
-    </w:p>
-    <w:p>
-      <w:pPr>
-        <w:rPr>
-          <w:rFonts w:ascii="Cambria" w:hAnsi="Cambria"/>
-          <w:b/>
-          <w:sz w:val="24"/>
-          <w:szCs w:val="24"/>
-        </w:rPr>
-      </w:pPr>
-    </w:p>
-    <w:p>
-      <w:pPr>
-        <w:rPr>
-          <w:rFonts w:ascii="Cambria" w:hAnsi="Cambria"/>
-          <w:b/>
-          <w:sz w:val="24"/>
-          <w:szCs w:val="24"/>
-        </w:rPr>
-      </w:pPr>
-      <w:r>
-        <w:rPr>
-          <w:rFonts w:ascii="Cambria" w:hAnsi="Cambria"/>
-          <w:b/>
-          <w:sz w:val="24"/>
-          <w:szCs w:val="24"/>
-        </w:rPr>
-        <w:t xml:space="preserve">Table </w:t>
-      </w:r>
-      <w:r>
-        <w:rPr>
-          <w:rFonts w:asciiTheme="minorEastAsia" w:eastAsiaTheme="minorEastAsia" w:hAnsiTheme="minorEastAsia" w:hint="eastAsia"/>
-          <w:b/>
-          <w:sz w:val="24"/>
-          <w:szCs w:val="24"/>
-          <w:lang w:eastAsia="zh-CN"/>
-        </w:rPr>
-        <w:t>4</w:t>
-      </w:r>
-      <w:r>
-        <w:rPr>
-          <w:rFonts w:ascii="Cambria" w:hAnsi="Cambria"/>
-          <w:b/>
-          <w:sz w:val="24"/>
-          <w:szCs w:val="24"/>
-        </w:rPr>
-        <w:t>a. Min, 1st quantile, Median, Mean, 3rd quantile and Max score for US score</w:t>
-      </w:r>
-      <w:r>
-        <w:rPr>
-          <w:rFonts w:ascii="Cambria" w:hAnsi="Cambria"/>
-          <w:b/>
-          <w:sz w:val="24"/>
-          <w:szCs w:val="24"/>
-        </w:rPr>
-        <w:tab/>
-        <w:t xml:space="preserve"> </w:t>
-      </w:r>
-      <w:r>
-        <w:rPr>
-          <w:rFonts w:ascii="Cambria" w:hAnsi="Cambria"/>
-          <w:b/>
-          <w:sz w:val="24"/>
-          <w:szCs w:val="24"/>
-        </w:rPr>
-        <w:tab/>
-        <w:t xml:space="preserve"> </w:t>
-      </w:r>
-      <w:r>
-        <w:rPr>
-          <w:rFonts w:ascii="Cambria" w:hAnsi="Cambria"/>
-          <w:b/>
-          <w:sz w:val="24"/>
-          <w:szCs w:val="24"/>
-        </w:rPr>
-        <w:tab/>
-        <w:t xml:space="preserve"> </w:t>
-      </w:r>
-      <w:r>
-        <w:rPr>
-          <w:rFonts w:ascii="Cambria" w:hAnsi="Cambria"/>
-          <w:b/>
-          <w:sz w:val="24"/>
-          <w:szCs w:val="24"/>
-        </w:rPr>
-        <w:tab/>
-        <w:t xml:space="preserve"> </w:t>
-      </w:r>
-    </w:p>
-    <w:p>
-      <w:pPr>
-        <w:rPr>
-          <w:rFonts w:ascii="Cambria" w:hAnsi="Cambria"/>
-          <w:b/>
-          <w:sz w:val="24"/>
-          <w:szCs w:val="24"/>
-        </w:rPr>
-      </w:pPr>
-      <w:r>
-        <w:rPr>
-          <w:rFonts w:ascii="Cambria" w:hAnsi="Cambria"/>
-          <w:b/>
-          <w:sz w:val="24"/>
-          <w:szCs w:val="24"/>
-        </w:rPr>
-        <w:t xml:space="preserve">Table </w:t>
-      </w:r>
-      <w:r>
-        <w:rPr>
-          <w:rFonts w:asciiTheme="minorEastAsia" w:eastAsiaTheme="minorEastAsia" w:hAnsiTheme="minorEastAsia" w:hint="eastAsia"/>
-          <w:b/>
-          <w:sz w:val="24"/>
-          <w:szCs w:val="24"/>
-          <w:lang w:eastAsia="zh-CN"/>
-        </w:rPr>
-        <w:t>4</w:t>
-      </w:r>
-      <w:r>
-        <w:rPr>
-          <w:rFonts w:ascii="Cambria" w:hAnsi="Cambria"/>
-          <w:b/>
-          <w:sz w:val="24"/>
-          <w:szCs w:val="24"/>
-        </w:rPr>
-        <w:t>b. Min, 1st quantile, Median, Mean, 3rd quantile and Max score for CCS score</w:t>
-      </w:r>
-    </w:p>
-    <w:p>
-      <w:pPr>
-        <w:rPr>
-          <w:rFonts w:ascii="Cambria" w:hAnsi="Cambria"/>
-          <w:b/>
-          <w:sz w:val="24"/>
-          <w:szCs w:val="24"/>
-        </w:rPr>
-      </w:pPr>
-      <w:r>
-        <w:rPr>
-          <w:rFonts w:ascii="Cambria" w:hAnsi="Cambria"/>
-          <w:b/>
-          <w:sz w:val="24"/>
-          <w:szCs w:val="24"/>
-        </w:rPr>
-        <w:t xml:space="preserve"> </w:t>
-      </w:r>
-    </w:p>
-    <w:p>
-      <w:pPr>
-        <w:rPr>
-          <w:rFonts w:ascii="Cambria" w:hAnsi="Cambria"/>
-          <w:b/>
-          <w:sz w:val="24"/>
-          <w:szCs w:val="24"/>
-        </w:rPr>
-      </w:pPr>
-      <w:r>
-        <w:rPr>
-          <w:rFonts w:ascii="Cambria" w:hAnsi="Cambria"/>
-          <w:b/>
-          <w:sz w:val="24"/>
-          <w:szCs w:val="24"/>
-        </w:rPr>
-        <w:t>Figure 4. the histogram of UE score and CCS Score for all sample</w:t>
-      </w:r>
-    </w:p>
-    <w:p>
-      <w:pPr>
-        <w:rPr>
-          <w:rFonts w:ascii="Cambria" w:hAnsi="Cambria"/>
-          <w:b/>
-          <w:sz w:val="24"/>
-          <w:szCs w:val="24"/>
-        </w:rPr>
-      </w:pPr>
-      <w:r>
-        <w:rPr>
-          <w:rFonts w:ascii="Cambria" w:hAnsi="Cambria"/>
-          <w:b/>
-          <w:sz w:val="24"/>
-          <w:szCs w:val="24"/>
-        </w:rPr>
-        <w:t xml:space="preserve"> </w:t>
-      </w:r>
-    </w:p>
-    <w:p>
-      <w:pPr>
-        <w:rPr>
-          <w:rFonts w:ascii="Cambria" w:hAnsi="Cambria"/>
-          <w:b/>
-          <w:color w:val="365F91"/>
-          <w:sz w:val="24"/>
-          <w:szCs w:val="24"/>
-        </w:rPr>
-      </w:pPr>
-      <w:r>
-        <w:rPr>
-          <w:rFonts w:ascii="Cambria" w:hAnsi="Cambria"/>
-          <w:b/>
-          <w:sz w:val="24"/>
-          <w:szCs w:val="24"/>
-        </w:rPr>
-        <w:t xml:space="preserve">Table </w:t>
-      </w:r>
-      <w:r>
-        <w:rPr>
-          <w:rFonts w:asciiTheme="minorEastAsia" w:eastAsiaTheme="minorEastAsia" w:hAnsiTheme="minorEastAsia" w:hint="eastAsia"/>
-          <w:b/>
-          <w:sz w:val="24"/>
-          <w:szCs w:val="24"/>
-          <w:lang w:eastAsia="zh-CN"/>
-        </w:rPr>
-        <w:t>5</w:t>
-      </w:r>
-      <w:r>
-        <w:rPr>
-          <w:rFonts w:ascii="Cambria" w:hAnsi="Cambria"/>
-          <w:b/>
-          <w:sz w:val="24"/>
-          <w:szCs w:val="24"/>
-        </w:rPr>
-        <w:t xml:space="preserve">.  10 regions with highest Unevenness Score for </w:t>
-      </w:r>
-      <w:r>
-        <w:rPr>
-          <w:rFonts w:ascii="Cambria" w:hAnsi="Cambria"/>
-          <w:b/>
-          <w:sz w:val="24"/>
-          <w:szCs w:val="24"/>
-        </w:rPr>
-        <w:t>all</w:t>
-      </w:r>
-      <w:r>
-        <w:rPr>
-          <w:rFonts w:ascii="Cambria" w:hAnsi="Cambria"/>
-          <w:b/>
-          <w:sz w:val="24"/>
-          <w:szCs w:val="24"/>
-        </w:rPr>
-        <w:t xml:space="preserve"> sample </w:t>
-      </w:r>
-    </w:p>
-    <w:p>
-      <w:pPr>
-        <w:rPr>
-          <w:rFonts w:ascii="Cambria" w:hAnsi="Cambria"/>
-          <w:b/>
-          <w:color w:val="365F91"/>
-          <w:sz w:val="24"/>
-          <w:szCs w:val="24"/>
-        </w:rPr>
-      </w:pPr>
-      <w:r>
-        <w:rPr>
-          <w:rFonts w:ascii="Cambria" w:hAnsi="Cambria"/>
-          <w:b/>
-          <w:color w:val="365F91"/>
-          <w:sz w:val="24"/>
-          <w:szCs w:val="24"/>
-        </w:rPr>
-        <w:t xml:space="preserve">  </w:t>
-      </w:r>
-    </w:p>
-    <w:p>
-      <w:pPr>
-        <w:pStyle w:val="Heading1"/>
-      </w:pPr>
-      <w:bookmarkStart w:id="8" w:name="_Toc48676181"/>
-      <w:r>
-        <w:t>7</w:t>
-      </w:r>
-      <w:r>
-        <w:t xml:space="preserve">. </w:t>
-      </w:r>
-      <w:r>
-        <w:t>PRE-CALLING QC CHECK</w:t>
-      </w:r>
-      <w:bookmarkEnd w:id="8"/>
-      <w:r>
-        <w:t xml:space="preserve"> </w:t>
-      </w:r>
-    </w:p>
-    <w:p>
-      <w:pPr>
-        <w:rPr>
-          <w:rFonts w:ascii="Cambria" w:hAnsi="Cambria"/>
-          <w:bCs/>
-          <w:sz w:val="24"/>
-          <w:szCs w:val="24"/>
-        </w:rPr>
-      </w:pPr>
-      <w:r>
-        <w:rPr>
-          <w:rFonts w:ascii="Cambria" w:hAnsi="Cambria"/>
-          <w:bCs/>
-          <w:sz w:val="24"/>
-          <w:szCs w:val="24"/>
-        </w:rPr>
-        <w:t xml:space="preserve">From the subject level pre-calling qc report, we collect fold 80 base penalty from </w:t>
+      <w:r>
+        <w:rPr>
+          <w:rFonts w:ascii="Cambria" w:hAnsi="Cambria"/>
+          <w:bCs/>
+          <w:sz w:val="24"/>
+          <w:szCs w:val="24"/>
+        </w:rPr>
+        <w:t xml:space="preserve">for all SAMPLE_NUM samples </w:t>
+      </w:r>
+      <w:r>
+        <w:rPr>
+          <w:rFonts w:ascii="Cambria" w:hAnsi="Cambria"/>
+          <w:bCs/>
+          <w:sz w:val="24"/>
+          <w:szCs w:val="24"/>
+        </w:rPr>
+        <w:t>in this summary. For more details and metrics, refer to the PRECALLING_QC_REPORT</w:t>
+      </w:r>
+      <w:r>
+        <w:rPr>
+          <w:rFonts w:ascii="Cambria" w:hAnsi="Cambria"/>
+          <w:bCs/>
+          <w:sz w:val="24"/>
+          <w:szCs w:val="24"/>
+        </w:rPr>
+        <w:t>:</w:t>
+      </w:r>
+    </w:p>
+    <w:p>
+      <w:pPr>
+        <w:rPr>
+          <w:rFonts w:ascii="Cambria" w:hAnsi="Cambria"/>
+          <w:b/>
+          <w:sz w:val="24"/>
+          <w:szCs w:val="24"/>
+        </w:rPr>
+      </w:pPr>
+      <w:r>
+        <w:rPr>
+          <w:rFonts w:ascii="Cambria" w:hAnsi="Cambria"/>
+          <w:b/>
+          <w:sz w:val="24"/>
+          <w:szCs w:val="24"/>
+        </w:rPr>
+        <w:t xml:space="preserve">  PRECALLING_QC_REPORT</w:t>
+      </w:r>
+    </w:p>
+    <w:p>
+      <w:pPr>
+        <w:rPr>
+          <w:rFonts w:ascii="Cambria" w:hAnsi="Cambria"/>
+          <w:bCs/>
+          <w:sz w:val="24"/>
+          <w:szCs w:val="24"/>
+        </w:rPr>
+      </w:pPr>
+      <w:r>
+        <w:rPr>
+          <w:rFonts w:ascii="Cambria" w:hAnsi="Cambria"/>
+          <w:bCs/>
+          <w:sz w:val="24"/>
+          <w:szCs w:val="24"/>
+        </w:rPr>
+        <w:t>Fold 80 penalty score is defined as the fold over-coverage necessary to raise 80% of bases in "non-zero-</w:t>
       </w:r>
       <w:proofErr w:type="spellStart"/>
       <w:r>
@@ -2194,7 +1866,7 @@
           <w:sz w:val="24"/>
           <w:szCs w:val="24"/>
         </w:rPr>
-        <w:t>picard</w:t>
+        <w:t>cvg</w:t>
       </w:r>
       <w:proofErr w:type="spellEnd"/>
       <w:r>
@@ -2204,7 +1876,7 @@
           <w:sz w:val="24"/>
           <w:szCs w:val="24"/>
         </w:rPr>
-        <w:t xml:space="preserve"> </w:t>
+        <w:t>" targets to the mean coverage level in those targets. Lower Fold 80 score is indicative of more even coverage across targets.</w:t>
       </w:r>
     </w:p>
     <w:p>
@@ -2224,242 +1896,6 @@
           <w:sz w:val="24"/>
           <w:szCs w:val="24"/>
         </w:rPr>
-        <w:t>CollectHsMetrics</w:t>
-      </w:r>
-      <w:proofErr w:type="spellEnd"/>
-      <w:r>
-        <w:rPr>
-          <w:rFonts w:ascii="Cambria" w:hAnsi="Cambria"/>
-          <w:bCs/>
-          <w:sz w:val="24"/>
-          <w:szCs w:val="24"/>
-        </w:rPr>
-        <w:t xml:space="preserve">, average oxidation quality from </w:t>
-      </w:r>
-      <w:proofErr w:type="spellStart"/>
-      <w:r>
-        <w:rPr>
-          <w:rFonts w:ascii="Cambria" w:hAnsi="Cambria"/>
-          <w:bCs/>
-          <w:sz w:val="24"/>
-          <w:szCs w:val="24"/>
-        </w:rPr>
-        <w:t>picard</w:t>
-      </w:r>
-      <w:proofErr w:type="spellEnd"/>
-      <w:r>
-        <w:rPr>
-          <w:rFonts w:ascii="Cambria" w:hAnsi="Cambria"/>
-          <w:bCs/>
-          <w:sz w:val="24"/>
-          <w:szCs w:val="24"/>
-        </w:rPr>
-        <w:t xml:space="preserve"> </w:t>
-      </w:r>
-      <w:proofErr w:type="spellStart"/>
-      <w:r>
-        <w:rPr>
-          <w:rFonts w:ascii="Cambria" w:hAnsi="Cambria"/>
-          <w:bCs/>
-          <w:sz w:val="24"/>
-          <w:szCs w:val="24"/>
-        </w:rPr>
-        <w:t>CollectOxoGMetrics</w:t>
-      </w:r>
-      <w:proofErr w:type="spellEnd"/>
-      <w:r>
-        <w:rPr>
-          <w:rFonts w:ascii="Cambria" w:hAnsi="Cambria"/>
-          <w:bCs/>
-          <w:sz w:val="24"/>
-          <w:szCs w:val="24"/>
-        </w:rPr>
-        <w:t xml:space="preserve"> and lowest </w:t>
-      </w:r>
-      <w:proofErr w:type="spellStart"/>
-      <w:r>
-        <w:rPr>
-          <w:rFonts w:ascii="Cambria" w:hAnsi="Cambria"/>
-          <w:bCs/>
-          <w:sz w:val="24"/>
-          <w:szCs w:val="24"/>
-        </w:rPr>
-        <w:t>preadapter</w:t>
-      </w:r>
-      <w:proofErr w:type="spellEnd"/>
-      <w:r>
-        <w:rPr>
-          <w:rFonts w:ascii="Cambria" w:hAnsi="Cambria"/>
-          <w:bCs/>
-          <w:sz w:val="24"/>
-          <w:szCs w:val="24"/>
-        </w:rPr>
-        <w:t>/</w:t>
-      </w:r>
-      <w:proofErr w:type="spellStart"/>
-      <w:r>
-        <w:rPr>
-          <w:rFonts w:ascii="Cambria" w:hAnsi="Cambria"/>
-          <w:bCs/>
-          <w:sz w:val="24"/>
-          <w:szCs w:val="24"/>
-        </w:rPr>
-        <w:t>baitbias</w:t>
-      </w:r>
-      <w:proofErr w:type="spellEnd"/>
-      <w:r>
-        <w:rPr>
-          <w:rFonts w:ascii="Cambria" w:hAnsi="Cambria"/>
-          <w:bCs/>
-          <w:sz w:val="24"/>
-          <w:szCs w:val="24"/>
-        </w:rPr>
-        <w:t xml:space="preserve"> total score from </w:t>
-      </w:r>
-      <w:proofErr w:type="spellStart"/>
-      <w:r>
-        <w:rPr>
-          <w:rFonts w:ascii="Cambria" w:hAnsi="Cambria"/>
-          <w:bCs/>
-          <w:sz w:val="24"/>
-          <w:szCs w:val="24"/>
-        </w:rPr>
-        <w:t>picard</w:t>
-      </w:r>
-      <w:proofErr w:type="spellEnd"/>
-      <w:r>
-        <w:rPr>
-          <w:rFonts w:ascii="Cambria" w:hAnsi="Cambria"/>
-          <w:bCs/>
-          <w:sz w:val="24"/>
-          <w:szCs w:val="24"/>
-        </w:rPr>
-        <w:t xml:space="preserve"> </w:t>
-      </w:r>
-      <w:proofErr w:type="spellStart"/>
-      <w:r>
-        <w:rPr>
-          <w:rFonts w:ascii="Cambria" w:hAnsi="Cambria"/>
-          <w:bCs/>
-          <w:sz w:val="24"/>
-          <w:szCs w:val="24"/>
-        </w:rPr>
-        <w:t>CollectSequencingArtifactMetrics</w:t>
-      </w:r>
-      <w:proofErr w:type="spellEnd"/>
-      <w:r>
-        <w:rPr>
-          <w:rFonts w:ascii="Cambria" w:hAnsi="Cambria"/>
-          <w:bCs/>
-          <w:sz w:val="24"/>
-          <w:szCs w:val="24"/>
-        </w:rPr>
-        <w:t xml:space="preserve"> </w:t>
-      </w:r>
-      <w:r>
-        <w:rPr>
-          <w:rFonts w:ascii="Cambria" w:hAnsi="Cambria"/>
-          <w:bCs/>
-          <w:sz w:val="24"/>
-          <w:szCs w:val="24"/>
-        </w:rPr>
-        <w:t xml:space="preserve">for all SAMPLE_NUM samples </w:t>
-      </w:r>
-      <w:r>
-        <w:rPr>
-          <w:rFonts w:ascii="Cambria" w:hAnsi="Cambria"/>
-          <w:bCs/>
-          <w:sz w:val="24"/>
-          <w:szCs w:val="24"/>
-        </w:rPr>
-        <w:t>in this summary. For more details and metrics, refer to the PRECALLING_QC_REPORT</w:t>
-      </w:r>
-      <w:r>
-        <w:rPr>
-          <w:rFonts w:ascii="Cambria" w:hAnsi="Cambria"/>
-          <w:bCs/>
-          <w:sz w:val="24"/>
-          <w:szCs w:val="24"/>
-        </w:rPr>
-        <w:t>:</w:t>
-      </w:r>
-    </w:p>
-    <w:p>
-      <w:pPr>
-        <w:rPr>
-          <w:rFonts w:ascii="Cambria" w:hAnsi="Cambria"/>
-          <w:b/>
-          <w:sz w:val="24"/>
-          <w:szCs w:val="24"/>
-        </w:rPr>
-      </w:pPr>
-      <w:r>
-        <w:rPr>
-          <w:rFonts w:ascii="Cambria" w:hAnsi="Cambria"/>
-          <w:b/>
-          <w:sz w:val="24"/>
-          <w:szCs w:val="24"/>
-        </w:rPr>
-        <w:t xml:space="preserve">  PRECALLING_QC_REPORT</w:t>
-      </w:r>
-    </w:p>
-    <w:p>
-      <w:pPr>
-        <w:rPr>
-          <w:rFonts w:ascii="Cambria" w:hAnsi="Cambria"/>
-          <w:bCs/>
-          <w:sz w:val="24"/>
-          <w:szCs w:val="24"/>
-        </w:rPr>
-      </w:pPr>
-      <w:r>
-        <w:rPr>
-          <w:rFonts w:ascii="Cambria" w:hAnsi="Cambria"/>
-          <w:bCs/>
-          <w:sz w:val="24"/>
-          <w:szCs w:val="24"/>
-        </w:rPr>
-        <w:t>Fold 80 penalty score is defined as the fold over-coverage necessary to raise 80% of bases in "non-zero-</w:t>
-      </w:r>
-      <w:proofErr w:type="spellStart"/>
-      <w:r>
-        <w:rPr>
-          <w:rFonts w:ascii="Cambria" w:hAnsi="Cambria"/>
-          <w:bCs/>
-          <w:sz w:val="24"/>
-          <w:szCs w:val="24"/>
-        </w:rPr>
-        <w:t>cvg</w:t>
-      </w:r>
-      <w:proofErr w:type="spellEnd"/>
-      <w:r>
-        <w:rPr>
-          <w:rFonts w:ascii="Cambria" w:hAnsi="Cambria"/>
-          <w:bCs/>
-          <w:sz w:val="24"/>
-          <w:szCs w:val="24"/>
-        </w:rPr>
-        <w:t>" targets to the mean coverage level in those targets. Lower Fold 80 score is indicative of more even coverage across targets.</w:t>
-      </w:r>
-    </w:p>
-    <w:p>
-      <w:pPr>
-        <w:rPr>
-          <w:rFonts w:ascii="Cambria" w:hAnsi="Cambria"/>
-          <w:bCs/>
-          <w:sz w:val="24"/>
-          <w:szCs w:val="24"/>
-        </w:rPr>
-      </w:pPr>
-      <w:proofErr w:type="spellStart"/>
-      <w:r>
-        <w:rPr>
-          <w:rFonts w:ascii="Cambria" w:hAnsi="Cambria"/>
-          <w:bCs/>
-          <w:sz w:val="24"/>
-          <w:szCs w:val="24"/>
-        </w:rPr>
-        <w:lastRenderedPageBreak/>
         <w:t>CollectOxoGMetrics</w:t>
       </w:r>
       <w:proofErr w:type="spellEnd"/>
@@ -2713,6 +2149,7 @@
           <w:sz w:val="24"/>
           <w:szCs w:val="24"/>
         </w:rPr>
+        <w:lastRenderedPageBreak/>
         <w:t>CollectSequencingArtifactMetrics</w:t>
       </w:r>
       <w:proofErr w:type="spellEnd"/>
@@ -2723,7 +2160,47 @@
           <w:sz w:val="24"/>
           <w:szCs w:val="24"/>
         </w:rPr>
-        <w:t xml:space="preserve"> examines two sources of sequencing errors associated with hybridization selection protocols. These errors are divided into two broad categories, pre-adapter and bait-bias. Pre-adapter errors can arise from laboratory manipulations of a sample damaged before library prep/adapter ligation (examples include sample degradation, or fixative treatments such as formalin in FFPE samples).   Bait-bias artifacts occur during or after the target selection step, and correlate with substitution rates that are 'biased', or higher for sites having one base on the reference/positive strand relative to sites having the complementary base on that strand. Most previous problematic samples have </w:t>
+        <w:t xml:space="preserve"> examines two sources of sequencing errors associated with hybridization selection protocols. These errors are divided into two broad categories, pre-</w:t>
+      </w:r>
+      <w:proofErr w:type="gramStart"/>
+      <w:r>
+        <w:rPr>
+          <w:rFonts w:ascii="Cambria" w:hAnsi="Cambria"/>
+          <w:bCs/>
+          <w:sz w:val="24"/>
+          <w:szCs w:val="24"/>
+        </w:rPr>
+        <w:t>adapter</w:t>
+      </w:r>
+      <w:proofErr w:type="gramEnd"/>
+      <w:r>
+        <w:rPr>
+          <w:rFonts w:ascii="Cambria" w:hAnsi="Cambria"/>
+          <w:bCs/>
+          <w:sz w:val="24"/>
+          <w:szCs w:val="24"/>
+        </w:rPr>
+        <w:t xml:space="preserve"> and bait-bias. Pre-adapter errors can arise from laboratory manipulations of a sample damaged before library prep/adapter ligation (examples include sample degradation, or fixative treatments such as formalin in FFPE samples).   Bait-bias artifacts occur during or after the target selection step, and correlate with substitution rates that are 'biased', or higher for sites having one </w:t>
+      </w:r>
+      <w:proofErr w:type="gramStart"/>
+      <w:r>
+        <w:rPr>
+          <w:rFonts w:ascii="Cambria" w:hAnsi="Cambria"/>
+          <w:bCs/>
+          <w:sz w:val="24"/>
+          <w:szCs w:val="24"/>
+        </w:rPr>
+        <w:t>base</w:t>
+      </w:r>
+      <w:proofErr w:type="gramEnd"/>
+      <w:r>
+        <w:rPr>
+          <w:rFonts w:ascii="Cambria" w:hAnsi="Cambria"/>
+          <w:bCs/>
+          <w:sz w:val="24"/>
+          <w:szCs w:val="24"/>
+        </w:rPr>
+        <w:t xml:space="preserve"> on the reference/positive strand relative to sites having the complementary base on that strand. Most previous problematic samples have </w:t>
       </w:r>
       <w:proofErr w:type="spellStart"/>
       <w:r>
@@ -2874,6 +2351,7 @@
           <w:szCs w:val="24"/>
         </w:rPr>
       </w:pPr>
+      <w:bookmarkStart w:id="7" w:name="_Hlk141915717"/>
       <w:r>
         <w:rPr>
           <w:rFonts w:ascii="Cambria" w:hAnsi="Cambria"/>
@@ -2917,55 +2395,50 @@
           <w:sz w:val="24"/>
           <w:szCs w:val="24"/>
         </w:rPr>
-        <w:t xml:space="preserve"> for all Fold 80 base penalty for samples</w:t>
-      </w:r>
-    </w:p>
-    <w:p>
-      <w:pPr>
-        <w:rPr>
-          <w:rFonts w:ascii="Cambria" w:hAnsi="Cambria"/>
-          <w:b/>
-          <w:sz w:val="24"/>
-          <w:szCs w:val="24"/>
-        </w:rPr>
-      </w:pPr>
-      <w:r>
-        <w:rPr>
-          <w:rFonts w:ascii="Cambria" w:hAnsi="Cambria"/>
-          <w:b/>
-          <w:sz w:val="24"/>
-          <w:szCs w:val="24"/>
-        </w:rPr>
-        <w:t>Figure 5</w:t>
-      </w:r>
-      <w:r>
-        <w:rPr>
-          <w:rFonts w:ascii="Cambria" w:hAnsi="Cambria"/>
-          <w:b/>
-          <w:sz w:val="24"/>
-          <w:szCs w:val="24"/>
-        </w:rPr>
-        <w:t>b</w:t>
-      </w:r>
-      <w:r>
-        <w:rPr>
-          <w:rFonts w:ascii="Cambria" w:hAnsi="Cambria"/>
-          <w:b/>
-          <w:sz w:val="24"/>
-          <w:szCs w:val="24"/>
-        </w:rPr>
-        <w:t>. boxplot for median and mean insert sizes</w:t>
-      </w:r>
-    </w:p>
-    <w:p>
-      <w:pPr>
-        <w:rPr>
-          <w:rFonts w:ascii="Cambria" w:hAnsi="Cambria"/>
-          <w:b/>
-          <w:sz w:val="24"/>
-          <w:szCs w:val="24"/>
-        </w:rPr>
-      </w:pPr>
+        <w:t xml:space="preserve"> for all Fold 80 base penalty for </w:t>
+      </w:r>
+      <w:proofErr w:type="gramStart"/>
+      <w:r>
+        <w:rPr>
+          <w:rFonts w:ascii="Cambria" w:hAnsi="Cambria"/>
+          <w:b/>
+          <w:sz w:val="24"/>
+          <w:szCs w:val="24"/>
+        </w:rPr>
+        <w:t>samples</w:t>
+      </w:r>
+      <w:proofErr w:type="gramEnd"/>
+    </w:p>
+    <w:bookmarkEnd w:id="7"/>
+    <w:p>
+      <w:pPr>
+        <w:rPr>
+          <w:rFonts w:ascii="Cambria" w:hAnsi="Cambria"/>
+          <w:b/>
+          <w:sz w:val="24"/>
+          <w:szCs w:val="24"/>
+        </w:rPr>
+      </w:pPr>
+      <w:r>
+        <w:rPr>
+          <w:rFonts w:ascii="Cambria" w:hAnsi="Cambria"/>
+          <w:b/>
+          <w:sz w:val="24"/>
+          <w:szCs w:val="24"/>
+        </w:rPr>
+        <w:t xml:space="preserve">Figure 5b. boxplot for median and mean insert </w:t>
+      </w:r>
+      <w:proofErr w:type="gramStart"/>
+      <w:r>
+        <w:rPr>
+          <w:rFonts w:ascii="Cambria" w:hAnsi="Cambria"/>
+          <w:b/>
+          <w:sz w:val="24"/>
+          <w:szCs w:val="24"/>
+        </w:rPr>
+        <w:t>sizes</w:t>
+      </w:r>
+      <w:proofErr w:type="gramEnd"/>
       <w:r>
         <w:rPr>
           <w:rFonts w:ascii="Cambria" w:hAnsi="Cambria"/>
@@ -3131,8 +2604,8 @@
           <w:rFonts w:ascii="Cambria" w:hAnsi="Cambria"/>
           <w:b/>
           <w:color w:val="365F91"/>
-          <w:sz w:val="24"/>
-          <w:szCs w:val="24"/>
+          <w:sz w:val="36"/>
+          <w:szCs w:val="36"/>
         </w:rPr>
       </w:pPr>
       <w:r>
@@ -3140,340 +2613,351 @@
           <w:rFonts w:ascii="Cambria" w:hAnsi="Cambria"/>
           <w:b/>
           <w:color w:val="365F91"/>
-          <w:sz w:val="24"/>
-          <w:szCs w:val="24"/>
-        </w:rPr>
+          <w:sz w:val="36"/>
+          <w:szCs w:val="36"/>
+        </w:rPr>
+        <w:t>7</w:t>
+      </w:r>
+      <w:r>
+        <w:rPr>
+          <w:rFonts w:ascii="Cambria" w:hAnsi="Cambria"/>
+          <w:b/>
+          <w:color w:val="365F91"/>
+          <w:sz w:val="36"/>
+          <w:szCs w:val="36"/>
+        </w:rPr>
+        <w:t xml:space="preserve">. SEX CHECK </w:t>
+      </w:r>
+    </w:p>
+    <w:p>
+      <w:pPr>
+        <w:rPr>
+          <w:rFonts w:ascii="Cambria" w:hAnsi="Cambria"/>
+          <w:b/>
+          <w:sz w:val="24"/>
+          <w:szCs w:val="24"/>
+        </w:rPr>
+      </w:pPr>
+      <w:r>
+        <w:rPr>
+          <w:rFonts w:ascii="Cambria" w:hAnsi="Cambria"/>
+          <w:bCs/>
+          <w:sz w:val="24"/>
+          <w:szCs w:val="24"/>
+        </w:rPr>
+        <w:t xml:space="preserve">Sample Sex was calculated based on the ratio of mapped reads to </w:t>
+      </w:r>
+      <w:proofErr w:type="spellStart"/>
+      <w:r>
+        <w:rPr>
+          <w:rFonts w:ascii="Cambria" w:hAnsi="Cambria"/>
+          <w:bCs/>
+          <w:sz w:val="24"/>
+          <w:szCs w:val="24"/>
+        </w:rPr>
+        <w:t>ChrY</w:t>
+      </w:r>
+      <w:proofErr w:type="spellEnd"/>
+      <w:r>
+        <w:rPr>
+          <w:rFonts w:ascii="Cambria" w:hAnsi="Cambria"/>
+          <w:bCs/>
+          <w:sz w:val="24"/>
+          <w:szCs w:val="24"/>
+        </w:rPr>
+        <w:t xml:space="preserve"> and </w:t>
+      </w:r>
+      <w:proofErr w:type="spellStart"/>
+      <w:r>
+        <w:rPr>
+          <w:rFonts w:ascii="Cambria" w:hAnsi="Cambria"/>
+          <w:bCs/>
+          <w:sz w:val="24"/>
+          <w:szCs w:val="24"/>
+        </w:rPr>
+        <w:t>ChrX</w:t>
+      </w:r>
+      <w:proofErr w:type="spellEnd"/>
+      <w:r>
+        <w:rPr>
+          <w:rFonts w:ascii="Cambria" w:hAnsi="Cambria"/>
+          <w:bCs/>
+          <w:sz w:val="24"/>
+          <w:szCs w:val="24"/>
+        </w:rPr>
+        <w:t xml:space="preserve">.  Sex concordance was then checked between </w:t>
+      </w:r>
+      <w:proofErr w:type="spellStart"/>
+      <w:r>
+        <w:rPr>
+          <w:rFonts w:ascii="Cambria" w:hAnsi="Cambria"/>
+          <w:bCs/>
+          <w:sz w:val="24"/>
+          <w:szCs w:val="24"/>
+        </w:rPr>
+        <w:t>ChrY</w:t>
+      </w:r>
+      <w:proofErr w:type="spellEnd"/>
+      <w:r>
+        <w:rPr>
+          <w:rFonts w:ascii="Cambria" w:hAnsi="Cambria"/>
+          <w:bCs/>
+          <w:sz w:val="24"/>
+          <w:szCs w:val="24"/>
+        </w:rPr>
+        <w:t>/</w:t>
+      </w:r>
+      <w:proofErr w:type="spellStart"/>
+      <w:r>
+        <w:rPr>
+          <w:rFonts w:ascii="Cambria" w:hAnsi="Cambria"/>
+          <w:bCs/>
+          <w:sz w:val="24"/>
+          <w:szCs w:val="24"/>
+        </w:rPr>
+        <w:t>ChrX</w:t>
+      </w:r>
+      <w:proofErr w:type="spellEnd"/>
+      <w:r>
+        <w:rPr>
+          <w:rFonts w:ascii="Cambria" w:hAnsi="Cambria"/>
+          <w:bCs/>
+          <w:sz w:val="24"/>
+          <w:szCs w:val="24"/>
+        </w:rPr>
+        <w:t xml:space="preserve"> mapping ratio from sequence data and IDENTIFILER detected sex</w:t>
+      </w:r>
+      <w:bookmarkStart w:id="8" w:name="_Hlk48123768"/>
+      <w:r>
+        <w:rPr>
+          <w:rFonts w:ascii="Cambria" w:hAnsi="Cambria"/>
+          <w:bCs/>
+          <w:sz w:val="24"/>
+          <w:szCs w:val="24"/>
+        </w:rPr>
+        <w:t xml:space="preserve">. In Figure 8, </w:t>
+      </w:r>
+      <w:r>
+        <w:rPr>
+          <w:rFonts w:ascii="Cambria" w:hAnsi="Cambria"/>
+          <w:bCs/>
+          <w:sz w:val="24"/>
+          <w:szCs w:val="24"/>
+        </w:rPr>
+        <w:t>sex outliers are</w:t>
+      </w:r>
+      <w:r>
+        <w:rPr>
+          <w:rFonts w:ascii="Cambria" w:hAnsi="Cambria"/>
+          <w:bCs/>
+          <w:sz w:val="24"/>
+          <w:szCs w:val="24"/>
+        </w:rPr>
+        <w:t xml:space="preserve"> samples showed </w:t>
+      </w:r>
+      <w:proofErr w:type="spellStart"/>
+      <w:r>
+        <w:rPr>
+          <w:rFonts w:ascii="Cambria" w:hAnsi="Cambria"/>
+          <w:bCs/>
+          <w:sz w:val="24"/>
+          <w:szCs w:val="24"/>
+        </w:rPr>
+        <w:t>ChrY</w:t>
+      </w:r>
+      <w:proofErr w:type="spellEnd"/>
+      <w:r>
+        <w:rPr>
+          <w:rFonts w:ascii="Cambria" w:hAnsi="Cambria"/>
+          <w:bCs/>
+          <w:sz w:val="24"/>
+          <w:szCs w:val="24"/>
+        </w:rPr>
+        <w:t>/</w:t>
+      </w:r>
+      <w:proofErr w:type="spellStart"/>
+      <w:r>
+        <w:rPr>
+          <w:rFonts w:ascii="Cambria" w:hAnsi="Cambria"/>
+          <w:bCs/>
+          <w:sz w:val="24"/>
+          <w:szCs w:val="24"/>
+        </w:rPr>
+        <w:t>ChrX</w:t>
+      </w:r>
+      <w:proofErr w:type="spellEnd"/>
+      <w:r>
+        <w:rPr>
+          <w:rFonts w:ascii="Cambria" w:hAnsi="Cambria"/>
+          <w:bCs/>
+          <w:sz w:val="24"/>
+          <w:szCs w:val="24"/>
+        </w:rPr>
+        <w:t xml:space="preserve"> </w:t>
+      </w:r>
+      <w:r>
+        <w:rPr>
+          <w:rFonts w:ascii="Cambria" w:hAnsi="Cambria"/>
+          <w:bCs/>
+          <w:sz w:val="24"/>
+          <w:szCs w:val="24"/>
+        </w:rPr>
+        <w:t>ratios</w:t>
+      </w:r>
+      <w:r>
+        <w:rPr>
+          <w:rFonts w:ascii="Cambria" w:hAnsi="Cambria"/>
+          <w:bCs/>
+          <w:sz w:val="24"/>
+          <w:szCs w:val="24"/>
+        </w:rPr>
+        <w:t xml:space="preserve"> </w:t>
+      </w:r>
+      <w:r>
+        <w:rPr>
+          <w:rFonts w:ascii="Cambria" w:hAnsi="Cambria"/>
+          <w:bCs/>
+          <w:sz w:val="24"/>
+          <w:szCs w:val="24"/>
+        </w:rPr>
+        <w:t xml:space="preserve">lie outside the range of average ratio +/- standard deviation of </w:t>
+      </w:r>
+      <w:r>
+        <w:rPr>
+          <w:rFonts w:ascii="Cambria" w:hAnsi="Cambria"/>
+          <w:bCs/>
+          <w:sz w:val="24"/>
+          <w:szCs w:val="24"/>
+        </w:rPr>
+        <w:t>the opposite se</w:t>
+      </w:r>
+      <w:r>
+        <w:rPr>
+          <w:rFonts w:ascii="Cambria" w:hAnsi="Cambria"/>
+          <w:bCs/>
+          <w:sz w:val="24"/>
+          <w:szCs w:val="24"/>
+        </w:rPr>
+        <w:t>x.</w:t>
+      </w:r>
+    </w:p>
+    <w:bookmarkEnd w:id="8"/>
+    <w:p>
+      <w:pPr>
+        <w:rPr>
+          <w:rFonts w:ascii="Cambria" w:hAnsi="Cambria"/>
+          <w:b/>
+          <w:sz w:val="24"/>
+          <w:szCs w:val="24"/>
+        </w:rPr>
+      </w:pPr>
+      <w:r>
+        <w:rPr>
+          <w:rFonts w:ascii="Cambria" w:hAnsi="Cambria"/>
+          <w:b/>
+          <w:sz w:val="24"/>
+          <w:szCs w:val="24"/>
+        </w:rPr>
+        <w:t xml:space="preserve">Figure 8. </w:t>
+      </w:r>
+      <w:proofErr w:type="spellStart"/>
+      <w:r>
+        <w:rPr>
+          <w:rFonts w:ascii="Cambria" w:hAnsi="Cambria"/>
+          <w:b/>
+          <w:sz w:val="24"/>
+          <w:szCs w:val="24"/>
+        </w:rPr>
+        <w:t>ChrY</w:t>
+      </w:r>
+      <w:proofErr w:type="spellEnd"/>
+      <w:r>
+        <w:rPr>
+          <w:rFonts w:ascii="Cambria" w:hAnsi="Cambria"/>
+          <w:b/>
+          <w:sz w:val="24"/>
+          <w:szCs w:val="24"/>
+        </w:rPr>
+        <w:t>/</w:t>
+      </w:r>
+      <w:proofErr w:type="spellStart"/>
+      <w:r>
+        <w:rPr>
+          <w:rFonts w:ascii="Cambria" w:hAnsi="Cambria"/>
+          <w:b/>
+          <w:sz w:val="24"/>
+          <w:szCs w:val="24"/>
+        </w:rPr>
+        <w:t>ChrX</w:t>
+      </w:r>
+      <w:proofErr w:type="spellEnd"/>
+      <w:r>
+        <w:rPr>
+          <w:rFonts w:ascii="Cambria" w:hAnsi="Cambria"/>
+          <w:b/>
+          <w:sz w:val="24"/>
+          <w:szCs w:val="24"/>
+        </w:rPr>
+        <w:t xml:space="preserve"> reads </w:t>
+      </w:r>
+      <w:proofErr w:type="gramStart"/>
+      <w:r>
+        <w:rPr>
+          <w:rFonts w:ascii="Cambria" w:hAnsi="Cambria"/>
+          <w:b/>
+          <w:sz w:val="24"/>
+          <w:szCs w:val="24"/>
+        </w:rPr>
+        <w:t>ratio</w:t>
+      </w:r>
+      <w:proofErr w:type="gramEnd"/>
+      <w:r>
+        <w:rPr>
+          <w:rFonts w:ascii="Cambria" w:hAnsi="Cambria"/>
+          <w:b/>
+          <w:sz w:val="24"/>
+          <w:szCs w:val="24"/>
+        </w:rPr>
+        <w:t xml:space="preserve"> for all subjects </w:t>
+      </w:r>
+    </w:p>
+    <w:p>
+      <w:pPr>
+        <w:rPr>
+          <w:rFonts w:ascii="Cambria" w:hAnsi="Cambria"/>
+          <w:b/>
+          <w:color w:val="365F91"/>
+          <w:sz w:val="24"/>
+          <w:szCs w:val="24"/>
+        </w:rPr>
+      </w:pPr>
+      <w:r>
+        <w:rPr>
+          <w:rFonts w:ascii="Cambria" w:hAnsi="Cambria"/>
+          <w:b/>
+          <w:color w:val="365F91"/>
+          <w:sz w:val="24"/>
+          <w:szCs w:val="24"/>
+        </w:rPr>
+        <w:t xml:space="preserve"> </w:t>
+      </w:r>
+    </w:p>
+    <w:p>
+      <w:pPr>
+        <w:pStyle w:val="Heading1"/>
+      </w:pPr>
+      <w:bookmarkStart w:id="9" w:name="_Toc48676182"/>
+      <w:r>
+        <w:lastRenderedPageBreak/>
         <w:t>8</w:t>
       </w:r>
       <w:r>
-        <w:rPr>
-          <w:rFonts w:ascii="Cambria" w:hAnsi="Cambria"/>
-          <w:b/>
-          <w:color w:val="365F91"/>
-          <w:sz w:val="24"/>
-          <w:szCs w:val="24"/>
-        </w:rPr>
-        <w:t xml:space="preserve">. SEX CHECK </w:t>
-      </w:r>
-    </w:p>
-    <w:p>
-      <w:pPr>
-        <w:rPr>
-          <w:rFonts w:ascii="Cambria" w:hAnsi="Cambria"/>
-          <w:b/>
-          <w:sz w:val="24"/>
-          <w:szCs w:val="24"/>
-        </w:rPr>
-      </w:pPr>
-      <w:r>
-        <w:rPr>
-          <w:rFonts w:ascii="Cambria" w:hAnsi="Cambria"/>
-          <w:bCs/>
-          <w:sz w:val="24"/>
-          <w:szCs w:val="24"/>
-        </w:rPr>
-        <w:t xml:space="preserve">Sample Sex was calculated based on the ratio of mapped reads to </w:t>
-      </w:r>
-      <w:proofErr w:type="spellStart"/>
-      <w:r>
-        <w:rPr>
-          <w:rFonts w:ascii="Cambria" w:hAnsi="Cambria"/>
-          <w:bCs/>
-          <w:sz w:val="24"/>
-          <w:szCs w:val="24"/>
-        </w:rPr>
-        <w:t>ChrY</w:t>
-      </w:r>
-      <w:proofErr w:type="spellEnd"/>
-      <w:r>
-        <w:rPr>
-          <w:rFonts w:ascii="Cambria" w:hAnsi="Cambria"/>
-          <w:bCs/>
-          <w:sz w:val="24"/>
-          <w:szCs w:val="24"/>
-        </w:rPr>
-        <w:t xml:space="preserve"> and </w:t>
-      </w:r>
-      <w:proofErr w:type="spellStart"/>
-      <w:r>
-        <w:rPr>
-          <w:rFonts w:ascii="Cambria" w:hAnsi="Cambria"/>
-          <w:bCs/>
-          <w:sz w:val="24"/>
-          <w:szCs w:val="24"/>
-        </w:rPr>
-        <w:t>ChrX</w:t>
-      </w:r>
-      <w:proofErr w:type="spellEnd"/>
-      <w:r>
-        <w:rPr>
-          <w:rFonts w:ascii="Cambria" w:hAnsi="Cambria"/>
-          <w:bCs/>
-          <w:sz w:val="24"/>
-          <w:szCs w:val="24"/>
-        </w:rPr>
-        <w:t xml:space="preserve">.  Sex concordance was then checked between </w:t>
-      </w:r>
-      <w:proofErr w:type="spellStart"/>
-      <w:r>
-        <w:rPr>
-          <w:rFonts w:ascii="Cambria" w:hAnsi="Cambria"/>
-          <w:bCs/>
-          <w:sz w:val="24"/>
-          <w:szCs w:val="24"/>
-        </w:rPr>
-        <w:t>ChrY</w:t>
-      </w:r>
-      <w:proofErr w:type="spellEnd"/>
-      <w:r>
-        <w:rPr>
-          <w:rFonts w:ascii="Cambria" w:hAnsi="Cambria"/>
-          <w:bCs/>
-          <w:sz w:val="24"/>
-          <w:szCs w:val="24"/>
-        </w:rPr>
-        <w:t>/</w:t>
-      </w:r>
-      <w:proofErr w:type="spellStart"/>
-      <w:r>
-        <w:rPr>
-          <w:rFonts w:ascii="Cambria" w:hAnsi="Cambria"/>
-          <w:bCs/>
-          <w:sz w:val="24"/>
-          <w:szCs w:val="24"/>
-        </w:rPr>
-        <w:t>ChrX</w:t>
-      </w:r>
-      <w:proofErr w:type="spellEnd"/>
-      <w:r>
-        <w:rPr>
-          <w:rFonts w:ascii="Cambria" w:hAnsi="Cambria"/>
-          <w:bCs/>
-          <w:sz w:val="24"/>
-          <w:szCs w:val="24"/>
-        </w:rPr>
-        <w:t xml:space="preserve"> mapping ratio from sequence data and IDENTIFILER detected sex</w:t>
-      </w:r>
-      <w:bookmarkStart w:id="9" w:name="_Hlk48123768"/>
-      <w:r>
-        <w:rPr>
-          <w:rFonts w:ascii="Cambria" w:hAnsi="Cambria"/>
-          <w:bCs/>
-          <w:sz w:val="24"/>
-          <w:szCs w:val="24"/>
-        </w:rPr>
-        <w:t xml:space="preserve">. In Figure 8, </w:t>
-      </w:r>
-      <w:r>
-        <w:rPr>
-          <w:rFonts w:ascii="Cambria" w:hAnsi="Cambria"/>
-          <w:bCs/>
-          <w:sz w:val="24"/>
-          <w:szCs w:val="24"/>
-        </w:rPr>
-        <w:t>sex outliers are</w:t>
-      </w:r>
-      <w:r>
-        <w:rPr>
-          <w:rFonts w:ascii="Cambria" w:hAnsi="Cambria"/>
-          <w:bCs/>
-          <w:sz w:val="24"/>
-          <w:szCs w:val="24"/>
-        </w:rPr>
-        <w:t xml:space="preserve"> samples </w:t>
-      </w:r>
-      <w:r>
-        <w:rPr>
-          <w:rFonts w:ascii="Cambria" w:hAnsi="Cambria"/>
-          <w:bCs/>
-          <w:sz w:val="24"/>
-          <w:szCs w:val="24"/>
-        </w:rPr>
-        <w:lastRenderedPageBreak/>
-        <w:t xml:space="preserve">showed </w:t>
-      </w:r>
-      <w:proofErr w:type="spellStart"/>
-      <w:r>
-        <w:rPr>
-          <w:rFonts w:ascii="Cambria" w:hAnsi="Cambria"/>
-          <w:bCs/>
-          <w:sz w:val="24"/>
-          <w:szCs w:val="24"/>
-        </w:rPr>
-        <w:t>ChrY</w:t>
-      </w:r>
-      <w:proofErr w:type="spellEnd"/>
-      <w:r>
-        <w:rPr>
-          <w:rFonts w:ascii="Cambria" w:hAnsi="Cambria"/>
-          <w:bCs/>
-          <w:sz w:val="24"/>
-          <w:szCs w:val="24"/>
-        </w:rPr>
-        <w:t>/</w:t>
-      </w:r>
-      <w:proofErr w:type="spellStart"/>
-      <w:r>
-        <w:rPr>
-          <w:rFonts w:ascii="Cambria" w:hAnsi="Cambria"/>
-          <w:bCs/>
-          <w:sz w:val="24"/>
-          <w:szCs w:val="24"/>
-        </w:rPr>
-        <w:t>ChrX</w:t>
-      </w:r>
-      <w:proofErr w:type="spellEnd"/>
-      <w:r>
-        <w:rPr>
-          <w:rFonts w:ascii="Cambria" w:hAnsi="Cambria"/>
-          <w:bCs/>
-          <w:sz w:val="24"/>
-          <w:szCs w:val="24"/>
-        </w:rPr>
-        <w:t xml:space="preserve"> </w:t>
-      </w:r>
-      <w:r>
-        <w:rPr>
-          <w:rFonts w:ascii="Cambria" w:hAnsi="Cambria"/>
-          <w:bCs/>
-          <w:sz w:val="24"/>
-          <w:szCs w:val="24"/>
-        </w:rPr>
-        <w:t>ratios</w:t>
-      </w:r>
-      <w:r>
-        <w:rPr>
-          <w:rFonts w:ascii="Cambria" w:hAnsi="Cambria"/>
-          <w:bCs/>
-          <w:sz w:val="24"/>
-          <w:szCs w:val="24"/>
-        </w:rPr>
-        <w:t xml:space="preserve"> </w:t>
-      </w:r>
-      <w:r>
-        <w:rPr>
-          <w:rFonts w:ascii="Cambria" w:hAnsi="Cambria"/>
-          <w:bCs/>
-          <w:sz w:val="24"/>
-          <w:szCs w:val="24"/>
-        </w:rPr>
-        <w:t xml:space="preserve">lie outside the range of average ratio +/- standard deviation of </w:t>
-      </w:r>
-      <w:r>
-        <w:rPr>
-          <w:rFonts w:ascii="Cambria" w:hAnsi="Cambria"/>
-          <w:bCs/>
-          <w:sz w:val="24"/>
-          <w:szCs w:val="24"/>
-        </w:rPr>
-        <w:t>the opposite se</w:t>
-      </w:r>
-      <w:r>
-        <w:rPr>
-          <w:rFonts w:ascii="Cambria" w:hAnsi="Cambria"/>
-          <w:bCs/>
-          <w:sz w:val="24"/>
-          <w:szCs w:val="24"/>
-        </w:rPr>
-        <w:t>x.</w:t>
-      </w:r>
-    </w:p>
-    <w:bookmarkEnd w:id="9"/>
-    <w:p>
-      <w:pPr>
-        <w:rPr>
-          <w:rFonts w:ascii="Cambria" w:hAnsi="Cambria"/>
-          <w:b/>
-          <w:sz w:val="24"/>
-          <w:szCs w:val="24"/>
-        </w:rPr>
-      </w:pPr>
-      <w:r>
-        <w:rPr>
-          <w:rFonts w:ascii="Cambria" w:hAnsi="Cambria"/>
-          <w:b/>
-          <w:sz w:val="24"/>
-          <w:szCs w:val="24"/>
-        </w:rPr>
-        <w:t xml:space="preserve">Figure 8. </w:t>
-      </w:r>
-      <w:proofErr w:type="spellStart"/>
-      <w:r>
-        <w:rPr>
-          <w:rFonts w:ascii="Cambria" w:hAnsi="Cambria"/>
-          <w:b/>
-          <w:sz w:val="24"/>
-          <w:szCs w:val="24"/>
-        </w:rPr>
-        <w:t>ChrY</w:t>
-      </w:r>
-      <w:proofErr w:type="spellEnd"/>
-      <w:r>
-        <w:rPr>
-          <w:rFonts w:ascii="Cambria" w:hAnsi="Cambria"/>
-          <w:b/>
-          <w:sz w:val="24"/>
-          <w:szCs w:val="24"/>
-        </w:rPr>
-        <w:t>/</w:t>
-      </w:r>
-      <w:proofErr w:type="spellStart"/>
-      <w:r>
-        <w:rPr>
-          <w:rFonts w:ascii="Cambria" w:hAnsi="Cambria"/>
-          <w:b/>
-          <w:sz w:val="24"/>
-          <w:szCs w:val="24"/>
-        </w:rPr>
-        <w:t>ChrX</w:t>
-      </w:r>
-      <w:proofErr w:type="spellEnd"/>
-      <w:r>
-        <w:rPr>
-          <w:rFonts w:ascii="Cambria" w:hAnsi="Cambria"/>
-          <w:b/>
-          <w:sz w:val="24"/>
-          <w:szCs w:val="24"/>
-        </w:rPr>
-        <w:t xml:space="preserve"> reads ratio for all subjects </w:t>
-      </w:r>
-    </w:p>
-    <w:p>
-      <w:pPr>
-        <w:rPr>
-          <w:rFonts w:ascii="Cambria" w:hAnsi="Cambria"/>
-          <w:b/>
-          <w:color w:val="365F91"/>
-          <w:sz w:val="24"/>
-          <w:szCs w:val="24"/>
-        </w:rPr>
-      </w:pPr>
-      <w:r>
-        <w:rPr>
-          <w:rFonts w:ascii="Cambria" w:hAnsi="Cambria"/>
-          <w:b/>
-          <w:color w:val="365F91"/>
-          <w:sz w:val="24"/>
-          <w:szCs w:val="24"/>
-        </w:rPr>
-        <w:t xml:space="preserve"> </w:t>
-      </w:r>
-    </w:p>
-    <w:p>
-      <w:pPr>
-        <w:pStyle w:val="Heading1"/>
-      </w:pPr>
-      <w:bookmarkStart w:id="10" w:name="_Toc48676182"/>
-      <w:r>
-        <w:t>9</w:t>
-      </w:r>
-      <w:r>
         <w:t xml:space="preserve">. </w:t>
       </w:r>
       <w:r>
         <w:t>ANCESTRY CHECK</w:t>
       </w:r>
-      <w:bookmarkEnd w:id="10"/>
+      <w:bookmarkEnd w:id="9"/>
       <w:r>
         <w:t xml:space="preserve"> </w:t>
       </w:r>
@@ -3706,357 +3190,361 @@
           <w:sz w:val="24"/>
           <w:szCs w:val="24"/>
         </w:rPr>
-        <w:t>Figure 9. Laser ancestry estimation for all subjects</w:t>
-      </w:r>
-      <w:r>
-        <w:rPr>
-          <w:rFonts w:ascii="Cambria" w:hAnsi="Cambria"/>
-          <w:b/>
+        <w:t>Figure 9. Ancestry estimation for all subjects has not been found in the document</w:t>
+      </w:r>
+      <w:r>
+        <w:rPr>
+          <w:rFonts w:ascii="Cambria" w:hAnsi="Cambria"/>
+          <w:b/>
+          <w:sz w:val="24"/>
+          <w:szCs w:val="24"/>
+        </w:rPr>
+        <w:t xml:space="preserve">.  </w:t>
+      </w:r>
+    </w:p>
+    <w:p>
+      <w:pPr>
+        <w:rPr>
+          <w:rFonts w:ascii="Cambria" w:hAnsi="Cambria"/>
+          <w:bCs/>
+          <w:sz w:val="24"/>
+          <w:szCs w:val="24"/>
+        </w:rPr>
+      </w:pPr>
+      <w:r>
+        <w:rPr>
+          <w:rFonts w:ascii="Cambria" w:hAnsi="Cambria"/>
+          <w:bCs/>
+          <w:sz w:val="24"/>
+          <w:szCs w:val="24"/>
+        </w:rPr>
+        <w:t xml:space="preserve">For visualization of each disease group or controls, please refer to build directory: </w:t>
+      </w:r>
+    </w:p>
+    <w:p>
+      <w:pPr>
+        <w:rPr>
+          <w:rFonts w:ascii="Cambria" w:hAnsi="Cambria"/>
+          <w:b/>
+          <w:sz w:val="24"/>
+          <w:szCs w:val="24"/>
+        </w:rPr>
+      </w:pPr>
+      <w:r>
+        <w:rPr>
+          <w:rFonts w:ascii="Cambria" w:hAnsi="Cambria"/>
+          <w:b/>
+          <w:sz w:val="24"/>
+          <w:szCs w:val="24"/>
+        </w:rPr>
+        <w:t xml:space="preserve">LASER_DIR </w:t>
+      </w:r>
+    </w:p>
+    <w:p>
+      <w:pPr>
+        <w:rPr>
+          <w:rFonts w:ascii="Cambria" w:hAnsi="Cambria"/>
+          <w:b/>
+          <w:color w:val="365F91"/>
+          <w:sz w:val="24"/>
+          <w:szCs w:val="24"/>
+        </w:rPr>
+      </w:pPr>
+      <w:r>
+        <w:rPr>
+          <w:rFonts w:ascii="Cambria" w:hAnsi="Cambria"/>
+          <w:b/>
+          <w:color w:val="365F91"/>
           <w:sz w:val="24"/>
           <w:szCs w:val="24"/>
         </w:rPr>
         <w:t xml:space="preserve"> </w:t>
       </w:r>
-      <w:r>
-        <w:rPr>
-          <w:rFonts w:ascii="Cambria" w:hAnsi="Cambria"/>
-          <w:b/>
-          <w:sz w:val="24"/>
-          <w:szCs w:val="24"/>
-        </w:rPr>
-        <w:t>(top 2 plots showing reference only, bottom 2 plots showing study subjects, black pro</w:t>
-      </w:r>
-      <w:r>
-        <w:rPr>
-          <w:rFonts w:ascii="Cambria" w:hAnsi="Cambria"/>
-          <w:b/>
-          <w:sz w:val="24"/>
-          <w:szCs w:val="24"/>
-        </w:rPr>
-        <w:t xml:space="preserve">jected </w:t>
-      </w:r>
-      <w:r>
-        <w:rPr>
-          <w:rFonts w:ascii="Cambria" w:hAnsi="Cambria"/>
-          <w:b/>
-          <w:sz w:val="24"/>
-          <w:szCs w:val="24"/>
-        </w:rPr>
-        <w:t xml:space="preserve">to reference samples).  </w:t>
-      </w:r>
-    </w:p>
-    <w:p>
-      <w:pPr>
-        <w:rPr>
-          <w:rFonts w:ascii="Cambria" w:hAnsi="Cambria"/>
-          <w:bCs/>
-          <w:sz w:val="24"/>
-          <w:szCs w:val="24"/>
-        </w:rPr>
-      </w:pPr>
-      <w:r>
-        <w:rPr>
-          <w:rFonts w:ascii="Cambria" w:hAnsi="Cambria"/>
-          <w:bCs/>
-          <w:sz w:val="24"/>
-          <w:szCs w:val="24"/>
-        </w:rPr>
-        <w:t xml:space="preserve">For visualization of each disease group or controls, please refer to build directory: </w:t>
-      </w:r>
-    </w:p>
-    <w:p>
-      <w:pPr>
-        <w:rPr>
-          <w:rFonts w:ascii="Cambria" w:hAnsi="Cambria"/>
-          <w:b/>
-          <w:sz w:val="24"/>
-          <w:szCs w:val="24"/>
-        </w:rPr>
-      </w:pPr>
-      <w:r>
-        <w:rPr>
-          <w:rFonts w:ascii="Cambria" w:hAnsi="Cambria"/>
-          <w:b/>
-          <w:sz w:val="24"/>
-          <w:szCs w:val="24"/>
-        </w:rPr>
-        <w:t xml:space="preserve">LASER_DIR </w:t>
-      </w:r>
-    </w:p>
-    <w:p>
-      <w:pPr>
-        <w:rPr>
-          <w:rFonts w:ascii="Cambria" w:hAnsi="Cambria"/>
-          <w:b/>
-          <w:color w:val="365F91"/>
-          <w:sz w:val="24"/>
-          <w:szCs w:val="24"/>
-        </w:rPr>
-      </w:pPr>
-      <w:r>
-        <w:rPr>
-          <w:rFonts w:ascii="Cambria" w:hAnsi="Cambria"/>
-          <w:b/>
-          <w:color w:val="365F91"/>
-          <w:sz w:val="24"/>
-          <w:szCs w:val="24"/>
-        </w:rPr>
+    </w:p>
+    <w:p>
+      <w:pPr>
+        <w:pStyle w:val="Heading1"/>
+      </w:pPr>
+      <w:bookmarkStart w:id="10" w:name="_Toc48676183"/>
+      <w:r>
+        <w:t>9</w:t>
+      </w:r>
+      <w:r>
+        <w:t xml:space="preserve">. </w:t>
+      </w:r>
+      <w:r>
+        <w:t>POST-CALLING QC CHECK</w:t>
+      </w:r>
+      <w:bookmarkEnd w:id="10"/>
+      <w:r>
         <w:t xml:space="preserve"> </w:t>
       </w:r>
     </w:p>
     <w:p>
       <w:pPr>
+        <w:rPr>
+          <w:rFonts w:ascii="Cambria" w:hAnsi="Cambria"/>
+          <w:bCs/>
+          <w:sz w:val="24"/>
+          <w:szCs w:val="24"/>
+        </w:rPr>
+      </w:pPr>
+      <w:r>
+        <w:rPr>
+          <w:rFonts w:ascii="Cambria" w:hAnsi="Cambria"/>
+          <w:bCs/>
+          <w:sz w:val="24"/>
+          <w:szCs w:val="24"/>
+        </w:rPr>
+        <w:t xml:space="preserve">After Ensemble variant calling pipeline, we perform a standard post variant calling qc check on ensemble variants. Items checked include: </w:t>
+      </w:r>
+      <w:r>
+        <w:rPr>
+          <w:rFonts w:ascii="Cambria" w:hAnsi="Cambria"/>
+          <w:bCs/>
+          <w:sz w:val="24"/>
+          <w:szCs w:val="24"/>
+        </w:rPr>
+        <w:t xml:space="preserve">all </w:t>
+      </w:r>
+      <w:r>
+        <w:rPr>
+          <w:rFonts w:ascii="Cambria" w:hAnsi="Cambria"/>
+          <w:bCs/>
+          <w:sz w:val="24"/>
+          <w:szCs w:val="24"/>
+        </w:rPr>
+        <w:t xml:space="preserve">base change </w:t>
+      </w:r>
+      <w:r>
+        <w:rPr>
+          <w:rFonts w:ascii="Cambria" w:hAnsi="Cambria"/>
+          <w:bCs/>
+          <w:sz w:val="24"/>
+          <w:szCs w:val="24"/>
+        </w:rPr>
+        <w:t xml:space="preserve">and indel </w:t>
+      </w:r>
+      <w:r>
+        <w:rPr>
+          <w:rFonts w:ascii="Cambria" w:hAnsi="Cambria"/>
+          <w:bCs/>
+          <w:sz w:val="24"/>
+          <w:szCs w:val="24"/>
+        </w:rPr>
+        <w:t xml:space="preserve">counts </w:t>
+      </w:r>
+      <w:r>
+        <w:rPr>
+          <w:rFonts w:ascii="Cambria" w:hAnsi="Cambria"/>
+          <w:bCs/>
+          <w:sz w:val="24"/>
+          <w:szCs w:val="24"/>
+        </w:rPr>
+        <w:t>based on capture region and ensemble PASS flag filtered pair call results. PASS flag means.</w:t>
+      </w:r>
+    </w:p>
+    <w:p>
+      <w:pPr>
+        <w:rPr>
+          <w:rFonts w:ascii="Cambria" w:hAnsi="Cambria"/>
+          <w:b/>
+          <w:sz w:val="24"/>
+          <w:szCs w:val="24"/>
+        </w:rPr>
+      </w:pPr>
+    </w:p>
+    <w:p>
+      <w:pPr>
+        <w:rPr>
+          <w:rFonts w:ascii="Cambria" w:hAnsi="Cambria"/>
+          <w:b/>
+          <w:sz w:val="24"/>
+          <w:szCs w:val="24"/>
+        </w:rPr>
+      </w:pPr>
+      <w:r>
+        <w:rPr>
+          <w:rFonts w:ascii="Cambria" w:hAnsi="Cambria"/>
+          <w:b/>
+          <w:sz w:val="24"/>
+          <w:szCs w:val="24"/>
+        </w:rPr>
+        <w:t>Figure 10</w:t>
+      </w:r>
+      <w:r>
+        <w:rPr>
+          <w:rFonts w:ascii="Cambria" w:hAnsi="Cambria"/>
+          <w:b/>
+          <w:sz w:val="24"/>
+          <w:szCs w:val="24"/>
+        </w:rPr>
+        <w:t>a</w:t>
+      </w:r>
+      <w:r>
+        <w:rPr>
+          <w:rFonts w:ascii="Cambria" w:hAnsi="Cambria"/>
+          <w:b/>
+          <w:sz w:val="24"/>
+          <w:szCs w:val="24"/>
+        </w:rPr>
+        <w:t>.</w:t>
+      </w:r>
+      <w:r>
+        <w:rPr>
+          <w:rFonts w:ascii="Cambria" w:hAnsi="Cambria"/>
+          <w:b/>
+          <w:sz w:val="24"/>
+          <w:szCs w:val="24"/>
+        </w:rPr>
+        <w:t xml:space="preserve"> VAF distribution across all</w:t>
+      </w:r>
+      <w:r>
+        <w:rPr>
+          <w:rFonts w:ascii="Cambria" w:hAnsi="Cambria"/>
+          <w:b/>
+          <w:sz w:val="24"/>
+          <w:szCs w:val="24"/>
+        </w:rPr>
+        <w:t xml:space="preserve"> base </w:t>
+      </w:r>
+      <w:proofErr w:type="gramStart"/>
+      <w:r>
+        <w:rPr>
+          <w:rFonts w:ascii="Cambria" w:hAnsi="Cambria"/>
+          <w:b/>
+          <w:sz w:val="24"/>
+          <w:szCs w:val="24"/>
+        </w:rPr>
+        <w:t>change</w:t>
+      </w:r>
+      <w:r>
+        <w:rPr>
+          <w:rFonts w:ascii="Cambria" w:hAnsi="Cambria"/>
+          <w:b/>
+          <w:sz w:val="24"/>
+          <w:szCs w:val="24"/>
+        </w:rPr>
+        <w:t>s</w:t>
+      </w:r>
+      <w:proofErr w:type="gramEnd"/>
+      <w:r>
+        <w:rPr>
+          <w:rFonts w:ascii="Cambria" w:hAnsi="Cambria"/>
+          <w:b/>
+          <w:sz w:val="24"/>
+          <w:szCs w:val="24"/>
+        </w:rPr>
+        <w:t xml:space="preserve"> </w:t>
+      </w:r>
+    </w:p>
+    <w:p>
+      <w:pPr>
+        <w:rPr>
+          <w:rFonts w:ascii="Cambria" w:hAnsi="Cambria"/>
+          <w:b/>
+          <w:sz w:val="24"/>
+          <w:szCs w:val="24"/>
+        </w:rPr>
+      </w:pPr>
+      <w:r>
+        <w:rPr>
+          <w:rFonts w:ascii="Cambria" w:hAnsi="Cambria"/>
+          <w:b/>
+          <w:sz w:val="24"/>
+          <w:szCs w:val="24"/>
+        </w:rPr>
+        <w:t xml:space="preserve">   </w:t>
+      </w:r>
+    </w:p>
+    <w:p>
+      <w:pPr>
+        <w:rPr>
+          <w:rFonts w:ascii="Cambria" w:hAnsi="Cambria"/>
+          <w:b/>
+          <w:sz w:val="24"/>
+          <w:szCs w:val="24"/>
+        </w:rPr>
+      </w:pPr>
+      <w:r>
+        <w:rPr>
+          <w:rFonts w:ascii="Cambria" w:hAnsi="Cambria"/>
+          <w:b/>
+          <w:sz w:val="24"/>
+          <w:szCs w:val="24"/>
+        </w:rPr>
+        <w:t>Figure 10</w:t>
+      </w:r>
+      <w:r>
+        <w:rPr>
+          <w:rFonts w:ascii="Cambria" w:hAnsi="Cambria"/>
+          <w:b/>
+          <w:sz w:val="24"/>
+          <w:szCs w:val="24"/>
+        </w:rPr>
+        <w:t>b</w:t>
+      </w:r>
+      <w:r>
+        <w:rPr>
+          <w:rFonts w:ascii="Cambria" w:hAnsi="Cambria"/>
+          <w:b/>
+          <w:sz w:val="24"/>
+          <w:szCs w:val="24"/>
+        </w:rPr>
+        <w:t xml:space="preserve">. base change counts per disease </w:t>
+      </w:r>
+      <w:proofErr w:type="gramStart"/>
+      <w:r>
+        <w:rPr>
+          <w:rFonts w:ascii="Cambria" w:hAnsi="Cambria"/>
+          <w:b/>
+          <w:sz w:val="24"/>
+          <w:szCs w:val="24"/>
+        </w:rPr>
+        <w:t>group</w:t>
+      </w:r>
+      <w:proofErr w:type="gramEnd"/>
+      <w:r>
+        <w:rPr>
+          <w:rFonts w:ascii="Cambria" w:hAnsi="Cambria"/>
+          <w:b/>
+          <w:sz w:val="24"/>
+          <w:szCs w:val="24"/>
+        </w:rPr>
+        <w:t xml:space="preserve"> </w:t>
+      </w:r>
+    </w:p>
+    <w:p>
+      <w:pPr>
+        <w:rPr>
+          <w:rFonts w:ascii="Cambria" w:hAnsi="Cambria"/>
+          <w:b/>
+          <w:sz w:val="24"/>
+          <w:szCs w:val="24"/>
+        </w:rPr>
+      </w:pPr>
+    </w:p>
+    <w:p>
+      <w:pPr>
         <w:pStyle w:val="Heading1"/>
       </w:pPr>
-      <w:bookmarkStart w:id="11" w:name="_Toc48676183"/>
-      <w:r>
-        <w:t>10</w:t>
-      </w:r>
-      <w:r>
-        <w:t xml:space="preserve">. </w:t>
-      </w:r>
-      <w:r>
-        <w:t>POST-CALLING QC CHECK</w:t>
+      <w:bookmarkStart w:id="11" w:name="_Toc48676184"/>
+      <w:r>
+        <w:t>1</w:t>
+      </w:r>
+      <w:r>
+        <w:t>0</w:t>
+      </w:r>
+      <w:r>
+        <w:t>. BAM</w:t>
+      </w:r>
+      <w:r>
+        <w:t>-</w:t>
+      </w:r>
+      <w:r>
+        <w:t>MATCHER CHECK</w:t>
       </w:r>
       <w:bookmarkEnd w:id="11"/>
-      <w:r>
-        <w:t xml:space="preserve"> </w:t>
-      </w:r>
-    </w:p>
-    <w:p>
-      <w:pPr>
-        <w:rPr>
-          <w:rFonts w:ascii="Cambria" w:hAnsi="Cambria"/>
-          <w:bCs/>
-          <w:sz w:val="24"/>
-          <w:szCs w:val="24"/>
-        </w:rPr>
-      </w:pPr>
-      <w:r>
-        <w:rPr>
-          <w:rFonts w:ascii="Cambria" w:hAnsi="Cambria"/>
-          <w:bCs/>
-          <w:sz w:val="24"/>
-          <w:szCs w:val="24"/>
-        </w:rPr>
-        <w:t xml:space="preserve">After Ensemble variant calling pipeline, we perform a standard post variant calling qc check on ensemble variants. Items checked include: </w:t>
-      </w:r>
-      <w:r>
-        <w:rPr>
-          <w:rFonts w:ascii="Cambria" w:hAnsi="Cambria"/>
-          <w:bCs/>
-          <w:sz w:val="24"/>
-          <w:szCs w:val="24"/>
-        </w:rPr>
-        <w:t xml:space="preserve">all </w:t>
-      </w:r>
-      <w:r>
-        <w:rPr>
-          <w:rFonts w:ascii="Cambria" w:hAnsi="Cambria"/>
-          <w:bCs/>
-          <w:sz w:val="24"/>
-          <w:szCs w:val="24"/>
-        </w:rPr>
-        <w:t xml:space="preserve">base change </w:t>
-      </w:r>
-      <w:r>
-        <w:rPr>
-          <w:rFonts w:ascii="Cambria" w:hAnsi="Cambria"/>
-          <w:bCs/>
-          <w:sz w:val="24"/>
-          <w:szCs w:val="24"/>
-        </w:rPr>
-        <w:t xml:space="preserve">and indel </w:t>
-      </w:r>
-      <w:r>
-        <w:rPr>
-          <w:rFonts w:ascii="Cambria" w:hAnsi="Cambria"/>
-          <w:bCs/>
-          <w:sz w:val="24"/>
-          <w:szCs w:val="24"/>
-        </w:rPr>
-        <w:t xml:space="preserve">counts </w:t>
-      </w:r>
-      <w:r>
-        <w:rPr>
-          <w:rFonts w:ascii="Cambria" w:hAnsi="Cambria"/>
-          <w:bCs/>
-          <w:sz w:val="24"/>
-          <w:szCs w:val="24"/>
-        </w:rPr>
-        <w:t>based on capture region and ensemble PASS flag filtered pair call results. PASS flag means.</w:t>
-      </w:r>
-    </w:p>
-    <w:p>
-      <w:pPr>
-        <w:rPr>
-          <w:rFonts w:ascii="Cambria" w:hAnsi="Cambria"/>
-          <w:b/>
-          <w:sz w:val="24"/>
-          <w:szCs w:val="24"/>
-        </w:rPr>
-      </w:pPr>
-    </w:p>
-    <w:p>
-      <w:pPr>
-        <w:rPr>
-          <w:rFonts w:ascii="Cambria" w:hAnsi="Cambria"/>
-          <w:b/>
-          <w:sz w:val="24"/>
-          <w:szCs w:val="24"/>
-        </w:rPr>
-      </w:pPr>
-      <w:r>
-        <w:rPr>
-          <w:rFonts w:ascii="Cambria" w:hAnsi="Cambria"/>
-          <w:b/>
-          <w:sz w:val="24"/>
-          <w:szCs w:val="24"/>
-        </w:rPr>
-        <w:t>Figure 10</w:t>
-      </w:r>
-      <w:r>
-        <w:rPr>
-          <w:rFonts w:ascii="Cambria" w:hAnsi="Cambria"/>
-          <w:b/>
-          <w:sz w:val="24"/>
-          <w:szCs w:val="24"/>
-        </w:rPr>
-        <w:t>a</w:t>
-      </w:r>
-      <w:r>
-        <w:rPr>
-          <w:rFonts w:ascii="Cambria" w:hAnsi="Cambria"/>
-          <w:b/>
-          <w:sz w:val="24"/>
-          <w:szCs w:val="24"/>
-        </w:rPr>
-        <w:t>.</w:t>
-      </w:r>
-      <w:r>
-        <w:rPr>
-          <w:rFonts w:ascii="Cambria" w:hAnsi="Cambria"/>
-          <w:b/>
-          <w:sz w:val="24"/>
-          <w:szCs w:val="24"/>
-        </w:rPr>
-        <w:t xml:space="preserve"> VAF distribution across all</w:t>
-      </w:r>
-      <w:r>
-        <w:rPr>
-          <w:rFonts w:ascii="Cambria" w:hAnsi="Cambria"/>
-          <w:b/>
-          <w:sz w:val="24"/>
-          <w:szCs w:val="24"/>
-        </w:rPr>
-        <w:t xml:space="preserve"> base change</w:t>
-      </w:r>
-      <w:r>
-        <w:rPr>
-          <w:rFonts w:ascii="Cambria" w:hAnsi="Cambria"/>
-          <w:b/>
-          <w:sz w:val="24"/>
-          <w:szCs w:val="24"/>
-        </w:rPr>
-        <w:t>s</w:t>
-      </w:r>
-      <w:r>
-        <w:rPr>
-          <w:rFonts w:ascii="Cambria" w:hAnsi="Cambria"/>
-          <w:b/>
-          <w:sz w:val="24"/>
-          <w:szCs w:val="24"/>
-        </w:rPr>
-        <w:t xml:space="preserve"> </w:t>
-      </w:r>
-    </w:p>
-    <w:p>
-      <w:pPr>
-        <w:rPr>
-          <w:rFonts w:ascii="Cambria" w:hAnsi="Cambria"/>
-          <w:b/>
-          <w:sz w:val="24"/>
-          <w:szCs w:val="24"/>
-        </w:rPr>
-      </w:pPr>
-      <w:r>
-        <w:rPr>
-          <w:rFonts w:ascii="Cambria" w:hAnsi="Cambria"/>
-          <w:b/>
-          <w:sz w:val="24"/>
-          <w:szCs w:val="24"/>
-        </w:rPr>
-        <w:t xml:space="preserve">   </w:t>
-      </w:r>
-    </w:p>
-    <w:p>
-      <w:pPr>
-        <w:rPr>
-          <w:rFonts w:ascii="Cambria" w:hAnsi="Cambria"/>
-          <w:b/>
-          <w:sz w:val="24"/>
-          <w:szCs w:val="24"/>
-        </w:rPr>
-      </w:pPr>
-      <w:r>
-        <w:rPr>
-          <w:rFonts w:ascii="Cambria" w:hAnsi="Cambria"/>
-          <w:b/>
-          <w:sz w:val="24"/>
-          <w:szCs w:val="24"/>
-        </w:rPr>
-        <w:t>Figure 10</w:t>
-      </w:r>
-      <w:r>
-        <w:rPr>
-          <w:rFonts w:ascii="Cambria" w:hAnsi="Cambria"/>
-          <w:b/>
-          <w:sz w:val="24"/>
-          <w:szCs w:val="24"/>
-        </w:rPr>
-        <w:t>b</w:t>
-      </w:r>
-      <w:r>
-        <w:rPr>
-          <w:rFonts w:ascii="Cambria" w:hAnsi="Cambria"/>
-          <w:b/>
-          <w:sz w:val="24"/>
-          <w:szCs w:val="24"/>
-        </w:rPr>
-        <w:t xml:space="preserve">. base change counts per disease group </w:t>
-      </w:r>
-    </w:p>
-    <w:p>
-      <w:pPr>
-        <w:rPr>
-          <w:rFonts w:ascii="Cambria" w:hAnsi="Cambria"/>
-          <w:b/>
-          <w:sz w:val="24"/>
-          <w:szCs w:val="24"/>
-        </w:rPr>
-      </w:pPr>
-    </w:p>
-    <w:p>
-      <w:pPr>
-        <w:pStyle w:val="Heading1"/>
-      </w:pPr>
-      <w:bookmarkStart w:id="12" w:name="_Toc48676184"/>
-      <w:r>
-        <w:t>1</w:t>
-      </w:r>
-      <w:r>
-        <w:t>1</w:t>
-      </w:r>
-      <w:r>
-        <w:t>. BAM</w:t>
-      </w:r>
-      <w:r>
-        <w:t>-</w:t>
-      </w:r>
-      <w:r>
-        <w:t>MATCHER CHECK</w:t>
-      </w:r>
-      <w:bookmarkEnd w:id="12"/>
     </w:p>
     <w:p>
       <w:pPr>
@@ -4136,17 +3624,7 @@
           <w:sz w:val="24"/>
           <w:szCs w:val="24"/>
         </w:rPr>
-        <w:t xml:space="preserve">Matching </w:t>
-      </w:r>
-      <w:r>
-        <w:rPr>
-          <w:rFonts w:ascii="Cambria" w:hAnsi="Cambria"/>
-          <w:bCs/>
-          <w:sz w:val="24"/>
-          <w:szCs w:val="24"/>
-        </w:rPr>
-        <w:lastRenderedPageBreak/>
-        <w:t>samples</w:t>
+        <w:t>Matching samples</w:t>
       </w:r>
       <w:r>
         <w:rPr>
@@ -4221,11 +3699,11 @@
       <w:pPr>
         <w:pStyle w:val="Heading1"/>
       </w:pPr>
-      <w:bookmarkStart w:id="13" w:name="_Toc48676185"/>
+      <w:bookmarkStart w:id="12" w:name="_Toc48676185"/>
       <w:r>
         <w:t>References</w:t>
       </w:r>
-      <w:bookmarkEnd w:id="13"/>
+      <w:bookmarkEnd w:id="12"/>
     </w:p>
     <w:p>
       <w:pPr>
@@ -4526,7 +4004,19 @@
           <w:sz w:val="24"/>
           <w:szCs w:val="24"/>
         </w:rPr>
-        <w:t>2699–2701, https://doi.org/10.1093/bioinformatics/btw239</w:t>
+        <w:t>2699–2701, http</w:t>
+      </w:r>
+      <w:r>
+        <w:t xml:space="preserve"> </w:t>
+      </w:r>
+      <w:r>
+        <w:rPr>
+          <w:rFonts w:ascii="Cambria" w:hAnsi="Cambria"/>
+          <w:bCs/>
+          <w:sz w:val="24"/>
+          <w:szCs w:val="24"/>
+        </w:rPr>
+        <w:t>s://doi.org/10.1093/bioinformatics/btw239</w:t>
       </w:r>
       <w:r>
         <w:rPr>
@@ -5674,34 +5164,34 @@
       </w:pPr>
     </w:lvl>
   </w:abstractNum>
-  <w:num w:numId="1" w16cid:durableId="546067859">
+  <w:num w:numId="1" w16cid:durableId="701437715">
     <w:abstractNumId w:val="3"/>
   </w:num>
-  <w:num w:numId="2" w16cid:durableId="468673484">
+  <w:num w:numId="2" w16cid:durableId="23409299">
     <w:abstractNumId w:val="2"/>
   </w:num>
-  <w:num w:numId="3" w16cid:durableId="387799246">
+  <w:num w:numId="3" w16cid:durableId="1921597799">
     <w:abstractNumId w:val="5"/>
   </w:num>
-  <w:num w:numId="4" w16cid:durableId="2076395544">
+  <w:num w:numId="4" w16cid:durableId="2124809672">
     <w:abstractNumId w:val="6"/>
   </w:num>
-  <w:num w:numId="5" w16cid:durableId="1568684975">
+  <w:num w:numId="5" w16cid:durableId="1693456429">
     <w:abstractNumId w:val="0"/>
   </w:num>
-  <w:num w:numId="6" w16cid:durableId="424108417">
+  <w:num w:numId="6" w16cid:durableId="662899791">
     <w:abstractNumId w:val="9"/>
   </w:num>
-  <w:num w:numId="7" w16cid:durableId="817258460">
+  <w:num w:numId="7" w16cid:durableId="807288116">
     <w:abstractNumId w:val="7"/>
   </w:num>
-  <w:num w:numId="8" w16cid:durableId="2086799101">
+  <w:num w:numId="8" w16cid:durableId="1245188574">
     <w:abstractNumId w:val="4"/>
   </w:num>
-  <w:num w:numId="9" w16cid:durableId="1340305159">
+  <w:num w:numId="9" w16cid:durableId="1344475345">
     <w:abstractNumId w:val="8"/>
   </w:num>
-  <w:num w:numId="10" w16cid:durableId="2137484299">
+  <w:num w:numId="10" w16cid:durableId="71776032">
     <w:abstractNumId w:val="1"/>
   </w:num>
 </w:numbering>

</xml_diff>

<commit_message>
changes made 1,Exome qc coverage report no downsample; 2,laser ancestry description to fastngsadmix; 3,post calling qc variant count total and add a link and snp total column; 4,3d plot add legend3d plot add legend; 5, fix R png error due to version upgrade
</commit_message>
<xml_diff>
--- a/ExomeQcPipeline_Somatic_Template_interim.docx
+++ b/ExomeQcPipeline_Somatic_Template_interim.docx
@@ -1,6 +1,6 @@
 
 <file path=word/document.xml><?xml version="1.0" encoding="utf-8"?>
-<w:document xmlns:wpc="http://schemas.microsoft.com/office/word/2010/wordprocessingCanvas" xmlns:cx="http://schemas.microsoft.com/office/drawing/2014/chartex" xmlns:cx1="http://schemas.microsoft.com/office/drawing/2015/9/8/chartex" xmlns:cx2="http://schemas.microsoft.com/office/drawing/2015/10/21/chartex" xmlns:cx3="http://schemas.microsoft.com/office/drawing/2016/5/9/chartex" xmlns:cx4="http://schemas.microsoft.com/office/drawing/2016/5/10/chartex" xmlns:cx5="http://schemas.microsoft.com/office/drawing/2016/5/11/chartex" xmlns:cx6="http://schemas.microsoft.com/office/drawing/2016/5/12/chartex" xmlns:cx7="http://schemas.microsoft.com/office/drawing/2016/5/13/chartex" xmlns:cx8="http://schemas.microsoft.com/office/drawing/2016/5/14/chartex" xmlns:mc="http://schemas.openxmlformats.org/markup-compatibility/2006" xmlns:aink="http://schemas.microsoft.com/office/drawing/2016/ink" xmlns:am3d="http://schemas.microsoft.com/office/drawing/2017/model3d" xmlns:o="urn:schemas-microsoft-com:office:office" xmlns:oel="http://schemas.microsoft.com/office/2019/extlst" xmlns:r="http://schemas.openxmlformats.org/officeDocument/2006/relationships" xmlns:m="http://schemas.openxmlformats.org/officeDocument/2006/math" xmlns:v="urn:schemas-microsoft-com:vml" xmlns:wp14="http://schemas.microsoft.com/office/word/2010/wordprocessingDrawing" xmlns:wp="http://schemas.openxmlformats.org/drawingml/2006/wordprocessingDrawing" xmlns:w10="urn:schemas-microsoft-com:office:word" xmlns:w="http://schemas.openxmlformats.org/wordprocessingml/2006/main" xmlns:w14="http://schemas.microsoft.com/office/word/2010/wordml" xmlns:w15="http://schemas.microsoft.com/office/word/2012/wordml" xmlns:w16cex="http://schemas.microsoft.com/office/word/2018/wordml/cex" xmlns:w16cid="http://schemas.microsoft.com/office/word/2016/wordml/cid" xmlns:w16="http://schemas.microsoft.com/office/word/2018/wordml" xmlns:w16sdtdh="http://schemas.microsoft.com/office/word/2020/wordml/sdtdatahash" xmlns:w16se="http://schemas.microsoft.com/office/word/2015/wordml/symex" xmlns:wpg="http://schemas.microsoft.com/office/word/2010/wordprocessingGroup" xmlns:wpi="http://schemas.microsoft.com/office/word/2010/wordprocessingInk" xmlns:wne="http://schemas.microsoft.com/office/word/2006/wordml" xmlns:wps="http://schemas.microsoft.com/office/word/2010/wordprocessingShape" mc:Ignorable="w14 w15 w16se w16cid w16 w16cex w16sdtdh wp14">
+<w:document xmlns:wpc="http://schemas.microsoft.com/office/word/2010/wordprocessingCanvas" xmlns:cx="http://schemas.microsoft.com/office/drawing/2014/chartex" xmlns:cx1="http://schemas.microsoft.com/office/drawing/2015/9/8/chartex" xmlns:cx2="http://schemas.microsoft.com/office/drawing/2015/10/21/chartex" xmlns:cx3="http://schemas.microsoft.com/office/drawing/2016/5/9/chartex" xmlns:cx4="http://schemas.microsoft.com/office/drawing/2016/5/10/chartex" xmlns:cx5="http://schemas.microsoft.com/office/drawing/2016/5/11/chartex" xmlns:cx6="http://schemas.microsoft.com/office/drawing/2016/5/12/chartex" xmlns:cx7="http://schemas.microsoft.com/office/drawing/2016/5/13/chartex" xmlns:cx8="http://schemas.microsoft.com/office/drawing/2016/5/14/chartex" xmlns:mc="http://schemas.openxmlformats.org/markup-compatibility/2006" xmlns:aink="http://schemas.microsoft.com/office/drawing/2016/ink" xmlns:am3d="http://schemas.microsoft.com/office/drawing/2017/model3d" xmlns:o="urn:schemas-microsoft-com:office:office" xmlns:oel="http://schemas.microsoft.com/office/2019/extlst" xmlns:r="http://schemas.openxmlformats.org/officeDocument/2006/relationships" xmlns:m="http://schemas.openxmlformats.org/officeDocument/2006/math" xmlns:v="urn:schemas-microsoft-com:vml" xmlns:wp14="http://schemas.microsoft.com/office/word/2010/wordprocessingDrawing" xmlns:wp="http://schemas.openxmlformats.org/drawingml/2006/wordprocessingDrawing" xmlns:w10="urn:schemas-microsoft-com:office:word" xmlns:w="http://schemas.openxmlformats.org/wordprocessingml/2006/main" xmlns:w14="http://schemas.microsoft.com/office/word/2010/wordml" xmlns:w15="http://schemas.microsoft.com/office/word/2012/wordml" xmlns:w16cex="http://schemas.microsoft.com/office/word/2018/wordml/cex" xmlns:w16cid="http://schemas.microsoft.com/office/word/2016/wordml/cid" xmlns:w16="http://schemas.microsoft.com/office/word/2018/wordml" xmlns:w16du="http://schemas.microsoft.com/office/word/2023/wordml/word16du" xmlns:w16sdtdh="http://schemas.microsoft.com/office/word/2020/wordml/sdtdatahash" xmlns:w16se="http://schemas.microsoft.com/office/word/2015/wordml/symex" xmlns:wpg="http://schemas.microsoft.com/office/word/2010/wordprocessingGroup" xmlns:wpi="http://schemas.microsoft.com/office/word/2010/wordprocessingInk" xmlns:wne="http://schemas.microsoft.com/office/word/2006/wordml" xmlns:wps="http://schemas.microsoft.com/office/word/2010/wordprocessingShape" mc:Ignorable="w14 w15 w16se w16cid w16 w16cex w16sdtdh w16du wp14">
   <w:body>
     <w:p>
       <w:pPr>
@@ -1248,19 +1248,8 @@
           <w:sz w:val="24"/>
           <w:szCs w:val="24"/>
         </w:rPr>
-        <w:t xml:space="preserve">Figure 2. sorted contamination rate by </w:t>
-      </w:r>
-      <w:proofErr w:type="gramStart"/>
-      <w:r>
-        <w:rPr>
-          <w:rFonts w:ascii="Cambria" w:hAnsi="Cambria"/>
-          <w:b/>
-          <w:sz w:val="24"/>
-          <w:szCs w:val="24"/>
-        </w:rPr>
-        <w:t>subjects</w:t>
-      </w:r>
-      <w:proofErr w:type="gramEnd"/>
+        <w:t>Figure 2. sorted contamination rate by subjects</w:t>
+      </w:r>
     </w:p>
     <w:p>
       <w:pPr>
@@ -1519,23 +1508,24 @@
           <w:sz w:val="24"/>
           <w:szCs w:val="24"/>
         </w:rPr>
-        <w:t xml:space="preserve">Figure 3. coverage scatter plot for all exome samples, with cases and controls </w:t>
-      </w:r>
-      <w:proofErr w:type="gramStart"/>
-      <w:r>
-        <w:rPr>
-          <w:rFonts w:ascii="Cambria" w:hAnsi="Cambria"/>
-          <w:b/>
-          <w:sz w:val="24"/>
-          <w:szCs w:val="24"/>
-        </w:rPr>
-        <w:t>separated</w:t>
-      </w:r>
-      <w:proofErr w:type="gramEnd"/>
-      <w:r>
-        <w:rPr>
-          <w:rFonts w:ascii="Cambria" w:hAnsi="Cambria"/>
-          <w:b/>
+        <w:t xml:space="preserve">Figure 3. coverage scatter plot for all exome samples, with cases and controls separated </w:t>
+      </w:r>
+    </w:p>
+    <w:p>
+      <w:pPr>
+        <w:rPr>
+          <w:rFonts w:ascii="Cambria" w:hAnsi="Cambria"/>
+          <w:b/>
+          <w:color w:val="365F91"/>
+          <w:sz w:val="24"/>
+          <w:szCs w:val="24"/>
+        </w:rPr>
+      </w:pPr>
+      <w:r>
+        <w:rPr>
+          <w:rFonts w:ascii="Cambria" w:hAnsi="Cambria"/>
+          <w:b/>
+          <w:color w:val="365F91"/>
           <w:sz w:val="24"/>
           <w:szCs w:val="24"/>
         </w:rPr>
@@ -1560,6 +1550,25 @@
           <w:sz w:val="24"/>
           <w:szCs w:val="24"/>
         </w:rPr>
+        <w:t xml:space="preserve">  </w:t>
+      </w:r>
+    </w:p>
+    <w:p>
+      <w:pPr>
+        <w:pStyle w:val="Heading1"/>
+      </w:pPr>
+      <w:bookmarkStart w:id="6" w:name="_Toc48676181"/>
+      <w:r>
+        <w:t>6</w:t>
+      </w:r>
+      <w:r>
+        <w:t xml:space="preserve">. </w:t>
+      </w:r>
+      <w:r>
+        <w:t>PRE-CALLING QC CHECK</w:t>
+      </w:r>
+      <w:bookmarkEnd w:id="6"/>
+      <w:r>
         <w:t xml:space="preserve"> </w:t>
       </w:r>
     </w:p>
@@ -1567,46 +1576,6 @@
       <w:pPr>
         <w:rPr>
           <w:rFonts w:ascii="Cambria" w:hAnsi="Cambria"/>
-          <w:b/>
-          <w:color w:val="365F91"/>
-          <w:sz w:val="24"/>
-          <w:szCs w:val="24"/>
-        </w:rPr>
-      </w:pPr>
-      <w:r>
-        <w:rPr>
-          <w:rFonts w:ascii="Cambria" w:hAnsi="Cambria"/>
-          <w:b/>
-          <w:color w:val="365F91"/>
-          <w:sz w:val="24"/>
-          <w:szCs w:val="24"/>
-        </w:rPr>
-        <w:t xml:space="preserve">  </w:t>
-      </w:r>
-    </w:p>
-    <w:p>
-      <w:pPr>
-        <w:pStyle w:val="Heading1"/>
-      </w:pPr>
-      <w:bookmarkStart w:id="6" w:name="_Toc48676181"/>
-      <w:r>
-        <w:t>6</w:t>
-      </w:r>
-      <w:r>
-        <w:t xml:space="preserve">. </w:t>
-      </w:r>
-      <w:r>
-        <w:t>PRE-CALLING QC CHECK</w:t>
-      </w:r>
-      <w:bookmarkEnd w:id="6"/>
-      <w:r>
-        <w:t xml:space="preserve"> </w:t>
-      </w:r>
-    </w:p>
-    <w:p>
-      <w:pPr>
-        <w:rPr>
-          <w:rFonts w:ascii="Cambria" w:hAnsi="Cambria"/>
           <w:bCs/>
           <w:sz w:val="24"/>
           <w:szCs w:val="24"/>
@@ -1622,7 +1591,6 @@
         <w:t xml:space="preserve">From the subject level pre-calling qc report, we collect fold 80 base penalty from </w:t>
       </w:r>
       <w:proofErr w:type="spellStart"/>
-      <w:proofErr w:type="gramStart"/>
       <w:r>
         <w:rPr>
           <w:rFonts w:ascii="Cambria" w:hAnsi="Cambria"/>
@@ -1633,7 +1601,6 @@
         <w:t>picard</w:t>
       </w:r>
       <w:proofErr w:type="spellEnd"/>
-      <w:proofErr w:type="gramEnd"/>
       <w:r>
         <w:rPr>
           <w:rFonts w:ascii="Cambria" w:hAnsi="Cambria"/>
@@ -2160,7 +2127,7 @@
           <w:sz w:val="24"/>
           <w:szCs w:val="24"/>
         </w:rPr>
-        <w:t xml:space="preserve"> examines two sources of sequencing errors associated with hybridization selection protocols. These errors are divided into two broad categories, pre-</w:t>
+        <w:t xml:space="preserve"> examines two sources of sequencing errors associated with hybridization selection protocols. These errors are divided into two broad categories, pre-adapter and bait-bias. Pre-adapter errors can arise from laboratory manipulations of a sample damaged before library prep/adapter ligation (examples include sample degradation, or fixative treatments such as formalin in FFPE samples).   Bait-bias artifacts occur during or after the target selection step, and correlate with substitution rates that are 'biased', or higher for sites having one </w:t>
       </w:r>
       <w:proofErr w:type="gramStart"/>
       <w:r>
@@ -2170,7 +2137,7 @@
           <w:sz w:val="24"/>
           <w:szCs w:val="24"/>
         </w:rPr>
-        <w:t>adapter</w:t>
+        <w:t>base</w:t>
       </w:r>
       <w:proofErr w:type="gramEnd"/>
       <w:r>
@@ -2180,26 +2147,6 @@
           <w:sz w:val="24"/>
           <w:szCs w:val="24"/>
         </w:rPr>
-        <w:t xml:space="preserve"> and bait-bias. Pre-adapter errors can arise from laboratory manipulations of a sample damaged before library prep/adapter ligation (examples include sample degradation, or fixative treatments such as formalin in FFPE samples).   Bait-bias artifacts occur during or after the target selection step, and correlate with substitution rates that are 'biased', or higher for sites having one </w:t>
-      </w:r>
-      <w:proofErr w:type="gramStart"/>
-      <w:r>
-        <w:rPr>
-          <w:rFonts w:ascii="Cambria" w:hAnsi="Cambria"/>
-          <w:bCs/>
-          <w:sz w:val="24"/>
-          <w:szCs w:val="24"/>
-        </w:rPr>
-        <w:t>base</w:t>
-      </w:r>
-      <w:proofErr w:type="gramEnd"/>
-      <w:r>
-        <w:rPr>
-          <w:rFonts w:ascii="Cambria" w:hAnsi="Cambria"/>
-          <w:bCs/>
-          <w:sz w:val="24"/>
-          <w:szCs w:val="24"/>
-        </w:rPr>
         <w:t xml:space="preserve"> on the reference/positive strand relative to sites having the complementary base on that strand. Most previous problematic samples have </w:t>
       </w:r>
       <w:proofErr w:type="spellStart"/>
@@ -2395,19 +2342,8 @@
           <w:sz w:val="24"/>
           <w:szCs w:val="24"/>
         </w:rPr>
-        <w:t xml:space="preserve"> for all Fold 80 base penalty for </w:t>
-      </w:r>
-      <w:proofErr w:type="gramStart"/>
-      <w:r>
-        <w:rPr>
-          <w:rFonts w:ascii="Cambria" w:hAnsi="Cambria"/>
-          <w:b/>
-          <w:sz w:val="24"/>
-          <w:szCs w:val="24"/>
-        </w:rPr>
-        <w:t>samples</w:t>
-      </w:r>
-      <w:proofErr w:type="gramEnd"/>
+        <w:t xml:space="preserve"> for all Fold 80 base penalty for samples</w:t>
+      </w:r>
     </w:p>
     <w:bookmarkEnd w:id="7"/>
     <w:p>
@@ -2426,19 +2362,8 @@
           <w:sz w:val="24"/>
           <w:szCs w:val="24"/>
         </w:rPr>
-        <w:t xml:space="preserve">Figure 5b. boxplot for median and mean insert </w:t>
-      </w:r>
-      <w:proofErr w:type="gramStart"/>
-      <w:r>
-        <w:rPr>
-          <w:rFonts w:ascii="Cambria" w:hAnsi="Cambria"/>
-          <w:b/>
-          <w:sz w:val="24"/>
-          <w:szCs w:val="24"/>
-        </w:rPr>
-        <w:t>sizes</w:t>
-      </w:r>
-      <w:proofErr w:type="gramEnd"/>
+        <w:t>Figure 5b. boxplot for median and mean insert sizes</w:t>
+      </w:r>
       <w:r>
         <w:rPr>
           <w:rFonts w:ascii="Cambria" w:hAnsi="Cambria"/>
@@ -2971,14 +2896,35 @@
           <w:szCs w:val="24"/>
         </w:rPr>
       </w:pPr>
-      <w:r>
-        <w:rPr>
-          <w:rFonts w:ascii="Cambria" w:hAnsi="Cambria"/>
-          <w:bCs/>
-          <w:sz w:val="24"/>
-          <w:szCs w:val="24"/>
-        </w:rPr>
-        <w:t>LASER too</w:t>
+      <w:bookmarkStart w:id="10" w:name="_Hlk178097706"/>
+      <w:proofErr w:type="spellStart"/>
+      <w:r>
+        <w:rPr>
+          <w:rFonts w:ascii="Cambria" w:hAnsi="Cambria"/>
+          <w:bCs/>
+          <w:sz w:val="24"/>
+          <w:szCs w:val="24"/>
+        </w:rPr>
+        <w:t>fastNGSadmix</w:t>
+      </w:r>
+      <w:proofErr w:type="spellEnd"/>
+      <w:r>
+        <w:rPr>
+          <w:rFonts w:ascii="Cambria" w:hAnsi="Cambria"/>
+          <w:bCs/>
+          <w:sz w:val="24"/>
+          <w:szCs w:val="24"/>
+        </w:rPr>
+        <w:t xml:space="preserve"> </w:t>
+      </w:r>
+      <w:r>
+        <w:rPr>
+          <w:rFonts w:ascii="Cambria" w:hAnsi="Cambria"/>
+          <w:bCs/>
+          <w:sz w:val="24"/>
+          <w:szCs w:val="24"/>
+        </w:rPr>
+        <w:t>too</w:t>
       </w:r>
       <w:r>
         <w:rPr>
@@ -3153,8 +3099,19 @@
           <w:sz w:val="24"/>
           <w:szCs w:val="24"/>
         </w:rPr>
-        <w:t>is used here to estimate individual ancestry by shotgun sequence reads without calling genotypes. LASER uses principal components analysis (PCA) and Procrustes analysis to analyze sequence reads of each sample and place the sample into a reference PCA space constructed using genotypes of a set of reference individuals. Here HGDP</w:t>
-      </w:r>
+        <w:t xml:space="preserve">is used here to estimate individual ancestry by shotgun sequence reads without calling genotypes. </w:t>
+      </w:r>
+      <w:proofErr w:type="spellStart"/>
+      <w:r>
+        <w:rPr>
+          <w:rFonts w:ascii="Cambria" w:hAnsi="Cambria"/>
+          <w:bCs/>
+          <w:sz w:val="24"/>
+          <w:szCs w:val="24"/>
+        </w:rPr>
+        <w:t>fastNGSadmix</w:t>
+      </w:r>
+      <w:proofErr w:type="spellEnd"/>
       <w:r>
         <w:rPr>
           <w:rFonts w:ascii="Cambria" w:hAnsi="Cambria"/>
@@ -3171,26 +3128,99 @@
           <w:sz w:val="24"/>
           <w:szCs w:val="24"/>
         </w:rPr>
-        <w:t>(Human Genome Diversity Project) data, including 632,958 autosomal SNPs loci for 938 unrelated individuals is used as reference panel.</w:t>
-      </w:r>
-    </w:p>
-    <w:p>
-      <w:pPr>
-        <w:rPr>
-          <w:rFonts w:ascii="Cambria" w:hAnsi="Cambria"/>
-          <w:b/>
-          <w:sz w:val="24"/>
-          <w:szCs w:val="24"/>
-        </w:rPr>
-      </w:pPr>
-      <w:r>
-        <w:rPr>
-          <w:rFonts w:ascii="Cambria" w:hAnsi="Cambria"/>
-          <w:b/>
-          <w:sz w:val="24"/>
-          <w:szCs w:val="24"/>
-        </w:rPr>
-        <w:t>Figure 9. Ancestry estimation for all subjects has not been found in the document</w:t>
+        <w:t xml:space="preserve">uses principal components analysis (PCA) and Procrustes analysis to analyze sequence reads of each sample and place the sample into a reference PCA space constructed using genotypes of a set of reference individuals. Here </w:t>
+      </w:r>
+      <w:r>
+        <w:rPr>
+          <w:rFonts w:ascii="Cambria" w:hAnsi="Cambria"/>
+          <w:bCs/>
+          <w:sz w:val="24"/>
+          <w:szCs w:val="24"/>
+        </w:rPr>
+        <w:t>1KG</w:t>
+      </w:r>
+      <w:r>
+        <w:rPr>
+          <w:rFonts w:ascii="Cambria" w:hAnsi="Cambria"/>
+          <w:bCs/>
+          <w:sz w:val="24"/>
+          <w:szCs w:val="24"/>
+        </w:rPr>
+        <w:t xml:space="preserve"> </w:t>
+      </w:r>
+      <w:r>
+        <w:rPr>
+          <w:rFonts w:ascii="Cambria" w:hAnsi="Cambria"/>
+          <w:bCs/>
+          <w:sz w:val="24"/>
+          <w:szCs w:val="24"/>
+        </w:rPr>
+        <w:t>(</w:t>
+      </w:r>
+      <w:r>
+        <w:rPr>
+          <w:rFonts w:ascii="Cambria" w:hAnsi="Cambria"/>
+          <w:bCs/>
+          <w:sz w:val="24"/>
+          <w:szCs w:val="24"/>
+        </w:rPr>
+        <w:t>One Thousand Genome Pr</w:t>
+      </w:r>
+      <w:r>
+        <w:rPr>
+          <w:rFonts w:ascii="Cambria" w:hAnsi="Cambria"/>
+          <w:bCs/>
+          <w:sz w:val="24"/>
+          <w:szCs w:val="24"/>
+        </w:rPr>
+        <w:t>oject) data is used as reference panel</w:t>
+      </w:r>
+      <w:bookmarkEnd w:id="10"/>
+      <w:r>
+        <w:rPr>
+          <w:rFonts w:ascii="Cambria" w:hAnsi="Cambria"/>
+          <w:bCs/>
+          <w:sz w:val="24"/>
+          <w:szCs w:val="24"/>
+        </w:rPr>
+        <w:t>.</w:t>
+      </w:r>
+    </w:p>
+    <w:p>
+      <w:pPr>
+        <w:rPr>
+          <w:rFonts w:ascii="Cambria" w:hAnsi="Cambria"/>
+          <w:b/>
+          <w:sz w:val="24"/>
+          <w:szCs w:val="24"/>
+        </w:rPr>
+      </w:pPr>
+      <w:r>
+        <w:rPr>
+          <w:rFonts w:ascii="Cambria" w:hAnsi="Cambria"/>
+          <w:b/>
+          <w:sz w:val="24"/>
+          <w:szCs w:val="24"/>
+        </w:rPr>
+        <w:t xml:space="preserve">Figure 9. </w:t>
+      </w:r>
+      <w:r>
+        <w:rPr>
+          <w:rFonts w:ascii="Cambria" w:hAnsi="Cambria"/>
+          <w:b/>
+          <w:sz w:val="24"/>
+          <w:szCs w:val="24"/>
+        </w:rPr>
+        <w:t>E</w:t>
+      </w:r>
+      <w:r>
+        <w:rPr>
+          <w:rFonts w:ascii="Cambria" w:hAnsi="Cambria"/>
+          <w:b/>
+          <w:sz w:val="24"/>
+          <w:szCs w:val="24"/>
+        </w:rPr>
+        <w:t>stimation for all subjects has not been found in the document</w:t>
       </w:r>
       <w:r>
         <w:rPr>
@@ -3265,7 +3295,7 @@
       <w:pPr>
         <w:pStyle w:val="Heading1"/>
       </w:pPr>
-      <w:bookmarkStart w:id="10" w:name="_Toc48676183"/>
+      <w:bookmarkStart w:id="11" w:name="_Toc48676183"/>
       <w:r>
         <w:t>9</w:t>
       </w:r>
@@ -3275,7 +3305,7 @@
       <w:r>
         <w:t>POST-CALLING QC CHECK</w:t>
       </w:r>
-      <w:bookmarkEnd w:id="10"/>
+      <w:bookmarkEnd w:id="11"/>
       <w:r>
         <w:t xml:space="preserve"> </w:t>
       </w:r>
@@ -3343,17 +3373,86 @@
         </w:rPr>
         <w:t>based on capture region and ensemble PASS flag filtered pair call results. PASS flag means.</w:t>
       </w:r>
-    </w:p>
-    <w:p>
-      <w:pPr>
-        <w:rPr>
-          <w:rFonts w:ascii="Cambria" w:hAnsi="Cambria"/>
-          <w:b/>
-          <w:sz w:val="24"/>
-          <w:szCs w:val="24"/>
-        </w:rPr>
-      </w:pPr>
-    </w:p>
+      <w:r>
+        <w:rPr>
+          <w:rFonts w:ascii="Cambria" w:hAnsi="Cambria"/>
+          <w:bCs/>
+          <w:sz w:val="24"/>
+          <w:szCs w:val="24"/>
+        </w:rPr>
+        <w:t xml:space="preserve"> </w:t>
+      </w:r>
+      <w:r>
+        <w:rPr>
+          <w:rFonts w:ascii="Cambria" w:hAnsi="Cambria"/>
+          <w:bCs/>
+          <w:sz w:val="24"/>
+          <w:szCs w:val="24"/>
+        </w:rPr>
+        <w:t>Base change table for all samples are available at</w:t>
+      </w:r>
+      <w:r>
+        <w:rPr>
+          <w:color w:val="000000" w:themeColor="text1"/>
+        </w:rPr>
+        <w:t xml:space="preserve"> </w:t>
+      </w:r>
+      <w:r>
+        <w:rPr>
+          <w:rFonts w:ascii="Cambria" w:hAnsi="Cambria"/>
+          <w:b/>
+          <w:sz w:val="24"/>
+          <w:szCs w:val="24"/>
+        </w:rPr>
+        <w:t xml:space="preserve"> </w:t>
+      </w:r>
+    </w:p>
+    <w:p>
+      <w:pPr>
+        <w:tabs>
+          <w:tab w:val="left" w:pos="2652"/>
+        </w:tabs>
+        <w:rPr>
+          <w:rFonts w:ascii="Cambria" w:hAnsi="Cambria"/>
+          <w:bCs/>
+          <w:sz w:val="24"/>
+          <w:szCs w:val="24"/>
+        </w:rPr>
+      </w:pPr>
+      <w:bookmarkStart w:id="12" w:name="_Hlk177999519"/>
+      <w:r>
+        <w:rPr>
+          <w:rFonts w:ascii="Cambria" w:hAnsi="Cambria"/>
+          <w:bCs/>
+          <w:sz w:val="24"/>
+          <w:szCs w:val="24"/>
+        </w:rPr>
+        <w:t>BASECHANGE TABLE</w:t>
+      </w:r>
+      <w:r>
+        <w:rPr>
+          <w:rFonts w:ascii="Cambria" w:hAnsi="Cambria"/>
+          <w:bCs/>
+          <w:sz w:val="24"/>
+          <w:szCs w:val="24"/>
+        </w:rPr>
+        <w:tab/>
+      </w:r>
+    </w:p>
+    <w:p>
+      <w:pPr>
+        <w:tabs>
+          <w:tab w:val="left" w:pos="2652"/>
+        </w:tabs>
+        <w:rPr>
+          <w:rFonts w:ascii="Cambria" w:hAnsi="Cambria"/>
+          <w:bCs/>
+          <w:sz w:val="24"/>
+          <w:szCs w:val="24"/>
+        </w:rPr>
+      </w:pPr>
+    </w:p>
+    <w:bookmarkEnd w:id="12"/>
     <w:p>
       <w:pPr>
         <w:rPr>
@@ -3406,17 +3505,7 @@
           <w:sz w:val="24"/>
           <w:szCs w:val="24"/>
         </w:rPr>
-        <w:t xml:space="preserve"> base </w:t>
-      </w:r>
-      <w:proofErr w:type="gramStart"/>
-      <w:r>
-        <w:rPr>
-          <w:rFonts w:ascii="Cambria" w:hAnsi="Cambria"/>
-          <w:b/>
-          <w:sz w:val="24"/>
-          <w:szCs w:val="24"/>
-        </w:rPr>
-        <w:t>change</w:t>
+        <w:t xml:space="preserve"> base change</w:t>
       </w:r>
       <w:r>
         <w:rPr>
@@ -3427,7 +3516,6 @@
         </w:rPr>
         <w:t>s</w:t>
       </w:r>
-      <w:proofErr w:type="gramEnd"/>
       <w:r>
         <w:rPr>
           <w:rFonts w:ascii="Cambria" w:hAnsi="Cambria"/>
@@ -3491,27 +3579,7 @@
           <w:sz w:val="24"/>
           <w:szCs w:val="24"/>
         </w:rPr>
-        <w:t xml:space="preserve">. base change counts per disease </w:t>
-      </w:r>
-      <w:proofErr w:type="gramStart"/>
-      <w:r>
-        <w:rPr>
-          <w:rFonts w:ascii="Cambria" w:hAnsi="Cambria"/>
-          <w:b/>
-          <w:sz w:val="24"/>
-          <w:szCs w:val="24"/>
-        </w:rPr>
-        <w:t>group</w:t>
-      </w:r>
-      <w:proofErr w:type="gramEnd"/>
-      <w:r>
-        <w:rPr>
-          <w:rFonts w:ascii="Cambria" w:hAnsi="Cambria"/>
-          <w:b/>
-          <w:sz w:val="24"/>
-          <w:szCs w:val="24"/>
-        </w:rPr>
-        <w:t xml:space="preserve"> </w:t>
+        <w:t xml:space="preserve">. base change counts per disease group </w:t>
       </w:r>
     </w:p>
     <w:p>
@@ -3528,7 +3596,7 @@
       <w:pPr>
         <w:pStyle w:val="Heading1"/>
       </w:pPr>
-      <w:bookmarkStart w:id="11" w:name="_Toc48676184"/>
+      <w:bookmarkStart w:id="13" w:name="_Toc48676184"/>
       <w:r>
         <w:t>1</w:t>
       </w:r>
@@ -3544,7 +3612,7 @@
       <w:r>
         <w:t>MATCHER CHECK</w:t>
       </w:r>
-      <w:bookmarkEnd w:id="11"/>
+      <w:bookmarkEnd w:id="13"/>
     </w:p>
     <w:p>
       <w:pPr>
@@ -3699,11 +3767,11 @@
       <w:pPr>
         <w:pStyle w:val="Heading1"/>
       </w:pPr>
-      <w:bookmarkStart w:id="12" w:name="_Toc48676185"/>
+      <w:bookmarkStart w:id="14" w:name="_Toc48676185"/>
       <w:r>
         <w:t>References</w:t>
       </w:r>
-      <w:bookmarkEnd w:id="12"/>
+      <w:bookmarkEnd w:id="14"/>
     </w:p>
     <w:p>
       <w:pPr>
@@ -3913,18 +3981,78 @@
           <w:szCs w:val="24"/>
         </w:rPr>
         <w:tab/>
-        <w:t>Wang, C., Zhan, X., Liang, L., Abecasis, G. R. &amp; Lin, X. Improved ancestry estimation for both genotyping and sequencing data using projection procrustes analysis and genotype imputation. Am J Hum Genet 96, 926-937, doi:10.1016/j.ajhg.2015.04.018 (2015).</w:t>
-      </w:r>
-    </w:p>
-    <w:p>
-      <w:pPr>
-        <w:rPr>
-          <w:rFonts w:ascii="Cambria" w:hAnsi="Cambria"/>
-          <w:bCs/>
-          <w:sz w:val="24"/>
-          <w:szCs w:val="24"/>
-        </w:rPr>
-      </w:pPr>
+      </w:r>
+      <w:bookmarkStart w:id="15" w:name="_Hlk178097786"/>
+      <w:r>
+        <w:rPr>
+          <w:rFonts w:ascii="Cambria" w:hAnsi="Cambria"/>
+          <w:bCs/>
+          <w:sz w:val="24"/>
+          <w:szCs w:val="24"/>
+        </w:rPr>
+        <w:t xml:space="preserve">Emil Jørsboe, Kristian Hanghøj, Anders Albrechtsen, </w:t>
+      </w:r>
+      <w:proofErr w:type="spellStart"/>
+      <w:r>
+        <w:rPr>
+          <w:rFonts w:ascii="Cambria" w:hAnsi="Cambria"/>
+          <w:bCs/>
+          <w:sz w:val="24"/>
+          <w:szCs w:val="24"/>
+        </w:rPr>
+        <w:t>fastNGSadmix</w:t>
+      </w:r>
+      <w:proofErr w:type="spellEnd"/>
+      <w:r>
+        <w:rPr>
+          <w:rFonts w:ascii="Cambria" w:hAnsi="Cambria"/>
+          <w:bCs/>
+          <w:sz w:val="24"/>
+          <w:szCs w:val="24"/>
+        </w:rPr>
+        <w:t xml:space="preserve">: admixture proportions and principal component analysis of a single NGS sample, </w:t>
+      </w:r>
+      <w:r>
+        <w:rPr>
+          <w:rFonts w:ascii="Cambria" w:hAnsi="Cambria"/>
+          <w:bCs/>
+          <w:i/>
+          <w:iCs/>
+          <w:sz w:val="24"/>
+          <w:szCs w:val="24"/>
+        </w:rPr>
+        <w:t>Bioinformatics</w:t>
+      </w:r>
+      <w:r>
+        <w:rPr>
+          <w:rFonts w:ascii="Cambria" w:hAnsi="Cambria"/>
+          <w:bCs/>
+          <w:sz w:val="24"/>
+          <w:szCs w:val="24"/>
+        </w:rPr>
+        <w:t xml:space="preserve">, Volume 33, Issue 19, October 2017, Pages 3148–3150, </w:t>
+      </w:r>
+      <w:hyperlink r:id="rId8" w:history="1">
+        <w:r>
+          <w:rPr>
+            <w:rStyle w:val="Hyperlink"/>
+            <w:rFonts w:ascii="Cambria" w:hAnsi="Cambria"/>
+            <w:bCs/>
+            <w:sz w:val="24"/>
+            <w:szCs w:val="24"/>
+          </w:rPr>
+          <w:t>https://doi.org/10.1093/bioinformatics/btx474</w:t>
+        </w:r>
+      </w:hyperlink>
+      <w:r>
+        <w:rPr>
+          <w:rFonts w:ascii="Cambria" w:hAnsi="Cambria"/>
+          <w:bCs/>
+          <w:sz w:val="24"/>
+          <w:szCs w:val="24"/>
+        </w:rPr>
+        <w:t xml:space="preserve"> (201</w:t>
+      </w:r>
       <w:r>
         <w:rPr>
           <w:rFonts w:ascii="Cambria" w:hAnsi="Cambria"/>
@@ -3941,6 +4069,35 @@
           <w:sz w:val="24"/>
           <w:szCs w:val="24"/>
         </w:rPr>
+        <w:t>).</w:t>
+      </w:r>
+      <w:bookmarkEnd w:id="15"/>
+    </w:p>
+    <w:p>
+      <w:pPr>
+        <w:rPr>
+          <w:rFonts w:ascii="Cambria" w:hAnsi="Cambria"/>
+          <w:bCs/>
+          <w:sz w:val="24"/>
+          <w:szCs w:val="24"/>
+        </w:rPr>
+      </w:pPr>
+      <w:r>
+        <w:rPr>
+          <w:rFonts w:ascii="Cambria" w:hAnsi="Cambria"/>
+          <w:bCs/>
+          <w:sz w:val="24"/>
+          <w:szCs w:val="24"/>
+        </w:rPr>
+        <w:t>7</w:t>
+      </w:r>
+      <w:r>
+        <w:rPr>
+          <w:rFonts w:ascii="Cambria" w:hAnsi="Cambria"/>
+          <w:bCs/>
+          <w:sz w:val="24"/>
+          <w:szCs w:val="24"/>
+        </w:rPr>
         <w:tab/>
       </w:r>
       <w:r>
@@ -4066,9 +4223,9 @@
       </w:r>
     </w:p>
     <w:sectPr>
-      <w:headerReference w:type="default" r:id="rId8"/>
-      <w:footerReference w:type="even" r:id="rId9"/>
-      <w:footerReference w:type="default" r:id="rId10"/>
+      <w:headerReference w:type="default" r:id="rId9"/>
+      <w:footerReference w:type="even" r:id="rId10"/>
+      <w:footerReference w:type="default" r:id="rId11"/>
       <w:pgSz w:w="12240" w:h="15840"/>
       <w:pgMar w:top="1440" w:right="1800" w:bottom="1440" w:left="1800" w:header="720" w:footer="720" w:gutter="0"/>
       <w:cols w:space="720"/>
@@ -4079,7 +4236,7 @@
 </file>
 
 <file path=word/endnotes.xml><?xml version="1.0" encoding="utf-8"?>
-<w:endnotes xmlns:wpc="http://schemas.microsoft.com/office/word/2010/wordprocessingCanvas" xmlns:cx="http://schemas.microsoft.com/office/drawing/2014/chartex" xmlns:cx1="http://schemas.microsoft.com/office/drawing/2015/9/8/chartex" xmlns:cx2="http://schemas.microsoft.com/office/drawing/2015/10/21/chartex" xmlns:cx3="http://schemas.microsoft.com/office/drawing/2016/5/9/chartex" xmlns:cx4="http://schemas.microsoft.com/office/drawing/2016/5/10/chartex" xmlns:cx5="http://schemas.microsoft.com/office/drawing/2016/5/11/chartex" xmlns:cx6="http://schemas.microsoft.com/office/drawing/2016/5/12/chartex" xmlns:cx7="http://schemas.microsoft.com/office/drawing/2016/5/13/chartex" xmlns:cx8="http://schemas.microsoft.com/office/drawing/2016/5/14/chartex" xmlns:mc="http://schemas.openxmlformats.org/markup-compatibility/2006" xmlns:aink="http://schemas.microsoft.com/office/drawing/2016/ink" xmlns:am3d="http://schemas.microsoft.com/office/drawing/2017/model3d" xmlns:o="urn:schemas-microsoft-com:office:office" xmlns:oel="http://schemas.microsoft.com/office/2019/extlst" xmlns:r="http://schemas.openxmlformats.org/officeDocument/2006/relationships" xmlns:m="http://schemas.openxmlformats.org/officeDocument/2006/math" xmlns:v="urn:schemas-microsoft-com:vml" xmlns:wp14="http://schemas.microsoft.com/office/word/2010/wordprocessingDrawing" xmlns:wp="http://schemas.openxmlformats.org/drawingml/2006/wordprocessingDrawing" xmlns:w10="urn:schemas-microsoft-com:office:word" xmlns:w="http://schemas.openxmlformats.org/wordprocessingml/2006/main" xmlns:w14="http://schemas.microsoft.com/office/word/2010/wordml" xmlns:w15="http://schemas.microsoft.com/office/word/2012/wordml" xmlns:w16cex="http://schemas.microsoft.com/office/word/2018/wordml/cex" xmlns:w16cid="http://schemas.microsoft.com/office/word/2016/wordml/cid" xmlns:w16="http://schemas.microsoft.com/office/word/2018/wordml" xmlns:w16sdtdh="http://schemas.microsoft.com/office/word/2020/wordml/sdtdatahash" xmlns:w16se="http://schemas.microsoft.com/office/word/2015/wordml/symex" xmlns:wpg="http://schemas.microsoft.com/office/word/2010/wordprocessingGroup" xmlns:wpi="http://schemas.microsoft.com/office/word/2010/wordprocessingInk" xmlns:wne="http://schemas.microsoft.com/office/word/2006/wordml" xmlns:wps="http://schemas.microsoft.com/office/word/2010/wordprocessingShape" mc:Ignorable="w14 w15 w16se w16cid w16 w16cex w16sdtdh wp14">
+<w:endnotes xmlns:wpc="http://schemas.microsoft.com/office/word/2010/wordprocessingCanvas" xmlns:cx="http://schemas.microsoft.com/office/drawing/2014/chartex" xmlns:cx1="http://schemas.microsoft.com/office/drawing/2015/9/8/chartex" xmlns:cx2="http://schemas.microsoft.com/office/drawing/2015/10/21/chartex" xmlns:cx3="http://schemas.microsoft.com/office/drawing/2016/5/9/chartex" xmlns:cx4="http://schemas.microsoft.com/office/drawing/2016/5/10/chartex" xmlns:cx5="http://schemas.microsoft.com/office/drawing/2016/5/11/chartex" xmlns:cx6="http://schemas.microsoft.com/office/drawing/2016/5/12/chartex" xmlns:cx7="http://schemas.microsoft.com/office/drawing/2016/5/13/chartex" xmlns:cx8="http://schemas.microsoft.com/office/drawing/2016/5/14/chartex" xmlns:mc="http://schemas.openxmlformats.org/markup-compatibility/2006" xmlns:aink="http://schemas.microsoft.com/office/drawing/2016/ink" xmlns:am3d="http://schemas.microsoft.com/office/drawing/2017/model3d" xmlns:o="urn:schemas-microsoft-com:office:office" xmlns:oel="http://schemas.microsoft.com/office/2019/extlst" xmlns:r="http://schemas.openxmlformats.org/officeDocument/2006/relationships" xmlns:m="http://schemas.openxmlformats.org/officeDocument/2006/math" xmlns:v="urn:schemas-microsoft-com:vml" xmlns:wp14="http://schemas.microsoft.com/office/word/2010/wordprocessingDrawing" xmlns:wp="http://schemas.openxmlformats.org/drawingml/2006/wordprocessingDrawing" xmlns:w10="urn:schemas-microsoft-com:office:word" xmlns:w="http://schemas.openxmlformats.org/wordprocessingml/2006/main" xmlns:w14="http://schemas.microsoft.com/office/word/2010/wordml" xmlns:w15="http://schemas.microsoft.com/office/word/2012/wordml" xmlns:w16cex="http://schemas.microsoft.com/office/word/2018/wordml/cex" xmlns:w16cid="http://schemas.microsoft.com/office/word/2016/wordml/cid" xmlns:w16="http://schemas.microsoft.com/office/word/2018/wordml" xmlns:w16du="http://schemas.microsoft.com/office/word/2023/wordml/word16du" xmlns:w16sdtdh="http://schemas.microsoft.com/office/word/2020/wordml/sdtdatahash" xmlns:w16se="http://schemas.microsoft.com/office/word/2015/wordml/symex" xmlns:wpg="http://schemas.microsoft.com/office/word/2010/wordprocessingGroup" xmlns:wpi="http://schemas.microsoft.com/office/word/2010/wordprocessingInk" xmlns:wne="http://schemas.microsoft.com/office/word/2006/wordml" xmlns:wps="http://schemas.microsoft.com/office/word/2010/wordprocessingShape" mc:Ignorable="w14 w15 w16se w16cid w16 w16cex w16sdtdh w16du wp14">
   <w:endnote w:type="separator" w:id="-1">
     <w:p>
       <w:pPr>
@@ -4104,7 +4261,7 @@
 </file>
 
 <file path=word/footer1.xml><?xml version="1.0" encoding="utf-8"?>
-<w:ftr xmlns:wpc="http://schemas.microsoft.com/office/word/2010/wordprocessingCanvas" xmlns:cx="http://schemas.microsoft.com/office/drawing/2014/chartex" xmlns:cx1="http://schemas.microsoft.com/office/drawing/2015/9/8/chartex" xmlns:cx2="http://schemas.microsoft.com/office/drawing/2015/10/21/chartex" xmlns:cx3="http://schemas.microsoft.com/office/drawing/2016/5/9/chartex" xmlns:cx4="http://schemas.microsoft.com/office/drawing/2016/5/10/chartex" xmlns:cx5="http://schemas.microsoft.com/office/drawing/2016/5/11/chartex" xmlns:cx6="http://schemas.microsoft.com/office/drawing/2016/5/12/chartex" xmlns:cx7="http://schemas.microsoft.com/office/drawing/2016/5/13/chartex" xmlns:cx8="http://schemas.microsoft.com/office/drawing/2016/5/14/chartex" xmlns:mc="http://schemas.openxmlformats.org/markup-compatibility/2006" xmlns:aink="http://schemas.microsoft.com/office/drawing/2016/ink" xmlns:am3d="http://schemas.microsoft.com/office/drawing/2017/model3d" xmlns:o="urn:schemas-microsoft-com:office:office" xmlns:oel="http://schemas.microsoft.com/office/2019/extlst" xmlns:r="http://schemas.openxmlformats.org/officeDocument/2006/relationships" xmlns:m="http://schemas.openxmlformats.org/officeDocument/2006/math" xmlns:v="urn:schemas-microsoft-com:vml" xmlns:wp14="http://schemas.microsoft.com/office/word/2010/wordprocessingDrawing" xmlns:wp="http://schemas.openxmlformats.org/drawingml/2006/wordprocessingDrawing" xmlns:w10="urn:schemas-microsoft-com:office:word" xmlns:w="http://schemas.openxmlformats.org/wordprocessingml/2006/main" xmlns:w14="http://schemas.microsoft.com/office/word/2010/wordml" xmlns:w15="http://schemas.microsoft.com/office/word/2012/wordml" xmlns:w16cex="http://schemas.microsoft.com/office/word/2018/wordml/cex" xmlns:w16cid="http://schemas.microsoft.com/office/word/2016/wordml/cid" xmlns:w16="http://schemas.microsoft.com/office/word/2018/wordml" xmlns:w16sdtdh="http://schemas.microsoft.com/office/word/2020/wordml/sdtdatahash" xmlns:w16se="http://schemas.microsoft.com/office/word/2015/wordml/symex" xmlns:wpg="http://schemas.microsoft.com/office/word/2010/wordprocessingGroup" xmlns:wpi="http://schemas.microsoft.com/office/word/2010/wordprocessingInk" xmlns:wne="http://schemas.microsoft.com/office/word/2006/wordml" xmlns:wps="http://schemas.microsoft.com/office/word/2010/wordprocessingShape" mc:Ignorable="w14 w15 w16se w16cid w16 w16cex w16sdtdh wp14">
+<w:ftr xmlns:wpc="http://schemas.microsoft.com/office/word/2010/wordprocessingCanvas" xmlns:cx="http://schemas.microsoft.com/office/drawing/2014/chartex" xmlns:cx1="http://schemas.microsoft.com/office/drawing/2015/9/8/chartex" xmlns:cx2="http://schemas.microsoft.com/office/drawing/2015/10/21/chartex" xmlns:cx3="http://schemas.microsoft.com/office/drawing/2016/5/9/chartex" xmlns:cx4="http://schemas.microsoft.com/office/drawing/2016/5/10/chartex" xmlns:cx5="http://schemas.microsoft.com/office/drawing/2016/5/11/chartex" xmlns:cx6="http://schemas.microsoft.com/office/drawing/2016/5/12/chartex" xmlns:cx7="http://schemas.microsoft.com/office/drawing/2016/5/13/chartex" xmlns:cx8="http://schemas.microsoft.com/office/drawing/2016/5/14/chartex" xmlns:mc="http://schemas.openxmlformats.org/markup-compatibility/2006" xmlns:aink="http://schemas.microsoft.com/office/drawing/2016/ink" xmlns:am3d="http://schemas.microsoft.com/office/drawing/2017/model3d" xmlns:o="urn:schemas-microsoft-com:office:office" xmlns:oel="http://schemas.microsoft.com/office/2019/extlst" xmlns:r="http://schemas.openxmlformats.org/officeDocument/2006/relationships" xmlns:m="http://schemas.openxmlformats.org/officeDocument/2006/math" xmlns:v="urn:schemas-microsoft-com:vml" xmlns:wp14="http://schemas.microsoft.com/office/word/2010/wordprocessingDrawing" xmlns:wp="http://schemas.openxmlformats.org/drawingml/2006/wordprocessingDrawing" xmlns:w10="urn:schemas-microsoft-com:office:word" xmlns:w="http://schemas.openxmlformats.org/wordprocessingml/2006/main" xmlns:w14="http://schemas.microsoft.com/office/word/2010/wordml" xmlns:w15="http://schemas.microsoft.com/office/word/2012/wordml" xmlns:w16cex="http://schemas.microsoft.com/office/word/2018/wordml/cex" xmlns:w16cid="http://schemas.microsoft.com/office/word/2016/wordml/cid" xmlns:w16="http://schemas.microsoft.com/office/word/2018/wordml" xmlns:w16du="http://schemas.microsoft.com/office/word/2023/wordml/word16du" xmlns:w16sdtdh="http://schemas.microsoft.com/office/word/2020/wordml/sdtdatahash" xmlns:w16se="http://schemas.microsoft.com/office/word/2015/wordml/symex" xmlns:wpg="http://schemas.microsoft.com/office/word/2010/wordprocessingGroup" xmlns:wpi="http://schemas.microsoft.com/office/word/2010/wordprocessingInk" xmlns:wne="http://schemas.microsoft.com/office/word/2006/wordml" xmlns:wps="http://schemas.microsoft.com/office/word/2010/wordprocessingShape" mc:Ignorable="w14 w15 w16se w16cid w16 w16cex w16sdtdh w16du wp14">
   <w:p>
     <w:pPr>
       <w:pStyle w:val="Footer"/>
@@ -4141,7 +4298,7 @@
 </file>
 
 <file path=word/footer2.xml><?xml version="1.0" encoding="utf-8"?>
-<w:ftr xmlns:wpc="http://schemas.microsoft.com/office/word/2010/wordprocessingCanvas" xmlns:cx="http://schemas.microsoft.com/office/drawing/2014/chartex" xmlns:cx1="http://schemas.microsoft.com/office/drawing/2015/9/8/chartex" xmlns:cx2="http://schemas.microsoft.com/office/drawing/2015/10/21/chartex" xmlns:cx3="http://schemas.microsoft.com/office/drawing/2016/5/9/chartex" xmlns:cx4="http://schemas.microsoft.com/office/drawing/2016/5/10/chartex" xmlns:cx5="http://schemas.microsoft.com/office/drawing/2016/5/11/chartex" xmlns:cx6="http://schemas.microsoft.com/office/drawing/2016/5/12/chartex" xmlns:cx7="http://schemas.microsoft.com/office/drawing/2016/5/13/chartex" xmlns:cx8="http://schemas.microsoft.com/office/drawing/2016/5/14/chartex" xmlns:mc="http://schemas.openxmlformats.org/markup-compatibility/2006" xmlns:aink="http://schemas.microsoft.com/office/drawing/2016/ink" xmlns:am3d="http://schemas.microsoft.com/office/drawing/2017/model3d" xmlns:o="urn:schemas-microsoft-com:office:office" xmlns:oel="http://schemas.microsoft.com/office/2019/extlst" xmlns:r="http://schemas.openxmlformats.org/officeDocument/2006/relationships" xmlns:m="http://schemas.openxmlformats.org/officeDocument/2006/math" xmlns:v="urn:schemas-microsoft-com:vml" xmlns:wp14="http://schemas.microsoft.com/office/word/2010/wordprocessingDrawing" xmlns:wp="http://schemas.openxmlformats.org/drawingml/2006/wordprocessingDrawing" xmlns:w10="urn:schemas-microsoft-com:office:word" xmlns:w="http://schemas.openxmlformats.org/wordprocessingml/2006/main" xmlns:w14="http://schemas.microsoft.com/office/word/2010/wordml" xmlns:w15="http://schemas.microsoft.com/office/word/2012/wordml" xmlns:w16cex="http://schemas.microsoft.com/office/word/2018/wordml/cex" xmlns:w16cid="http://schemas.microsoft.com/office/word/2016/wordml/cid" xmlns:w16="http://schemas.microsoft.com/office/word/2018/wordml" xmlns:w16sdtdh="http://schemas.microsoft.com/office/word/2020/wordml/sdtdatahash" xmlns:w16se="http://schemas.microsoft.com/office/word/2015/wordml/symex" xmlns:wpg="http://schemas.microsoft.com/office/word/2010/wordprocessingGroup" xmlns:wpi="http://schemas.microsoft.com/office/word/2010/wordprocessingInk" xmlns:wne="http://schemas.microsoft.com/office/word/2006/wordml" xmlns:wps="http://schemas.microsoft.com/office/word/2010/wordprocessingShape" mc:Ignorable="w14 w15 w16se w16cid w16 w16cex w16sdtdh wp14">
+<w:ftr xmlns:wpc="http://schemas.microsoft.com/office/word/2010/wordprocessingCanvas" xmlns:cx="http://schemas.microsoft.com/office/drawing/2014/chartex" xmlns:cx1="http://schemas.microsoft.com/office/drawing/2015/9/8/chartex" xmlns:cx2="http://schemas.microsoft.com/office/drawing/2015/10/21/chartex" xmlns:cx3="http://schemas.microsoft.com/office/drawing/2016/5/9/chartex" xmlns:cx4="http://schemas.microsoft.com/office/drawing/2016/5/10/chartex" xmlns:cx5="http://schemas.microsoft.com/office/drawing/2016/5/11/chartex" xmlns:cx6="http://schemas.microsoft.com/office/drawing/2016/5/12/chartex" xmlns:cx7="http://schemas.microsoft.com/office/drawing/2016/5/13/chartex" xmlns:cx8="http://schemas.microsoft.com/office/drawing/2016/5/14/chartex" xmlns:mc="http://schemas.openxmlformats.org/markup-compatibility/2006" xmlns:aink="http://schemas.microsoft.com/office/drawing/2016/ink" xmlns:am3d="http://schemas.microsoft.com/office/drawing/2017/model3d" xmlns:o="urn:schemas-microsoft-com:office:office" xmlns:oel="http://schemas.microsoft.com/office/2019/extlst" xmlns:r="http://schemas.openxmlformats.org/officeDocument/2006/relationships" xmlns:m="http://schemas.openxmlformats.org/officeDocument/2006/math" xmlns:v="urn:schemas-microsoft-com:vml" xmlns:wp14="http://schemas.microsoft.com/office/word/2010/wordprocessingDrawing" xmlns:wp="http://schemas.openxmlformats.org/drawingml/2006/wordprocessingDrawing" xmlns:w10="urn:schemas-microsoft-com:office:word" xmlns:w="http://schemas.openxmlformats.org/wordprocessingml/2006/main" xmlns:w14="http://schemas.microsoft.com/office/word/2010/wordml" xmlns:w15="http://schemas.microsoft.com/office/word/2012/wordml" xmlns:w16cex="http://schemas.microsoft.com/office/word/2018/wordml/cex" xmlns:w16cid="http://schemas.microsoft.com/office/word/2016/wordml/cid" xmlns:w16="http://schemas.microsoft.com/office/word/2018/wordml" xmlns:w16du="http://schemas.microsoft.com/office/word/2023/wordml/word16du" xmlns:w16sdtdh="http://schemas.microsoft.com/office/word/2020/wordml/sdtdatahash" xmlns:w16se="http://schemas.microsoft.com/office/word/2015/wordml/symex" xmlns:wpg="http://schemas.microsoft.com/office/word/2010/wordprocessingGroup" xmlns:wpi="http://schemas.microsoft.com/office/word/2010/wordprocessingInk" xmlns:wne="http://schemas.microsoft.com/office/word/2006/wordml" xmlns:wps="http://schemas.microsoft.com/office/word/2010/wordprocessingShape" mc:Ignorable="w14 w15 w16se w16cid w16 w16cex w16sdtdh w16du wp14">
   <w:p>
     <w:pPr>
       <w:pStyle w:val="Footer"/>
@@ -4191,7 +4348,7 @@
 </file>
 
 <file path=word/footnotes.xml><?xml version="1.0" encoding="utf-8"?>
-<w:footnotes xmlns:wpc="http://schemas.microsoft.com/office/word/2010/wordprocessingCanvas" xmlns:cx="http://schemas.microsoft.com/office/drawing/2014/chartex" xmlns:cx1="http://schemas.microsoft.com/office/drawing/2015/9/8/chartex" xmlns:cx2="http://schemas.microsoft.com/office/drawing/2015/10/21/chartex" xmlns:cx3="http://schemas.microsoft.com/office/drawing/2016/5/9/chartex" xmlns:cx4="http://schemas.microsoft.com/office/drawing/2016/5/10/chartex" xmlns:cx5="http://schemas.microsoft.com/office/drawing/2016/5/11/chartex" xmlns:cx6="http://schemas.microsoft.com/office/drawing/2016/5/12/chartex" xmlns:cx7="http://schemas.microsoft.com/office/drawing/2016/5/13/chartex" xmlns:cx8="http://schemas.microsoft.com/office/drawing/2016/5/14/chartex" xmlns:mc="http://schemas.openxmlformats.org/markup-compatibility/2006" xmlns:aink="http://schemas.microsoft.com/office/drawing/2016/ink" xmlns:am3d="http://schemas.microsoft.com/office/drawing/2017/model3d" xmlns:o="urn:schemas-microsoft-com:office:office" xmlns:oel="http://schemas.microsoft.com/office/2019/extlst" xmlns:r="http://schemas.openxmlformats.org/officeDocument/2006/relationships" xmlns:m="http://schemas.openxmlformats.org/officeDocument/2006/math" xmlns:v="urn:schemas-microsoft-com:vml" xmlns:wp14="http://schemas.microsoft.com/office/word/2010/wordprocessingDrawing" xmlns:wp="http://schemas.openxmlformats.org/drawingml/2006/wordprocessingDrawing" xmlns:w10="urn:schemas-microsoft-com:office:word" xmlns:w="http://schemas.openxmlformats.org/wordprocessingml/2006/main" xmlns:w14="http://schemas.microsoft.com/office/word/2010/wordml" xmlns:w15="http://schemas.microsoft.com/office/word/2012/wordml" xmlns:w16cex="http://schemas.microsoft.com/office/word/2018/wordml/cex" xmlns:w16cid="http://schemas.microsoft.com/office/word/2016/wordml/cid" xmlns:w16="http://schemas.microsoft.com/office/word/2018/wordml" xmlns:w16sdtdh="http://schemas.microsoft.com/office/word/2020/wordml/sdtdatahash" xmlns:w16se="http://schemas.microsoft.com/office/word/2015/wordml/symex" xmlns:wpg="http://schemas.microsoft.com/office/word/2010/wordprocessingGroup" xmlns:wpi="http://schemas.microsoft.com/office/word/2010/wordprocessingInk" xmlns:wne="http://schemas.microsoft.com/office/word/2006/wordml" xmlns:wps="http://schemas.microsoft.com/office/word/2010/wordprocessingShape" mc:Ignorable="w14 w15 w16se w16cid w16 w16cex w16sdtdh wp14">
+<w:footnotes xmlns:wpc="http://schemas.microsoft.com/office/word/2010/wordprocessingCanvas" xmlns:cx="http://schemas.microsoft.com/office/drawing/2014/chartex" xmlns:cx1="http://schemas.microsoft.com/office/drawing/2015/9/8/chartex" xmlns:cx2="http://schemas.microsoft.com/office/drawing/2015/10/21/chartex" xmlns:cx3="http://schemas.microsoft.com/office/drawing/2016/5/9/chartex" xmlns:cx4="http://schemas.microsoft.com/office/drawing/2016/5/10/chartex" xmlns:cx5="http://schemas.microsoft.com/office/drawing/2016/5/11/chartex" xmlns:cx6="http://schemas.microsoft.com/office/drawing/2016/5/12/chartex" xmlns:cx7="http://schemas.microsoft.com/office/drawing/2016/5/13/chartex" xmlns:cx8="http://schemas.microsoft.com/office/drawing/2016/5/14/chartex" xmlns:mc="http://schemas.openxmlformats.org/markup-compatibility/2006" xmlns:aink="http://schemas.microsoft.com/office/drawing/2016/ink" xmlns:am3d="http://schemas.microsoft.com/office/drawing/2017/model3d" xmlns:o="urn:schemas-microsoft-com:office:office" xmlns:oel="http://schemas.microsoft.com/office/2019/extlst" xmlns:r="http://schemas.openxmlformats.org/officeDocument/2006/relationships" xmlns:m="http://schemas.openxmlformats.org/officeDocument/2006/math" xmlns:v="urn:schemas-microsoft-com:vml" xmlns:wp14="http://schemas.microsoft.com/office/word/2010/wordprocessingDrawing" xmlns:wp="http://schemas.openxmlformats.org/drawingml/2006/wordprocessingDrawing" xmlns:w10="urn:schemas-microsoft-com:office:word" xmlns:w="http://schemas.openxmlformats.org/wordprocessingml/2006/main" xmlns:w14="http://schemas.microsoft.com/office/word/2010/wordml" xmlns:w15="http://schemas.microsoft.com/office/word/2012/wordml" xmlns:w16cex="http://schemas.microsoft.com/office/word/2018/wordml/cex" xmlns:w16cid="http://schemas.microsoft.com/office/word/2016/wordml/cid" xmlns:w16="http://schemas.microsoft.com/office/word/2018/wordml" xmlns:w16du="http://schemas.microsoft.com/office/word/2023/wordml/word16du" xmlns:w16sdtdh="http://schemas.microsoft.com/office/word/2020/wordml/sdtdatahash" xmlns:w16se="http://schemas.microsoft.com/office/word/2015/wordml/symex" xmlns:wpg="http://schemas.microsoft.com/office/word/2010/wordprocessingGroup" xmlns:wpi="http://schemas.microsoft.com/office/word/2010/wordprocessingInk" xmlns:wne="http://schemas.microsoft.com/office/word/2006/wordml" xmlns:wps="http://schemas.microsoft.com/office/word/2010/wordprocessingShape" mc:Ignorable="w14 w15 w16se w16cid w16 w16cex w16sdtdh w16du wp14">
   <w:footnote w:type="separator" w:id="-1">
     <w:p>
       <w:pPr>
@@ -4216,7 +4373,7 @@
 </file>
 
 <file path=word/header1.xml><?xml version="1.0" encoding="utf-8"?>
-<w:hdr xmlns:wpc="http://schemas.microsoft.com/office/word/2010/wordprocessingCanvas" xmlns:cx="http://schemas.microsoft.com/office/drawing/2014/chartex" xmlns:cx1="http://schemas.microsoft.com/office/drawing/2015/9/8/chartex" xmlns:cx2="http://schemas.microsoft.com/office/drawing/2015/10/21/chartex" xmlns:cx3="http://schemas.microsoft.com/office/drawing/2016/5/9/chartex" xmlns:cx4="http://schemas.microsoft.com/office/drawing/2016/5/10/chartex" xmlns:cx5="http://schemas.microsoft.com/office/drawing/2016/5/11/chartex" xmlns:cx6="http://schemas.microsoft.com/office/drawing/2016/5/12/chartex" xmlns:cx7="http://schemas.microsoft.com/office/drawing/2016/5/13/chartex" xmlns:cx8="http://schemas.microsoft.com/office/drawing/2016/5/14/chartex" xmlns:mc="http://schemas.openxmlformats.org/markup-compatibility/2006" xmlns:aink="http://schemas.microsoft.com/office/drawing/2016/ink" xmlns:am3d="http://schemas.microsoft.com/office/drawing/2017/model3d" xmlns:o="urn:schemas-microsoft-com:office:office" xmlns:oel="http://schemas.microsoft.com/office/2019/extlst" xmlns:r="http://schemas.openxmlformats.org/officeDocument/2006/relationships" xmlns:m="http://schemas.openxmlformats.org/officeDocument/2006/math" xmlns:v="urn:schemas-microsoft-com:vml" xmlns:wp14="http://schemas.microsoft.com/office/word/2010/wordprocessingDrawing" xmlns:wp="http://schemas.openxmlformats.org/drawingml/2006/wordprocessingDrawing" xmlns:w10="urn:schemas-microsoft-com:office:word" xmlns:w="http://schemas.openxmlformats.org/wordprocessingml/2006/main" xmlns:w14="http://schemas.microsoft.com/office/word/2010/wordml" xmlns:w15="http://schemas.microsoft.com/office/word/2012/wordml" xmlns:w16cex="http://schemas.microsoft.com/office/word/2018/wordml/cex" xmlns:w16cid="http://schemas.microsoft.com/office/word/2016/wordml/cid" xmlns:w16="http://schemas.microsoft.com/office/word/2018/wordml" xmlns:w16sdtdh="http://schemas.microsoft.com/office/word/2020/wordml/sdtdatahash" xmlns:w16se="http://schemas.microsoft.com/office/word/2015/wordml/symex" xmlns:wpg="http://schemas.microsoft.com/office/word/2010/wordprocessingGroup" xmlns:wpi="http://schemas.microsoft.com/office/word/2010/wordprocessingInk" xmlns:wne="http://schemas.microsoft.com/office/word/2006/wordml" xmlns:wps="http://schemas.microsoft.com/office/word/2010/wordprocessingShape" mc:Ignorable="w14 w15 w16se w16cid w16 w16cex w16sdtdh wp14">
+<w:hdr xmlns:wpc="http://schemas.microsoft.com/office/word/2010/wordprocessingCanvas" xmlns:cx="http://schemas.microsoft.com/office/drawing/2014/chartex" xmlns:cx1="http://schemas.microsoft.com/office/drawing/2015/9/8/chartex" xmlns:cx2="http://schemas.microsoft.com/office/drawing/2015/10/21/chartex" xmlns:cx3="http://schemas.microsoft.com/office/drawing/2016/5/9/chartex" xmlns:cx4="http://schemas.microsoft.com/office/drawing/2016/5/10/chartex" xmlns:cx5="http://schemas.microsoft.com/office/drawing/2016/5/11/chartex" xmlns:cx6="http://schemas.microsoft.com/office/drawing/2016/5/12/chartex" xmlns:cx7="http://schemas.microsoft.com/office/drawing/2016/5/13/chartex" xmlns:cx8="http://schemas.microsoft.com/office/drawing/2016/5/14/chartex" xmlns:mc="http://schemas.openxmlformats.org/markup-compatibility/2006" xmlns:aink="http://schemas.microsoft.com/office/drawing/2016/ink" xmlns:am3d="http://schemas.microsoft.com/office/drawing/2017/model3d" xmlns:o="urn:schemas-microsoft-com:office:office" xmlns:oel="http://schemas.microsoft.com/office/2019/extlst" xmlns:r="http://schemas.openxmlformats.org/officeDocument/2006/relationships" xmlns:m="http://schemas.openxmlformats.org/officeDocument/2006/math" xmlns:v="urn:schemas-microsoft-com:vml" xmlns:wp14="http://schemas.microsoft.com/office/word/2010/wordprocessingDrawing" xmlns:wp="http://schemas.openxmlformats.org/drawingml/2006/wordprocessingDrawing" xmlns:w10="urn:schemas-microsoft-com:office:word" xmlns:w="http://schemas.openxmlformats.org/wordprocessingml/2006/main" xmlns:w14="http://schemas.microsoft.com/office/word/2010/wordml" xmlns:w15="http://schemas.microsoft.com/office/word/2012/wordml" xmlns:w16cex="http://schemas.microsoft.com/office/word/2018/wordml/cex" xmlns:w16cid="http://schemas.microsoft.com/office/word/2016/wordml/cid" xmlns:w16="http://schemas.microsoft.com/office/word/2018/wordml" xmlns:w16du="http://schemas.microsoft.com/office/word/2023/wordml/word16du" xmlns:w16sdtdh="http://schemas.microsoft.com/office/word/2020/wordml/sdtdatahash" xmlns:w16se="http://schemas.microsoft.com/office/word/2015/wordml/symex" xmlns:wpg="http://schemas.microsoft.com/office/word/2010/wordprocessingGroup" xmlns:wpi="http://schemas.microsoft.com/office/word/2010/wordprocessingInk" xmlns:wne="http://schemas.microsoft.com/office/word/2006/wordml" xmlns:wps="http://schemas.microsoft.com/office/word/2010/wordprocessingShape" mc:Ignorable="w14 w15 w16se w16cid w16 w16cex w16sdtdh w16du wp14">
   <w:p>
     <w:pPr>
       <w:pStyle w:val="Header"/>
@@ -4226,7 +4383,7 @@
 </file>
 
 <file path=word/numbering.xml><?xml version="1.0" encoding="utf-8"?>
-<w:numbering xmlns:wpc="http://schemas.microsoft.com/office/word/2010/wordprocessingCanvas" xmlns:cx="http://schemas.microsoft.com/office/drawing/2014/chartex" xmlns:cx1="http://schemas.microsoft.com/office/drawing/2015/9/8/chartex" xmlns:cx2="http://schemas.microsoft.com/office/drawing/2015/10/21/chartex" xmlns:cx3="http://schemas.microsoft.com/office/drawing/2016/5/9/chartex" xmlns:cx4="http://schemas.microsoft.com/office/drawing/2016/5/10/chartex" xmlns:cx5="http://schemas.microsoft.com/office/drawing/2016/5/11/chartex" xmlns:cx6="http://schemas.microsoft.com/office/drawing/2016/5/12/chartex" xmlns:cx7="http://schemas.microsoft.com/office/drawing/2016/5/13/chartex" xmlns:cx8="http://schemas.microsoft.com/office/drawing/2016/5/14/chartex" xmlns:mc="http://schemas.openxmlformats.org/markup-compatibility/2006" xmlns:aink="http://schemas.microsoft.com/office/drawing/2016/ink" xmlns:am3d="http://schemas.microsoft.com/office/drawing/2017/model3d" xmlns:o="urn:schemas-microsoft-com:office:office" xmlns:oel="http://schemas.microsoft.com/office/2019/extlst" xmlns:r="http://schemas.openxmlformats.org/officeDocument/2006/relationships" xmlns:m="http://schemas.openxmlformats.org/officeDocument/2006/math" xmlns:v="urn:schemas-microsoft-com:vml" xmlns:wp14="http://schemas.microsoft.com/office/word/2010/wordprocessingDrawing" xmlns:wp="http://schemas.openxmlformats.org/drawingml/2006/wordprocessingDrawing" xmlns:w10="urn:schemas-microsoft-com:office:word" xmlns:w="http://schemas.openxmlformats.org/wordprocessingml/2006/main" xmlns:w14="http://schemas.microsoft.com/office/word/2010/wordml" xmlns:w15="http://schemas.microsoft.com/office/word/2012/wordml" xmlns:w16cex="http://schemas.microsoft.com/office/word/2018/wordml/cex" xmlns:w16cid="http://schemas.microsoft.com/office/word/2016/wordml/cid" xmlns:w16="http://schemas.microsoft.com/office/word/2018/wordml" xmlns:w16sdtdh="http://schemas.microsoft.com/office/word/2020/wordml/sdtdatahash" xmlns:w16se="http://schemas.microsoft.com/office/word/2015/wordml/symex" xmlns:wpg="http://schemas.microsoft.com/office/word/2010/wordprocessingGroup" xmlns:wpi="http://schemas.microsoft.com/office/word/2010/wordprocessingInk" xmlns:wne="http://schemas.microsoft.com/office/word/2006/wordml" xmlns:wps="http://schemas.microsoft.com/office/word/2010/wordprocessingShape" mc:Ignorable="w14 w15 w16se w16cid w16 w16cex w16sdtdh wp14">
+<w:numbering xmlns:wpc="http://schemas.microsoft.com/office/word/2010/wordprocessingCanvas" xmlns:cx="http://schemas.microsoft.com/office/drawing/2014/chartex" xmlns:cx1="http://schemas.microsoft.com/office/drawing/2015/9/8/chartex" xmlns:cx2="http://schemas.microsoft.com/office/drawing/2015/10/21/chartex" xmlns:cx3="http://schemas.microsoft.com/office/drawing/2016/5/9/chartex" xmlns:cx4="http://schemas.microsoft.com/office/drawing/2016/5/10/chartex" xmlns:cx5="http://schemas.microsoft.com/office/drawing/2016/5/11/chartex" xmlns:cx6="http://schemas.microsoft.com/office/drawing/2016/5/12/chartex" xmlns:cx7="http://schemas.microsoft.com/office/drawing/2016/5/13/chartex" xmlns:cx8="http://schemas.microsoft.com/office/drawing/2016/5/14/chartex" xmlns:mc="http://schemas.openxmlformats.org/markup-compatibility/2006" xmlns:aink="http://schemas.microsoft.com/office/drawing/2016/ink" xmlns:am3d="http://schemas.microsoft.com/office/drawing/2017/model3d" xmlns:o="urn:schemas-microsoft-com:office:office" xmlns:oel="http://schemas.microsoft.com/office/2019/extlst" xmlns:r="http://schemas.openxmlformats.org/officeDocument/2006/relationships" xmlns:m="http://schemas.openxmlformats.org/officeDocument/2006/math" xmlns:v="urn:schemas-microsoft-com:vml" xmlns:wp14="http://schemas.microsoft.com/office/word/2010/wordprocessingDrawing" xmlns:wp="http://schemas.openxmlformats.org/drawingml/2006/wordprocessingDrawing" xmlns:w10="urn:schemas-microsoft-com:office:word" xmlns:w="http://schemas.openxmlformats.org/wordprocessingml/2006/main" xmlns:w14="http://schemas.microsoft.com/office/word/2010/wordml" xmlns:w15="http://schemas.microsoft.com/office/word/2012/wordml" xmlns:w16cex="http://schemas.microsoft.com/office/word/2018/wordml/cex" xmlns:w16cid="http://schemas.microsoft.com/office/word/2016/wordml/cid" xmlns:w16="http://schemas.microsoft.com/office/word/2018/wordml" xmlns:w16du="http://schemas.microsoft.com/office/word/2023/wordml/word16du" xmlns:w16sdtdh="http://schemas.microsoft.com/office/word/2020/wordml/sdtdatahash" xmlns:w16se="http://schemas.microsoft.com/office/word/2015/wordml/symex" xmlns:wpg="http://schemas.microsoft.com/office/word/2010/wordprocessingGroup" xmlns:wpi="http://schemas.microsoft.com/office/word/2010/wordprocessingInk" xmlns:wne="http://schemas.microsoft.com/office/word/2006/wordml" xmlns:wps="http://schemas.microsoft.com/office/word/2010/wordprocessingShape" mc:Ignorable="w14 w15 w16se w16cid w16 w16cex w16sdtdh w16du wp14">
   <w:abstractNum w:abstractNumId="0" w15:restartNumberingAfterBreak="0">
     <w:nsid w:val="21A746F0"/>
     <w:multiLevelType w:val="hybridMultilevel"/>
@@ -5198,7 +5355,7 @@
 </file>
 
 <file path=word/styles.xml><?xml version="1.0" encoding="utf-8"?>
-<w:styles xmlns:mc="http://schemas.openxmlformats.org/markup-compatibility/2006" xmlns:r="http://schemas.openxmlformats.org/officeDocument/2006/relationships" xmlns:w="http://schemas.openxmlformats.org/wordprocessingml/2006/main" xmlns:w14="http://schemas.microsoft.com/office/word/2010/wordml" xmlns:w15="http://schemas.microsoft.com/office/word/2012/wordml" xmlns:w16cex="http://schemas.microsoft.com/office/word/2018/wordml/cex" xmlns:w16cid="http://schemas.microsoft.com/office/word/2016/wordml/cid" xmlns:w16="http://schemas.microsoft.com/office/word/2018/wordml" xmlns:w16sdtdh="http://schemas.microsoft.com/office/word/2020/wordml/sdtdatahash" xmlns:w16se="http://schemas.microsoft.com/office/word/2015/wordml/symex" mc:Ignorable="w14 w15 w16se w16cid w16 w16cex w16sdtdh">
+<w:styles xmlns:mc="http://schemas.openxmlformats.org/markup-compatibility/2006" xmlns:r="http://schemas.openxmlformats.org/officeDocument/2006/relationships" xmlns:w="http://schemas.openxmlformats.org/wordprocessingml/2006/main" xmlns:w14="http://schemas.microsoft.com/office/word/2010/wordml" xmlns:w15="http://schemas.microsoft.com/office/word/2012/wordml" xmlns:w16cex="http://schemas.microsoft.com/office/word/2018/wordml/cex" xmlns:w16cid="http://schemas.microsoft.com/office/word/2016/wordml/cid" xmlns:w16="http://schemas.microsoft.com/office/word/2018/wordml" xmlns:w16du="http://schemas.microsoft.com/office/word/2023/wordml/word16du" xmlns:w16sdtdh="http://schemas.microsoft.com/office/word/2020/wordml/sdtdatahash" xmlns:w16se="http://schemas.microsoft.com/office/word/2015/wordml/symex" mc:Ignorable="w14 w15 w16se w16cid w16 w16cex w16sdtdh w16du">
   <w:docDefaults>
     <w:rPrDefault>
       <w:rPr>
@@ -5693,7 +5850,6 @@
   <w:style w:type="character" w:default="1" w:styleId="DefaultParagraphFont">
     <w:name w:val="Default Paragraph Font"/>
     <w:uiPriority w:val="1"/>
-    <w:semiHidden/>
     <w:unhideWhenUsed/>
   </w:style>
   <w:style w:type="table" w:default="1" w:styleId="TableNormal">
@@ -6483,6 +6639,16 @@
       <w:szCs w:val="26"/>
     </w:rPr>
   </w:style>
+  <w:style w:type="character" w:styleId="UnresolvedMention">
+    <w:name w:val="Unresolved Mention"/>
+    <w:basedOn w:val="DefaultParagraphFont"/>
+    <w:uiPriority w:val="99"/>
+    <w:rsid w:val="008A1280"/>
+    <w:rPr>
+      <w:color w:val="605E5C"/>
+      <w:shd w:val="clear" w:color="auto" w:fill="E1DFDD"/>
+    </w:rPr>
+  </w:style>
 </w:styles>
 </file>
 

</xml_diff>

<commit_message>
R png file bug fix due to package upgrade
</commit_message>
<xml_diff>
--- a/ExomeQcPipeline_Somatic_Template_interim.docx
+++ b/ExomeQcPipeline_Somatic_Template_interim.docx
@@ -2897,7 +2897,6 @@
         </w:rPr>
       </w:pPr>
       <w:bookmarkStart w:id="10" w:name="_Hlk178097706"/>
-      <w:bookmarkStart w:id="11" w:name="_Hlk178267229"/>
       <w:proofErr w:type="spellStart"/>
       <w:r>
         <w:rPr>
@@ -3187,7 +3186,6 @@
         <w:t>.</w:t>
       </w:r>
     </w:p>
-    <w:bookmarkEnd w:id="11"/>
     <w:p>
       <w:pPr>
         <w:rPr>
@@ -3213,52 +3211,16 @@
           <w:sz w:val="24"/>
           <w:szCs w:val="24"/>
         </w:rPr>
-        <w:t xml:space="preserve">Ancestry estimation </w:t>
-      </w:r>
-      <w:r>
-        <w:rPr>
-          <w:rFonts w:ascii="Cambria" w:hAnsi="Cambria"/>
-          <w:b/>
-          <w:sz w:val="24"/>
-          <w:szCs w:val="24"/>
-        </w:rPr>
-        <w:t>for all subjects</w:t>
-      </w:r>
-      <w:r>
-        <w:rPr>
-          <w:rFonts w:ascii="Cambria" w:hAnsi="Cambria"/>
-          <w:b/>
-          <w:sz w:val="24"/>
-          <w:szCs w:val="24"/>
-        </w:rPr>
-        <w:t>: top</w:t>
-      </w:r>
-      <w:r>
-        <w:rPr>
-          <w:rFonts w:ascii="Cambria" w:hAnsi="Cambria"/>
-          <w:b/>
-          <w:sz w:val="24"/>
-          <w:szCs w:val="24"/>
-        </w:rPr>
-        <w:t xml:space="preserve"> pc3 vs pc4 </w:t>
-      </w:r>
-      <w:r>
-        <w:rPr>
-          <w:rFonts w:ascii="Cambria" w:hAnsi="Cambria"/>
-          <w:b/>
-          <w:sz w:val="24"/>
-          <w:szCs w:val="24"/>
-        </w:rPr>
-        <w:t xml:space="preserve">bottom </w:t>
-      </w:r>
-      <w:r>
-        <w:rPr>
-          <w:rFonts w:ascii="Cambria" w:hAnsi="Cambria"/>
-          <w:b/>
-          <w:sz w:val="24"/>
-          <w:szCs w:val="24"/>
-        </w:rPr>
-        <w:t>pc1 vs pc2</w:t>
+        <w:t>E</w:t>
+      </w:r>
+      <w:r>
+        <w:rPr>
+          <w:rFonts w:ascii="Cambria" w:hAnsi="Cambria"/>
+          <w:b/>
+          <w:sz w:val="24"/>
+          <w:szCs w:val="24"/>
+        </w:rPr>
+        <w:t>stimation for all subjects has not been found in the document</w:t>
       </w:r>
       <w:r>
         <w:rPr>
@@ -3333,7 +3295,7 @@
       <w:pPr>
         <w:pStyle w:val="Heading1"/>
       </w:pPr>
-      <w:bookmarkStart w:id="12" w:name="_Toc48676183"/>
+      <w:bookmarkStart w:id="11" w:name="_Toc48676183"/>
       <w:r>
         <w:t>9</w:t>
       </w:r>
@@ -3343,7 +3305,7 @@
       <w:r>
         <w:t>POST-CALLING QC CHECK</w:t>
       </w:r>
-      <w:bookmarkEnd w:id="12"/>
+      <w:bookmarkEnd w:id="11"/>
       <w:r>
         <w:t xml:space="preserve"> </w:t>
       </w:r>
@@ -3457,7 +3419,7 @@
           <w:szCs w:val="24"/>
         </w:rPr>
       </w:pPr>
-      <w:bookmarkStart w:id="13" w:name="_Hlk177999519"/>
+      <w:bookmarkStart w:id="12" w:name="_Hlk177999519"/>
       <w:r>
         <w:rPr>
           <w:rFonts w:ascii="Cambria" w:hAnsi="Cambria"/>
@@ -3490,7 +3452,7 @@
         </w:rPr>
       </w:pPr>
     </w:p>
-    <w:bookmarkEnd w:id="13"/>
+    <w:bookmarkEnd w:id="12"/>
     <w:p>
       <w:pPr>
         <w:rPr>
@@ -3634,7 +3596,7 @@
       <w:pPr>
         <w:pStyle w:val="Heading1"/>
       </w:pPr>
-      <w:bookmarkStart w:id="14" w:name="_Toc48676184"/>
+      <w:bookmarkStart w:id="13" w:name="_Toc48676184"/>
       <w:r>
         <w:t>1</w:t>
       </w:r>
@@ -3650,7 +3612,7 @@
       <w:r>
         <w:t>MATCHER CHECK</w:t>
       </w:r>
-      <w:bookmarkEnd w:id="14"/>
+      <w:bookmarkEnd w:id="13"/>
     </w:p>
     <w:p>
       <w:pPr>
@@ -3777,7 +3739,6 @@
           <w:sz w:val="24"/>
           <w:szCs w:val="24"/>
         </w:rPr>
-        <w:lastRenderedPageBreak/>
         <w:t>Figure 11. scatter plot of testing site count against concordant rate</w:t>
       </w:r>
       <w:r>
@@ -3806,11 +3767,11 @@
       <w:pPr>
         <w:pStyle w:val="Heading1"/>
       </w:pPr>
-      <w:bookmarkStart w:id="15" w:name="_Toc48676185"/>
+      <w:bookmarkStart w:id="14" w:name="_Toc48676185"/>
       <w:r>
         <w:t>References</w:t>
       </w:r>
-      <w:bookmarkEnd w:id="15"/>
+      <w:bookmarkEnd w:id="14"/>
     </w:p>
     <w:p>
       <w:pPr>
@@ -4021,15 +3982,35 @@
         </w:rPr>
         <w:tab/>
       </w:r>
-      <w:bookmarkStart w:id="16" w:name="_Hlk178097786"/>
-      <w:r>
-        <w:rPr>
-          <w:rFonts w:ascii="Cambria" w:hAnsi="Cambria"/>
-          <w:bCs/>
-          <w:sz w:val="24"/>
-          <w:szCs w:val="24"/>
-        </w:rPr>
-        <w:t xml:space="preserve">Emil Jørsboe, Kristian Hanghøj, Anders Albrechtsen, fastNGSadmix: admixture proportions and principal component analysis of a single NGS sample, </w:t>
+      <w:bookmarkStart w:id="15" w:name="_Hlk178097786"/>
+      <w:r>
+        <w:rPr>
+          <w:rFonts w:ascii="Cambria" w:hAnsi="Cambria"/>
+          <w:bCs/>
+          <w:sz w:val="24"/>
+          <w:szCs w:val="24"/>
+        </w:rPr>
+        <w:t xml:space="preserve">Emil Jørsboe, Kristian Hanghøj, Anders Albrechtsen, </w:t>
+      </w:r>
+      <w:proofErr w:type="spellStart"/>
+      <w:r>
+        <w:rPr>
+          <w:rFonts w:ascii="Cambria" w:hAnsi="Cambria"/>
+          <w:bCs/>
+          <w:sz w:val="24"/>
+          <w:szCs w:val="24"/>
+        </w:rPr>
+        <w:t>fastNGSadmix</w:t>
+      </w:r>
+      <w:proofErr w:type="spellEnd"/>
+      <w:r>
+        <w:rPr>
+          <w:rFonts w:ascii="Cambria" w:hAnsi="Cambria"/>
+          <w:bCs/>
+          <w:sz w:val="24"/>
+          <w:szCs w:val="24"/>
+        </w:rPr>
+        <w:t xml:space="preserve">: admixture proportions and principal component analysis of a single NGS sample, </w:t>
       </w:r>
       <w:r>
         <w:rPr>
@@ -4090,7 +4071,7 @@
         </w:rPr>
         <w:t>).</w:t>
       </w:r>
-      <w:bookmarkEnd w:id="16"/>
+      <w:bookmarkEnd w:id="15"/>
     </w:p>
     <w:p>
       <w:pPr>
@@ -5869,7 +5850,6 @@
   <w:style w:type="character" w:default="1" w:styleId="DefaultParagraphFont">
     <w:name w:val="Default Paragraph Font"/>
     <w:uiPriority w:val="1"/>
-    <w:semiHidden/>
     <w:unhideWhenUsed/>
   </w:style>
   <w:style w:type="table" w:default="1" w:styleId="TableNormal">

</xml_diff>

<commit_message>
exomeQC pipeline upgrade of 1, adding wgs somatic pair mode; 2, set yaml config file automatic opting hg19/hg38 database files; 3, somatic tumor normal pair manifest explanation
</commit_message>
<xml_diff>
--- a/ExomeQcPipeline_Somatic_Template_interim.docx
+++ b/ExomeQcPipeline_Somatic_Template_interim.docx
@@ -1,6 +1,6 @@
 
 <file path=word/document.xml><?xml version="1.0" encoding="utf-8"?>
-<w:document xmlns:wpc="http://schemas.microsoft.com/office/word/2010/wordprocessingCanvas" xmlns:cx="http://schemas.microsoft.com/office/drawing/2014/chartex" xmlns:cx1="http://schemas.microsoft.com/office/drawing/2015/9/8/chartex" xmlns:cx2="http://schemas.microsoft.com/office/drawing/2015/10/21/chartex" xmlns:cx3="http://schemas.microsoft.com/office/drawing/2016/5/9/chartex" xmlns:cx4="http://schemas.microsoft.com/office/drawing/2016/5/10/chartex" xmlns:cx5="http://schemas.microsoft.com/office/drawing/2016/5/11/chartex" xmlns:cx6="http://schemas.microsoft.com/office/drawing/2016/5/12/chartex" xmlns:cx7="http://schemas.microsoft.com/office/drawing/2016/5/13/chartex" xmlns:cx8="http://schemas.microsoft.com/office/drawing/2016/5/14/chartex" xmlns:mc="http://schemas.openxmlformats.org/markup-compatibility/2006" xmlns:aink="http://schemas.microsoft.com/office/drawing/2016/ink" xmlns:am3d="http://schemas.microsoft.com/office/drawing/2017/model3d" xmlns:o="urn:schemas-microsoft-com:office:office" xmlns:oel="http://schemas.microsoft.com/office/2019/extlst" xmlns:r="http://schemas.openxmlformats.org/officeDocument/2006/relationships" xmlns:m="http://schemas.openxmlformats.org/officeDocument/2006/math" xmlns:v="urn:schemas-microsoft-com:vml" xmlns:wp14="http://schemas.microsoft.com/office/word/2010/wordprocessingDrawing" xmlns:wp="http://schemas.openxmlformats.org/drawingml/2006/wordprocessingDrawing" xmlns:w10="urn:schemas-microsoft-com:office:word" xmlns:w="http://schemas.openxmlformats.org/wordprocessingml/2006/main" xmlns:w14="http://schemas.microsoft.com/office/word/2010/wordml" xmlns:w15="http://schemas.microsoft.com/office/word/2012/wordml" xmlns:w16cex="http://schemas.microsoft.com/office/word/2018/wordml/cex" xmlns:w16cid="http://schemas.microsoft.com/office/word/2016/wordml/cid" xmlns:w16="http://schemas.microsoft.com/office/word/2018/wordml" xmlns:w16du="http://schemas.microsoft.com/office/word/2023/wordml/word16du" xmlns:w16sdtdh="http://schemas.microsoft.com/office/word/2020/wordml/sdtdatahash" xmlns:w16se="http://schemas.microsoft.com/office/word/2015/wordml/symex" xmlns:wpg="http://schemas.microsoft.com/office/word/2010/wordprocessingGroup" xmlns:wpi="http://schemas.microsoft.com/office/word/2010/wordprocessingInk" xmlns:wne="http://schemas.microsoft.com/office/word/2006/wordml" xmlns:wps="http://schemas.microsoft.com/office/word/2010/wordprocessingShape" mc:Ignorable="w14 w15 w16se w16cid w16 w16cex w16sdtdh w16du wp14">
+<w:document xmlns:wpc="http://schemas.microsoft.com/office/word/2010/wordprocessingCanvas" xmlns:cx="http://schemas.microsoft.com/office/drawing/2014/chartex" xmlns:cx1="http://schemas.microsoft.com/office/drawing/2015/9/8/chartex" xmlns:cx2="http://schemas.microsoft.com/office/drawing/2015/10/21/chartex" xmlns:cx3="http://schemas.microsoft.com/office/drawing/2016/5/9/chartex" xmlns:cx4="http://schemas.microsoft.com/office/drawing/2016/5/10/chartex" xmlns:cx5="http://schemas.microsoft.com/office/drawing/2016/5/11/chartex" xmlns:cx6="http://schemas.microsoft.com/office/drawing/2016/5/12/chartex" xmlns:cx7="http://schemas.microsoft.com/office/drawing/2016/5/13/chartex" xmlns:cx8="http://schemas.microsoft.com/office/drawing/2016/5/14/chartex" xmlns:mc="http://schemas.openxmlformats.org/markup-compatibility/2006" xmlns:aink="http://schemas.microsoft.com/office/drawing/2016/ink" xmlns:am3d="http://schemas.microsoft.com/office/drawing/2017/model3d" xmlns:o="urn:schemas-microsoft-com:office:office" xmlns:oel="http://schemas.microsoft.com/office/2019/extlst" xmlns:r="http://schemas.openxmlformats.org/officeDocument/2006/relationships" xmlns:m="http://schemas.openxmlformats.org/officeDocument/2006/math" xmlns:v="urn:schemas-microsoft-com:vml" xmlns:wp14="http://schemas.microsoft.com/office/word/2010/wordprocessingDrawing" xmlns:wp="http://schemas.openxmlformats.org/drawingml/2006/wordprocessingDrawing" xmlns:w10="urn:schemas-microsoft-com:office:word" xmlns:w="http://schemas.openxmlformats.org/wordprocessingml/2006/main" xmlns:w14="http://schemas.microsoft.com/office/word/2010/wordml" xmlns:w15="http://schemas.microsoft.com/office/word/2012/wordml" xmlns:w16cex="http://schemas.microsoft.com/office/word/2018/wordml/cex" xmlns:w16cid="http://schemas.microsoft.com/office/word/2016/wordml/cid" xmlns:w16="http://schemas.microsoft.com/office/word/2018/wordml" xmlns:w16du="http://schemas.microsoft.com/office/word/2023/wordml/word16du" xmlns:w16sdtdh="http://schemas.microsoft.com/office/word/2020/wordml/sdtdatahash" xmlns:w16sdtfl="http://schemas.microsoft.com/office/word/2024/wordml/sdtformatlock" xmlns:w16se="http://schemas.microsoft.com/office/word/2015/wordml/symex" xmlns:wpg="http://schemas.microsoft.com/office/word/2010/wordprocessingGroup" xmlns:wpi="http://schemas.microsoft.com/office/word/2010/wordprocessingInk" xmlns:wne="http://schemas.microsoft.com/office/word/2006/wordml" xmlns:wps="http://schemas.microsoft.com/office/word/2010/wordprocessingShape" mc:Ignorable="w14 w15 w16se w16cid w16 w16cex w16sdtdh w16sdtfl w16du wp14">
   <w:body>
     <w:p>
       <w:pPr>
@@ -3211,40 +3211,22 @@
           <w:sz w:val="24"/>
           <w:szCs w:val="24"/>
         </w:rPr>
-        <w:t>E</w:t>
-      </w:r>
-      <w:r>
-        <w:rPr>
-          <w:rFonts w:ascii="Cambria" w:hAnsi="Cambria"/>
-          <w:b/>
-          <w:sz w:val="24"/>
-          <w:szCs w:val="24"/>
-        </w:rPr>
-        <w:t>stimation for all subjects has not been found in the document</w:t>
-      </w:r>
-      <w:r>
-        <w:rPr>
-          <w:rFonts w:ascii="Cambria" w:hAnsi="Cambria"/>
-          <w:b/>
-          <w:sz w:val="24"/>
-          <w:szCs w:val="24"/>
-        </w:rPr>
-        <w:t xml:space="preserve">.  </w:t>
-      </w:r>
-    </w:p>
-    <w:p>
-      <w:pPr>
-        <w:rPr>
-          <w:rFonts w:ascii="Cambria" w:hAnsi="Cambria"/>
-          <w:bCs/>
-          <w:sz w:val="24"/>
-          <w:szCs w:val="24"/>
-        </w:rPr>
-      </w:pPr>
-      <w:r>
-        <w:rPr>
-          <w:rFonts w:ascii="Cambria" w:hAnsi="Cambria"/>
-          <w:bCs/>
+        <w:t xml:space="preserve">Ancestry estimation for all subjects: top 2 plots showing reference only, bottom 2 plots showing study subjects, black projected to reference samples, grey.  </w:t>
+      </w:r>
+    </w:p>
+    <w:p>
+      <w:pPr>
+        <w:rPr>
+          <w:rFonts w:ascii="Cambria" w:hAnsi="Cambria"/>
+          <w:b/>
+          <w:sz w:val="24"/>
+          <w:szCs w:val="24"/>
+        </w:rPr>
+      </w:pPr>
+      <w:r>
+        <w:rPr>
+          <w:rFonts w:ascii="Cambria" w:hAnsi="Cambria"/>
+          <w:b/>
           <w:sz w:val="24"/>
           <w:szCs w:val="24"/>
         </w:rPr>
@@ -3990,27 +3972,7 @@
           <w:sz w:val="24"/>
           <w:szCs w:val="24"/>
         </w:rPr>
-        <w:t xml:space="preserve">Emil Jørsboe, Kristian Hanghøj, Anders Albrechtsen, </w:t>
-      </w:r>
-      <w:proofErr w:type="spellStart"/>
-      <w:r>
-        <w:rPr>
-          <w:rFonts w:ascii="Cambria" w:hAnsi="Cambria"/>
-          <w:bCs/>
-          <w:sz w:val="24"/>
-          <w:szCs w:val="24"/>
-        </w:rPr>
-        <w:t>fastNGSadmix</w:t>
-      </w:r>
-      <w:proofErr w:type="spellEnd"/>
-      <w:r>
-        <w:rPr>
-          <w:rFonts w:ascii="Cambria" w:hAnsi="Cambria"/>
-          <w:bCs/>
-          <w:sz w:val="24"/>
-          <w:szCs w:val="24"/>
-        </w:rPr>
-        <w:t xml:space="preserve">: admixture proportions and principal component analysis of a single NGS sample, </w:t>
+        <w:t xml:space="preserve">Emil Jørsboe, Kristian Hanghøj, Anders Albrechtsen, fastNGSadmix: admixture proportions and principal component analysis of a single NGS sample, </w:t>
       </w:r>
       <w:r>
         <w:rPr>
@@ -4236,7 +4198,7 @@
 </file>
 
 <file path=word/endnotes.xml><?xml version="1.0" encoding="utf-8"?>
-<w:endnotes xmlns:wpc="http://schemas.microsoft.com/office/word/2010/wordprocessingCanvas" xmlns:cx="http://schemas.microsoft.com/office/drawing/2014/chartex" xmlns:cx1="http://schemas.microsoft.com/office/drawing/2015/9/8/chartex" xmlns:cx2="http://schemas.microsoft.com/office/drawing/2015/10/21/chartex" xmlns:cx3="http://schemas.microsoft.com/office/drawing/2016/5/9/chartex" xmlns:cx4="http://schemas.microsoft.com/office/drawing/2016/5/10/chartex" xmlns:cx5="http://schemas.microsoft.com/office/drawing/2016/5/11/chartex" xmlns:cx6="http://schemas.microsoft.com/office/drawing/2016/5/12/chartex" xmlns:cx7="http://schemas.microsoft.com/office/drawing/2016/5/13/chartex" xmlns:cx8="http://schemas.microsoft.com/office/drawing/2016/5/14/chartex" xmlns:mc="http://schemas.openxmlformats.org/markup-compatibility/2006" xmlns:aink="http://schemas.microsoft.com/office/drawing/2016/ink" xmlns:am3d="http://schemas.microsoft.com/office/drawing/2017/model3d" xmlns:o="urn:schemas-microsoft-com:office:office" xmlns:oel="http://schemas.microsoft.com/office/2019/extlst" xmlns:r="http://schemas.openxmlformats.org/officeDocument/2006/relationships" xmlns:m="http://schemas.openxmlformats.org/officeDocument/2006/math" xmlns:v="urn:schemas-microsoft-com:vml" xmlns:wp14="http://schemas.microsoft.com/office/word/2010/wordprocessingDrawing" xmlns:wp="http://schemas.openxmlformats.org/drawingml/2006/wordprocessingDrawing" xmlns:w10="urn:schemas-microsoft-com:office:word" xmlns:w="http://schemas.openxmlformats.org/wordprocessingml/2006/main" xmlns:w14="http://schemas.microsoft.com/office/word/2010/wordml" xmlns:w15="http://schemas.microsoft.com/office/word/2012/wordml" xmlns:w16cex="http://schemas.microsoft.com/office/word/2018/wordml/cex" xmlns:w16cid="http://schemas.microsoft.com/office/word/2016/wordml/cid" xmlns:w16="http://schemas.microsoft.com/office/word/2018/wordml" xmlns:w16du="http://schemas.microsoft.com/office/word/2023/wordml/word16du" xmlns:w16sdtdh="http://schemas.microsoft.com/office/word/2020/wordml/sdtdatahash" xmlns:w16se="http://schemas.microsoft.com/office/word/2015/wordml/symex" xmlns:wpg="http://schemas.microsoft.com/office/word/2010/wordprocessingGroup" xmlns:wpi="http://schemas.microsoft.com/office/word/2010/wordprocessingInk" xmlns:wne="http://schemas.microsoft.com/office/word/2006/wordml" xmlns:wps="http://schemas.microsoft.com/office/word/2010/wordprocessingShape" mc:Ignorable="w14 w15 w16se w16cid w16 w16cex w16sdtdh w16du wp14">
+<w:endnotes xmlns:wpc="http://schemas.microsoft.com/office/word/2010/wordprocessingCanvas" xmlns:cx="http://schemas.microsoft.com/office/drawing/2014/chartex" xmlns:cx1="http://schemas.microsoft.com/office/drawing/2015/9/8/chartex" xmlns:cx2="http://schemas.microsoft.com/office/drawing/2015/10/21/chartex" xmlns:cx3="http://schemas.microsoft.com/office/drawing/2016/5/9/chartex" xmlns:cx4="http://schemas.microsoft.com/office/drawing/2016/5/10/chartex" xmlns:cx5="http://schemas.microsoft.com/office/drawing/2016/5/11/chartex" xmlns:cx6="http://schemas.microsoft.com/office/drawing/2016/5/12/chartex" xmlns:cx7="http://schemas.microsoft.com/office/drawing/2016/5/13/chartex" xmlns:cx8="http://schemas.microsoft.com/office/drawing/2016/5/14/chartex" xmlns:mc="http://schemas.openxmlformats.org/markup-compatibility/2006" xmlns:aink="http://schemas.microsoft.com/office/drawing/2016/ink" xmlns:am3d="http://schemas.microsoft.com/office/drawing/2017/model3d" xmlns:o="urn:schemas-microsoft-com:office:office" xmlns:oel="http://schemas.microsoft.com/office/2019/extlst" xmlns:r="http://schemas.openxmlformats.org/officeDocument/2006/relationships" xmlns:m="http://schemas.openxmlformats.org/officeDocument/2006/math" xmlns:v="urn:schemas-microsoft-com:vml" xmlns:wp14="http://schemas.microsoft.com/office/word/2010/wordprocessingDrawing" xmlns:wp="http://schemas.openxmlformats.org/drawingml/2006/wordprocessingDrawing" xmlns:w10="urn:schemas-microsoft-com:office:word" xmlns:w="http://schemas.openxmlformats.org/wordprocessingml/2006/main" xmlns:w14="http://schemas.microsoft.com/office/word/2010/wordml" xmlns:w15="http://schemas.microsoft.com/office/word/2012/wordml" xmlns:w16cex="http://schemas.microsoft.com/office/word/2018/wordml/cex" xmlns:w16cid="http://schemas.microsoft.com/office/word/2016/wordml/cid" xmlns:w16="http://schemas.microsoft.com/office/word/2018/wordml" xmlns:w16du="http://schemas.microsoft.com/office/word/2023/wordml/word16du" xmlns:w16sdtdh="http://schemas.microsoft.com/office/word/2020/wordml/sdtdatahash" xmlns:w16sdtfl="http://schemas.microsoft.com/office/word/2024/wordml/sdtformatlock" xmlns:w16se="http://schemas.microsoft.com/office/word/2015/wordml/symex" xmlns:wpg="http://schemas.microsoft.com/office/word/2010/wordprocessingGroup" xmlns:wpi="http://schemas.microsoft.com/office/word/2010/wordprocessingInk" xmlns:wne="http://schemas.microsoft.com/office/word/2006/wordml" xmlns:wps="http://schemas.microsoft.com/office/word/2010/wordprocessingShape" mc:Ignorable="w14 w15 w16se w16cid w16 w16cex w16sdtdh w16sdtfl w16du wp14">
   <w:endnote w:type="separator" w:id="-1">
     <w:p>
       <w:pPr>
@@ -4261,7 +4223,7 @@
 </file>
 
 <file path=word/footer1.xml><?xml version="1.0" encoding="utf-8"?>
-<w:ftr xmlns:wpc="http://schemas.microsoft.com/office/word/2010/wordprocessingCanvas" xmlns:cx="http://schemas.microsoft.com/office/drawing/2014/chartex" xmlns:cx1="http://schemas.microsoft.com/office/drawing/2015/9/8/chartex" xmlns:cx2="http://schemas.microsoft.com/office/drawing/2015/10/21/chartex" xmlns:cx3="http://schemas.microsoft.com/office/drawing/2016/5/9/chartex" xmlns:cx4="http://schemas.microsoft.com/office/drawing/2016/5/10/chartex" xmlns:cx5="http://schemas.microsoft.com/office/drawing/2016/5/11/chartex" xmlns:cx6="http://schemas.microsoft.com/office/drawing/2016/5/12/chartex" xmlns:cx7="http://schemas.microsoft.com/office/drawing/2016/5/13/chartex" xmlns:cx8="http://schemas.microsoft.com/office/drawing/2016/5/14/chartex" xmlns:mc="http://schemas.openxmlformats.org/markup-compatibility/2006" xmlns:aink="http://schemas.microsoft.com/office/drawing/2016/ink" xmlns:am3d="http://schemas.microsoft.com/office/drawing/2017/model3d" xmlns:o="urn:schemas-microsoft-com:office:office" xmlns:oel="http://schemas.microsoft.com/office/2019/extlst" xmlns:r="http://schemas.openxmlformats.org/officeDocument/2006/relationships" xmlns:m="http://schemas.openxmlformats.org/officeDocument/2006/math" xmlns:v="urn:schemas-microsoft-com:vml" xmlns:wp14="http://schemas.microsoft.com/office/word/2010/wordprocessingDrawing" xmlns:wp="http://schemas.openxmlformats.org/drawingml/2006/wordprocessingDrawing" xmlns:w10="urn:schemas-microsoft-com:office:word" xmlns:w="http://schemas.openxmlformats.org/wordprocessingml/2006/main" xmlns:w14="http://schemas.microsoft.com/office/word/2010/wordml" xmlns:w15="http://schemas.microsoft.com/office/word/2012/wordml" xmlns:w16cex="http://schemas.microsoft.com/office/word/2018/wordml/cex" xmlns:w16cid="http://schemas.microsoft.com/office/word/2016/wordml/cid" xmlns:w16="http://schemas.microsoft.com/office/word/2018/wordml" xmlns:w16du="http://schemas.microsoft.com/office/word/2023/wordml/word16du" xmlns:w16sdtdh="http://schemas.microsoft.com/office/word/2020/wordml/sdtdatahash" xmlns:w16se="http://schemas.microsoft.com/office/word/2015/wordml/symex" xmlns:wpg="http://schemas.microsoft.com/office/word/2010/wordprocessingGroup" xmlns:wpi="http://schemas.microsoft.com/office/word/2010/wordprocessingInk" xmlns:wne="http://schemas.microsoft.com/office/word/2006/wordml" xmlns:wps="http://schemas.microsoft.com/office/word/2010/wordprocessingShape" mc:Ignorable="w14 w15 w16se w16cid w16 w16cex w16sdtdh w16du wp14">
+<w:ftr xmlns:wpc="http://schemas.microsoft.com/office/word/2010/wordprocessingCanvas" xmlns:cx="http://schemas.microsoft.com/office/drawing/2014/chartex" xmlns:cx1="http://schemas.microsoft.com/office/drawing/2015/9/8/chartex" xmlns:cx2="http://schemas.microsoft.com/office/drawing/2015/10/21/chartex" xmlns:cx3="http://schemas.microsoft.com/office/drawing/2016/5/9/chartex" xmlns:cx4="http://schemas.microsoft.com/office/drawing/2016/5/10/chartex" xmlns:cx5="http://schemas.microsoft.com/office/drawing/2016/5/11/chartex" xmlns:cx6="http://schemas.microsoft.com/office/drawing/2016/5/12/chartex" xmlns:cx7="http://schemas.microsoft.com/office/drawing/2016/5/13/chartex" xmlns:cx8="http://schemas.microsoft.com/office/drawing/2016/5/14/chartex" xmlns:mc="http://schemas.openxmlformats.org/markup-compatibility/2006" xmlns:aink="http://schemas.microsoft.com/office/drawing/2016/ink" xmlns:am3d="http://schemas.microsoft.com/office/drawing/2017/model3d" xmlns:o="urn:schemas-microsoft-com:office:office" xmlns:oel="http://schemas.microsoft.com/office/2019/extlst" xmlns:r="http://schemas.openxmlformats.org/officeDocument/2006/relationships" xmlns:m="http://schemas.openxmlformats.org/officeDocument/2006/math" xmlns:v="urn:schemas-microsoft-com:vml" xmlns:wp14="http://schemas.microsoft.com/office/word/2010/wordprocessingDrawing" xmlns:wp="http://schemas.openxmlformats.org/drawingml/2006/wordprocessingDrawing" xmlns:w10="urn:schemas-microsoft-com:office:word" xmlns:w="http://schemas.openxmlformats.org/wordprocessingml/2006/main" xmlns:w14="http://schemas.microsoft.com/office/word/2010/wordml" xmlns:w15="http://schemas.microsoft.com/office/word/2012/wordml" xmlns:w16cex="http://schemas.microsoft.com/office/word/2018/wordml/cex" xmlns:w16cid="http://schemas.microsoft.com/office/word/2016/wordml/cid" xmlns:w16="http://schemas.microsoft.com/office/word/2018/wordml" xmlns:w16du="http://schemas.microsoft.com/office/word/2023/wordml/word16du" xmlns:w16sdtdh="http://schemas.microsoft.com/office/word/2020/wordml/sdtdatahash" xmlns:w16sdtfl="http://schemas.microsoft.com/office/word/2024/wordml/sdtformatlock" xmlns:w16se="http://schemas.microsoft.com/office/word/2015/wordml/symex" xmlns:wpg="http://schemas.microsoft.com/office/word/2010/wordprocessingGroup" xmlns:wpi="http://schemas.microsoft.com/office/word/2010/wordprocessingInk" xmlns:wne="http://schemas.microsoft.com/office/word/2006/wordml" xmlns:wps="http://schemas.microsoft.com/office/word/2010/wordprocessingShape" mc:Ignorable="w14 w15 w16se w16cid w16 w16cex w16sdtdh w16sdtfl w16du wp14">
   <w:p>
     <w:pPr>
       <w:pStyle w:val="Footer"/>
@@ -4298,7 +4260,7 @@
 </file>
 
 <file path=word/footer2.xml><?xml version="1.0" encoding="utf-8"?>
-<w:ftr xmlns:wpc="http://schemas.microsoft.com/office/word/2010/wordprocessingCanvas" xmlns:cx="http://schemas.microsoft.com/office/drawing/2014/chartex" xmlns:cx1="http://schemas.microsoft.com/office/drawing/2015/9/8/chartex" xmlns:cx2="http://schemas.microsoft.com/office/drawing/2015/10/21/chartex" xmlns:cx3="http://schemas.microsoft.com/office/drawing/2016/5/9/chartex" xmlns:cx4="http://schemas.microsoft.com/office/drawing/2016/5/10/chartex" xmlns:cx5="http://schemas.microsoft.com/office/drawing/2016/5/11/chartex" xmlns:cx6="http://schemas.microsoft.com/office/drawing/2016/5/12/chartex" xmlns:cx7="http://schemas.microsoft.com/office/drawing/2016/5/13/chartex" xmlns:cx8="http://schemas.microsoft.com/office/drawing/2016/5/14/chartex" xmlns:mc="http://schemas.openxmlformats.org/markup-compatibility/2006" xmlns:aink="http://schemas.microsoft.com/office/drawing/2016/ink" xmlns:am3d="http://schemas.microsoft.com/office/drawing/2017/model3d" xmlns:o="urn:schemas-microsoft-com:office:office" xmlns:oel="http://schemas.microsoft.com/office/2019/extlst" xmlns:r="http://schemas.openxmlformats.org/officeDocument/2006/relationships" xmlns:m="http://schemas.openxmlformats.org/officeDocument/2006/math" xmlns:v="urn:schemas-microsoft-com:vml" xmlns:wp14="http://schemas.microsoft.com/office/word/2010/wordprocessingDrawing" xmlns:wp="http://schemas.openxmlformats.org/drawingml/2006/wordprocessingDrawing" xmlns:w10="urn:schemas-microsoft-com:office:word" xmlns:w="http://schemas.openxmlformats.org/wordprocessingml/2006/main" xmlns:w14="http://schemas.microsoft.com/office/word/2010/wordml" xmlns:w15="http://schemas.microsoft.com/office/word/2012/wordml" xmlns:w16cex="http://schemas.microsoft.com/office/word/2018/wordml/cex" xmlns:w16cid="http://schemas.microsoft.com/office/word/2016/wordml/cid" xmlns:w16="http://schemas.microsoft.com/office/word/2018/wordml" xmlns:w16du="http://schemas.microsoft.com/office/word/2023/wordml/word16du" xmlns:w16sdtdh="http://schemas.microsoft.com/office/word/2020/wordml/sdtdatahash" xmlns:w16se="http://schemas.microsoft.com/office/word/2015/wordml/symex" xmlns:wpg="http://schemas.microsoft.com/office/word/2010/wordprocessingGroup" xmlns:wpi="http://schemas.microsoft.com/office/word/2010/wordprocessingInk" xmlns:wne="http://schemas.microsoft.com/office/word/2006/wordml" xmlns:wps="http://schemas.microsoft.com/office/word/2010/wordprocessingShape" mc:Ignorable="w14 w15 w16se w16cid w16 w16cex w16sdtdh w16du wp14">
+<w:ftr xmlns:wpc="http://schemas.microsoft.com/office/word/2010/wordprocessingCanvas" xmlns:cx="http://schemas.microsoft.com/office/drawing/2014/chartex" xmlns:cx1="http://schemas.microsoft.com/office/drawing/2015/9/8/chartex" xmlns:cx2="http://schemas.microsoft.com/office/drawing/2015/10/21/chartex" xmlns:cx3="http://schemas.microsoft.com/office/drawing/2016/5/9/chartex" xmlns:cx4="http://schemas.microsoft.com/office/drawing/2016/5/10/chartex" xmlns:cx5="http://schemas.microsoft.com/office/drawing/2016/5/11/chartex" xmlns:cx6="http://schemas.microsoft.com/office/drawing/2016/5/12/chartex" xmlns:cx7="http://schemas.microsoft.com/office/drawing/2016/5/13/chartex" xmlns:cx8="http://schemas.microsoft.com/office/drawing/2016/5/14/chartex" xmlns:mc="http://schemas.openxmlformats.org/markup-compatibility/2006" xmlns:aink="http://schemas.microsoft.com/office/drawing/2016/ink" xmlns:am3d="http://schemas.microsoft.com/office/drawing/2017/model3d" xmlns:o="urn:schemas-microsoft-com:office:office" xmlns:oel="http://schemas.microsoft.com/office/2019/extlst" xmlns:r="http://schemas.openxmlformats.org/officeDocument/2006/relationships" xmlns:m="http://schemas.openxmlformats.org/officeDocument/2006/math" xmlns:v="urn:schemas-microsoft-com:vml" xmlns:wp14="http://schemas.microsoft.com/office/word/2010/wordprocessingDrawing" xmlns:wp="http://schemas.openxmlformats.org/drawingml/2006/wordprocessingDrawing" xmlns:w10="urn:schemas-microsoft-com:office:word" xmlns:w="http://schemas.openxmlformats.org/wordprocessingml/2006/main" xmlns:w14="http://schemas.microsoft.com/office/word/2010/wordml" xmlns:w15="http://schemas.microsoft.com/office/word/2012/wordml" xmlns:w16cex="http://schemas.microsoft.com/office/word/2018/wordml/cex" xmlns:w16cid="http://schemas.microsoft.com/office/word/2016/wordml/cid" xmlns:w16="http://schemas.microsoft.com/office/word/2018/wordml" xmlns:w16du="http://schemas.microsoft.com/office/word/2023/wordml/word16du" xmlns:w16sdtdh="http://schemas.microsoft.com/office/word/2020/wordml/sdtdatahash" xmlns:w16sdtfl="http://schemas.microsoft.com/office/word/2024/wordml/sdtformatlock" xmlns:w16se="http://schemas.microsoft.com/office/word/2015/wordml/symex" xmlns:wpg="http://schemas.microsoft.com/office/word/2010/wordprocessingGroup" xmlns:wpi="http://schemas.microsoft.com/office/word/2010/wordprocessingInk" xmlns:wne="http://schemas.microsoft.com/office/word/2006/wordml" xmlns:wps="http://schemas.microsoft.com/office/word/2010/wordprocessingShape" mc:Ignorable="w14 w15 w16se w16cid w16 w16cex w16sdtdh w16sdtfl w16du wp14">
   <w:p>
     <w:pPr>
       <w:pStyle w:val="Footer"/>
@@ -4348,7 +4310,7 @@
 </file>
 
 <file path=word/footnotes.xml><?xml version="1.0" encoding="utf-8"?>
-<w:footnotes xmlns:wpc="http://schemas.microsoft.com/office/word/2010/wordprocessingCanvas" xmlns:cx="http://schemas.microsoft.com/office/drawing/2014/chartex" xmlns:cx1="http://schemas.microsoft.com/office/drawing/2015/9/8/chartex" xmlns:cx2="http://schemas.microsoft.com/office/drawing/2015/10/21/chartex" xmlns:cx3="http://schemas.microsoft.com/office/drawing/2016/5/9/chartex" xmlns:cx4="http://schemas.microsoft.com/office/drawing/2016/5/10/chartex" xmlns:cx5="http://schemas.microsoft.com/office/drawing/2016/5/11/chartex" xmlns:cx6="http://schemas.microsoft.com/office/drawing/2016/5/12/chartex" xmlns:cx7="http://schemas.microsoft.com/office/drawing/2016/5/13/chartex" xmlns:cx8="http://schemas.microsoft.com/office/drawing/2016/5/14/chartex" xmlns:mc="http://schemas.openxmlformats.org/markup-compatibility/2006" xmlns:aink="http://schemas.microsoft.com/office/drawing/2016/ink" xmlns:am3d="http://schemas.microsoft.com/office/drawing/2017/model3d" xmlns:o="urn:schemas-microsoft-com:office:office" xmlns:oel="http://schemas.microsoft.com/office/2019/extlst" xmlns:r="http://schemas.openxmlformats.org/officeDocument/2006/relationships" xmlns:m="http://schemas.openxmlformats.org/officeDocument/2006/math" xmlns:v="urn:schemas-microsoft-com:vml" xmlns:wp14="http://schemas.microsoft.com/office/word/2010/wordprocessingDrawing" xmlns:wp="http://schemas.openxmlformats.org/drawingml/2006/wordprocessingDrawing" xmlns:w10="urn:schemas-microsoft-com:office:word" xmlns:w="http://schemas.openxmlformats.org/wordprocessingml/2006/main" xmlns:w14="http://schemas.microsoft.com/office/word/2010/wordml" xmlns:w15="http://schemas.microsoft.com/office/word/2012/wordml" xmlns:w16cex="http://schemas.microsoft.com/office/word/2018/wordml/cex" xmlns:w16cid="http://schemas.microsoft.com/office/word/2016/wordml/cid" xmlns:w16="http://schemas.microsoft.com/office/word/2018/wordml" xmlns:w16du="http://schemas.microsoft.com/office/word/2023/wordml/word16du" xmlns:w16sdtdh="http://schemas.microsoft.com/office/word/2020/wordml/sdtdatahash" xmlns:w16se="http://schemas.microsoft.com/office/word/2015/wordml/symex" xmlns:wpg="http://schemas.microsoft.com/office/word/2010/wordprocessingGroup" xmlns:wpi="http://schemas.microsoft.com/office/word/2010/wordprocessingInk" xmlns:wne="http://schemas.microsoft.com/office/word/2006/wordml" xmlns:wps="http://schemas.microsoft.com/office/word/2010/wordprocessingShape" mc:Ignorable="w14 w15 w16se w16cid w16 w16cex w16sdtdh w16du wp14">
+<w:footnotes xmlns:wpc="http://schemas.microsoft.com/office/word/2010/wordprocessingCanvas" xmlns:cx="http://schemas.microsoft.com/office/drawing/2014/chartex" xmlns:cx1="http://schemas.microsoft.com/office/drawing/2015/9/8/chartex" xmlns:cx2="http://schemas.microsoft.com/office/drawing/2015/10/21/chartex" xmlns:cx3="http://schemas.microsoft.com/office/drawing/2016/5/9/chartex" xmlns:cx4="http://schemas.microsoft.com/office/drawing/2016/5/10/chartex" xmlns:cx5="http://schemas.microsoft.com/office/drawing/2016/5/11/chartex" xmlns:cx6="http://schemas.microsoft.com/office/drawing/2016/5/12/chartex" xmlns:cx7="http://schemas.microsoft.com/office/drawing/2016/5/13/chartex" xmlns:cx8="http://schemas.microsoft.com/office/drawing/2016/5/14/chartex" xmlns:mc="http://schemas.openxmlformats.org/markup-compatibility/2006" xmlns:aink="http://schemas.microsoft.com/office/drawing/2016/ink" xmlns:am3d="http://schemas.microsoft.com/office/drawing/2017/model3d" xmlns:o="urn:schemas-microsoft-com:office:office" xmlns:oel="http://schemas.microsoft.com/office/2019/extlst" xmlns:r="http://schemas.openxmlformats.org/officeDocument/2006/relationships" xmlns:m="http://schemas.openxmlformats.org/officeDocument/2006/math" xmlns:v="urn:schemas-microsoft-com:vml" xmlns:wp14="http://schemas.microsoft.com/office/word/2010/wordprocessingDrawing" xmlns:wp="http://schemas.openxmlformats.org/drawingml/2006/wordprocessingDrawing" xmlns:w10="urn:schemas-microsoft-com:office:word" xmlns:w="http://schemas.openxmlformats.org/wordprocessingml/2006/main" xmlns:w14="http://schemas.microsoft.com/office/word/2010/wordml" xmlns:w15="http://schemas.microsoft.com/office/word/2012/wordml" xmlns:w16cex="http://schemas.microsoft.com/office/word/2018/wordml/cex" xmlns:w16cid="http://schemas.microsoft.com/office/word/2016/wordml/cid" xmlns:w16="http://schemas.microsoft.com/office/word/2018/wordml" xmlns:w16du="http://schemas.microsoft.com/office/word/2023/wordml/word16du" xmlns:w16sdtdh="http://schemas.microsoft.com/office/word/2020/wordml/sdtdatahash" xmlns:w16sdtfl="http://schemas.microsoft.com/office/word/2024/wordml/sdtformatlock" xmlns:w16se="http://schemas.microsoft.com/office/word/2015/wordml/symex" xmlns:wpg="http://schemas.microsoft.com/office/word/2010/wordprocessingGroup" xmlns:wpi="http://schemas.microsoft.com/office/word/2010/wordprocessingInk" xmlns:wne="http://schemas.microsoft.com/office/word/2006/wordml" xmlns:wps="http://schemas.microsoft.com/office/word/2010/wordprocessingShape" mc:Ignorable="w14 w15 w16se w16cid w16 w16cex w16sdtdh w16sdtfl w16du wp14">
   <w:footnote w:type="separator" w:id="-1">
     <w:p>
       <w:pPr>
@@ -4373,7 +4335,7 @@
 </file>
 
 <file path=word/header1.xml><?xml version="1.0" encoding="utf-8"?>
-<w:hdr xmlns:wpc="http://schemas.microsoft.com/office/word/2010/wordprocessingCanvas" xmlns:cx="http://schemas.microsoft.com/office/drawing/2014/chartex" xmlns:cx1="http://schemas.microsoft.com/office/drawing/2015/9/8/chartex" xmlns:cx2="http://schemas.microsoft.com/office/drawing/2015/10/21/chartex" xmlns:cx3="http://schemas.microsoft.com/office/drawing/2016/5/9/chartex" xmlns:cx4="http://schemas.microsoft.com/office/drawing/2016/5/10/chartex" xmlns:cx5="http://schemas.microsoft.com/office/drawing/2016/5/11/chartex" xmlns:cx6="http://schemas.microsoft.com/office/drawing/2016/5/12/chartex" xmlns:cx7="http://schemas.microsoft.com/office/drawing/2016/5/13/chartex" xmlns:cx8="http://schemas.microsoft.com/office/drawing/2016/5/14/chartex" xmlns:mc="http://schemas.openxmlformats.org/markup-compatibility/2006" xmlns:aink="http://schemas.microsoft.com/office/drawing/2016/ink" xmlns:am3d="http://schemas.microsoft.com/office/drawing/2017/model3d" xmlns:o="urn:schemas-microsoft-com:office:office" xmlns:oel="http://schemas.microsoft.com/office/2019/extlst" xmlns:r="http://schemas.openxmlformats.org/officeDocument/2006/relationships" xmlns:m="http://schemas.openxmlformats.org/officeDocument/2006/math" xmlns:v="urn:schemas-microsoft-com:vml" xmlns:wp14="http://schemas.microsoft.com/office/word/2010/wordprocessingDrawing" xmlns:wp="http://schemas.openxmlformats.org/drawingml/2006/wordprocessingDrawing" xmlns:w10="urn:schemas-microsoft-com:office:word" xmlns:w="http://schemas.openxmlformats.org/wordprocessingml/2006/main" xmlns:w14="http://schemas.microsoft.com/office/word/2010/wordml" xmlns:w15="http://schemas.microsoft.com/office/word/2012/wordml" xmlns:w16cex="http://schemas.microsoft.com/office/word/2018/wordml/cex" xmlns:w16cid="http://schemas.microsoft.com/office/word/2016/wordml/cid" xmlns:w16="http://schemas.microsoft.com/office/word/2018/wordml" xmlns:w16du="http://schemas.microsoft.com/office/word/2023/wordml/word16du" xmlns:w16sdtdh="http://schemas.microsoft.com/office/word/2020/wordml/sdtdatahash" xmlns:w16se="http://schemas.microsoft.com/office/word/2015/wordml/symex" xmlns:wpg="http://schemas.microsoft.com/office/word/2010/wordprocessingGroup" xmlns:wpi="http://schemas.microsoft.com/office/word/2010/wordprocessingInk" xmlns:wne="http://schemas.microsoft.com/office/word/2006/wordml" xmlns:wps="http://schemas.microsoft.com/office/word/2010/wordprocessingShape" mc:Ignorable="w14 w15 w16se w16cid w16 w16cex w16sdtdh w16du wp14">
+<w:hdr xmlns:wpc="http://schemas.microsoft.com/office/word/2010/wordprocessingCanvas" xmlns:cx="http://schemas.microsoft.com/office/drawing/2014/chartex" xmlns:cx1="http://schemas.microsoft.com/office/drawing/2015/9/8/chartex" xmlns:cx2="http://schemas.microsoft.com/office/drawing/2015/10/21/chartex" xmlns:cx3="http://schemas.microsoft.com/office/drawing/2016/5/9/chartex" xmlns:cx4="http://schemas.microsoft.com/office/drawing/2016/5/10/chartex" xmlns:cx5="http://schemas.microsoft.com/office/drawing/2016/5/11/chartex" xmlns:cx6="http://schemas.microsoft.com/office/drawing/2016/5/12/chartex" xmlns:cx7="http://schemas.microsoft.com/office/drawing/2016/5/13/chartex" xmlns:cx8="http://schemas.microsoft.com/office/drawing/2016/5/14/chartex" xmlns:mc="http://schemas.openxmlformats.org/markup-compatibility/2006" xmlns:aink="http://schemas.microsoft.com/office/drawing/2016/ink" xmlns:am3d="http://schemas.microsoft.com/office/drawing/2017/model3d" xmlns:o="urn:schemas-microsoft-com:office:office" xmlns:oel="http://schemas.microsoft.com/office/2019/extlst" xmlns:r="http://schemas.openxmlformats.org/officeDocument/2006/relationships" xmlns:m="http://schemas.openxmlformats.org/officeDocument/2006/math" xmlns:v="urn:schemas-microsoft-com:vml" xmlns:wp14="http://schemas.microsoft.com/office/word/2010/wordprocessingDrawing" xmlns:wp="http://schemas.openxmlformats.org/drawingml/2006/wordprocessingDrawing" xmlns:w10="urn:schemas-microsoft-com:office:word" xmlns:w="http://schemas.openxmlformats.org/wordprocessingml/2006/main" xmlns:w14="http://schemas.microsoft.com/office/word/2010/wordml" xmlns:w15="http://schemas.microsoft.com/office/word/2012/wordml" xmlns:w16cex="http://schemas.microsoft.com/office/word/2018/wordml/cex" xmlns:w16cid="http://schemas.microsoft.com/office/word/2016/wordml/cid" xmlns:w16="http://schemas.microsoft.com/office/word/2018/wordml" xmlns:w16du="http://schemas.microsoft.com/office/word/2023/wordml/word16du" xmlns:w16sdtdh="http://schemas.microsoft.com/office/word/2020/wordml/sdtdatahash" xmlns:w16sdtfl="http://schemas.microsoft.com/office/word/2024/wordml/sdtformatlock" xmlns:w16se="http://schemas.microsoft.com/office/word/2015/wordml/symex" xmlns:wpg="http://schemas.microsoft.com/office/word/2010/wordprocessingGroup" xmlns:wpi="http://schemas.microsoft.com/office/word/2010/wordprocessingInk" xmlns:wne="http://schemas.microsoft.com/office/word/2006/wordml" xmlns:wps="http://schemas.microsoft.com/office/word/2010/wordprocessingShape" mc:Ignorable="w14 w15 w16se w16cid w16 w16cex w16sdtdh w16sdtfl w16du wp14">
   <w:p>
     <w:pPr>
       <w:pStyle w:val="Header"/>
@@ -4383,7 +4345,7 @@
 </file>
 
 <file path=word/numbering.xml><?xml version="1.0" encoding="utf-8"?>
-<w:numbering xmlns:wpc="http://schemas.microsoft.com/office/word/2010/wordprocessingCanvas" xmlns:cx="http://schemas.microsoft.com/office/drawing/2014/chartex" xmlns:cx1="http://schemas.microsoft.com/office/drawing/2015/9/8/chartex" xmlns:cx2="http://schemas.microsoft.com/office/drawing/2015/10/21/chartex" xmlns:cx3="http://schemas.microsoft.com/office/drawing/2016/5/9/chartex" xmlns:cx4="http://schemas.microsoft.com/office/drawing/2016/5/10/chartex" xmlns:cx5="http://schemas.microsoft.com/office/drawing/2016/5/11/chartex" xmlns:cx6="http://schemas.microsoft.com/office/drawing/2016/5/12/chartex" xmlns:cx7="http://schemas.microsoft.com/office/drawing/2016/5/13/chartex" xmlns:cx8="http://schemas.microsoft.com/office/drawing/2016/5/14/chartex" xmlns:mc="http://schemas.openxmlformats.org/markup-compatibility/2006" xmlns:aink="http://schemas.microsoft.com/office/drawing/2016/ink" xmlns:am3d="http://schemas.microsoft.com/office/drawing/2017/model3d" xmlns:o="urn:schemas-microsoft-com:office:office" xmlns:oel="http://schemas.microsoft.com/office/2019/extlst" xmlns:r="http://schemas.openxmlformats.org/officeDocument/2006/relationships" xmlns:m="http://schemas.openxmlformats.org/officeDocument/2006/math" xmlns:v="urn:schemas-microsoft-com:vml" xmlns:wp14="http://schemas.microsoft.com/office/word/2010/wordprocessingDrawing" xmlns:wp="http://schemas.openxmlformats.org/drawingml/2006/wordprocessingDrawing" xmlns:w10="urn:schemas-microsoft-com:office:word" xmlns:w="http://schemas.openxmlformats.org/wordprocessingml/2006/main" xmlns:w14="http://schemas.microsoft.com/office/word/2010/wordml" xmlns:w15="http://schemas.microsoft.com/office/word/2012/wordml" xmlns:w16cex="http://schemas.microsoft.com/office/word/2018/wordml/cex" xmlns:w16cid="http://schemas.microsoft.com/office/word/2016/wordml/cid" xmlns:w16="http://schemas.microsoft.com/office/word/2018/wordml" xmlns:w16du="http://schemas.microsoft.com/office/word/2023/wordml/word16du" xmlns:w16sdtdh="http://schemas.microsoft.com/office/word/2020/wordml/sdtdatahash" xmlns:w16se="http://schemas.microsoft.com/office/word/2015/wordml/symex" xmlns:wpg="http://schemas.microsoft.com/office/word/2010/wordprocessingGroup" xmlns:wpi="http://schemas.microsoft.com/office/word/2010/wordprocessingInk" xmlns:wne="http://schemas.microsoft.com/office/word/2006/wordml" xmlns:wps="http://schemas.microsoft.com/office/word/2010/wordprocessingShape" mc:Ignorable="w14 w15 w16se w16cid w16 w16cex w16sdtdh w16du wp14">
+<w:numbering xmlns:wpc="http://schemas.microsoft.com/office/word/2010/wordprocessingCanvas" xmlns:cx="http://schemas.microsoft.com/office/drawing/2014/chartex" xmlns:cx1="http://schemas.microsoft.com/office/drawing/2015/9/8/chartex" xmlns:cx2="http://schemas.microsoft.com/office/drawing/2015/10/21/chartex" xmlns:cx3="http://schemas.microsoft.com/office/drawing/2016/5/9/chartex" xmlns:cx4="http://schemas.microsoft.com/office/drawing/2016/5/10/chartex" xmlns:cx5="http://schemas.microsoft.com/office/drawing/2016/5/11/chartex" xmlns:cx6="http://schemas.microsoft.com/office/drawing/2016/5/12/chartex" xmlns:cx7="http://schemas.microsoft.com/office/drawing/2016/5/13/chartex" xmlns:cx8="http://schemas.microsoft.com/office/drawing/2016/5/14/chartex" xmlns:mc="http://schemas.openxmlformats.org/markup-compatibility/2006" xmlns:aink="http://schemas.microsoft.com/office/drawing/2016/ink" xmlns:am3d="http://schemas.microsoft.com/office/drawing/2017/model3d" xmlns:o="urn:schemas-microsoft-com:office:office" xmlns:oel="http://schemas.microsoft.com/office/2019/extlst" xmlns:r="http://schemas.openxmlformats.org/officeDocument/2006/relationships" xmlns:m="http://schemas.openxmlformats.org/officeDocument/2006/math" xmlns:v="urn:schemas-microsoft-com:vml" xmlns:wp14="http://schemas.microsoft.com/office/word/2010/wordprocessingDrawing" xmlns:wp="http://schemas.openxmlformats.org/drawingml/2006/wordprocessingDrawing" xmlns:w10="urn:schemas-microsoft-com:office:word" xmlns:w="http://schemas.openxmlformats.org/wordprocessingml/2006/main" xmlns:w14="http://schemas.microsoft.com/office/word/2010/wordml" xmlns:w15="http://schemas.microsoft.com/office/word/2012/wordml" xmlns:w16cex="http://schemas.microsoft.com/office/word/2018/wordml/cex" xmlns:w16cid="http://schemas.microsoft.com/office/word/2016/wordml/cid" xmlns:w16="http://schemas.microsoft.com/office/word/2018/wordml" xmlns:w16du="http://schemas.microsoft.com/office/word/2023/wordml/word16du" xmlns:w16sdtdh="http://schemas.microsoft.com/office/word/2020/wordml/sdtdatahash" xmlns:w16sdtfl="http://schemas.microsoft.com/office/word/2024/wordml/sdtformatlock" xmlns:w16se="http://schemas.microsoft.com/office/word/2015/wordml/symex" xmlns:wpg="http://schemas.microsoft.com/office/word/2010/wordprocessingGroup" xmlns:wpi="http://schemas.microsoft.com/office/word/2010/wordprocessingInk" xmlns:wne="http://schemas.microsoft.com/office/word/2006/wordml" xmlns:wps="http://schemas.microsoft.com/office/word/2010/wordprocessingShape" mc:Ignorable="w14 w15 w16se w16cid w16 w16cex w16sdtdh w16sdtfl w16du wp14">
   <w:abstractNum w:abstractNumId="0" w15:restartNumberingAfterBreak="0">
     <w:nsid w:val="21A746F0"/>
     <w:multiLevelType w:val="hybridMultilevel"/>
@@ -5355,7 +5317,7 @@
 </file>
 
 <file path=word/styles.xml><?xml version="1.0" encoding="utf-8"?>
-<w:styles xmlns:mc="http://schemas.openxmlformats.org/markup-compatibility/2006" xmlns:r="http://schemas.openxmlformats.org/officeDocument/2006/relationships" xmlns:w="http://schemas.openxmlformats.org/wordprocessingml/2006/main" xmlns:w14="http://schemas.microsoft.com/office/word/2010/wordml" xmlns:w15="http://schemas.microsoft.com/office/word/2012/wordml" xmlns:w16cex="http://schemas.microsoft.com/office/word/2018/wordml/cex" xmlns:w16cid="http://schemas.microsoft.com/office/word/2016/wordml/cid" xmlns:w16="http://schemas.microsoft.com/office/word/2018/wordml" xmlns:w16du="http://schemas.microsoft.com/office/word/2023/wordml/word16du" xmlns:w16sdtdh="http://schemas.microsoft.com/office/word/2020/wordml/sdtdatahash" xmlns:w16se="http://schemas.microsoft.com/office/word/2015/wordml/symex" mc:Ignorable="w14 w15 w16se w16cid w16 w16cex w16sdtdh w16du">
+<w:styles xmlns:mc="http://schemas.openxmlformats.org/markup-compatibility/2006" xmlns:r="http://schemas.openxmlformats.org/officeDocument/2006/relationships" xmlns:w="http://schemas.openxmlformats.org/wordprocessingml/2006/main" xmlns:w14="http://schemas.microsoft.com/office/word/2010/wordml" xmlns:w15="http://schemas.microsoft.com/office/word/2012/wordml" xmlns:w16cex="http://schemas.microsoft.com/office/word/2018/wordml/cex" xmlns:w16cid="http://schemas.microsoft.com/office/word/2016/wordml/cid" xmlns:w16="http://schemas.microsoft.com/office/word/2018/wordml" xmlns:w16du="http://schemas.microsoft.com/office/word/2023/wordml/word16du" xmlns:w16sdtdh="http://schemas.microsoft.com/office/word/2020/wordml/sdtdatahash" xmlns:w16sdtfl="http://schemas.microsoft.com/office/word/2024/wordml/sdtformatlock" xmlns:w16se="http://schemas.microsoft.com/office/word/2015/wordml/symex" mc:Ignorable="w14 w15 w16se w16cid w16 w16cex w16sdtdh w16sdtfl w16du">
   <w:docDefaults>
     <w:rPrDefault>
       <w:rPr>
@@ -5850,6 +5812,7 @@
   <w:style w:type="character" w:default="1" w:styleId="DefaultParagraphFont">
     <w:name w:val="Default Paragraph Font"/>
     <w:uiPriority w:val="1"/>
+    <w:semiHidden/>
     <w:unhideWhenUsed/>
   </w:style>
   <w:style w:type="table" w:default="1" w:styleId="TableNormal">

</xml_diff>